<commit_message>
Deploying to gh-pages from @ Morrison-Lab/mds@f9d86819906781a727b019bded2af124b9b9c0c4 🚀
</commit_message>
<xml_diff>
--- a/algebra-basics.docx
+++ b/algebra-basics.docx
@@ -15,7 +15,7 @@
         <w:pStyle w:val="Date"/>
       </w:pPr>
       <w:r>
-        <w:t xml:space="preserve">Last modified: 2026-10-13 16:58:37 (PDT)</w:t>
+        <w:t xml:space="preserve">Last modified: 2026-10-13 17:46:07 (PDT)</w:t>
       </w:r>
     </w:p>
     <w:bookmarkStart w:id="18" w:name="equalities"/>
@@ -1969,7 +1969,7 @@
     </w:p>
     <w:bookmarkEnd w:id="24"/>
     <w:bookmarkEnd w:id="25"/>
-    <w:bookmarkStart w:id="36" w:name="sec-powers-roots-abs"/>
+    <w:bookmarkStart w:id="39" w:name="sec-powers-roots-abs"/>
     <w:p>
       <w:pPr>
         <w:pStyle w:val="Heading2"/>
@@ -1978,7 +1978,7 @@
         <w:t xml:space="preserve">3 Powers, square roots, and absolute values</w:t>
       </w:r>
     </w:p>
-    <w:bookmarkStart w:id="29" w:name="def-power"/>
+    <w:bookmarkStart w:id="27" w:name="def-power"/>
     <w:p>
       <w:pPr>
         <w:pStyle w:val="FirstParagraph"/>
@@ -2355,240 +2355,9 @@
       <w:r>
         <w:t xml:space="preserve">.</w:t>
       </w:r>
-      <w:r>
-        <w:t xml:space="preserve"> </w:t>
-      </w:r>
-      <w:r>
-        <w:t xml:space="preserve">For the exponent</w:t>
-      </w:r>
-      <w:r>
-        <w:t xml:space="preserve"> </w:t>
-      </w:r>
-      <m:oMath>
-        <m:r>
-          <m:t>0</m:t>
-        </m:r>
-      </m:oMath>
-      <w:r>
-        <w:t xml:space="preserve"> </w:t>
-      </w:r>
-      <w:r>
-        <w:t xml:space="preserve">and negative</w:t>
-      </w:r>
-      <w:r>
-        <w:t xml:space="preserve"> </w:t>
-      </w:r>
-      <w:hyperlink r:id="rId27">
-        <w:r>
-          <w:rPr>
-            <w:rStyle w:val="Hyperlink"/>
-          </w:rPr>
-          <w:t xml:space="preserve">integer</w:t>
-        </w:r>
-      </w:hyperlink>
-      <w:r>
-        <w:t xml:space="preserve"> </w:t>
-      </w:r>
-      <w:r>
-        <w:t xml:space="preserve">exponents:</w:t>
-      </w:r>
     </w:p>
-    <w:p>
-      <w:pPr>
-        <w:pStyle w:val="Compact"/>
-        <w:numPr>
-          <w:ilvl w:val="0"/>
-          <w:numId w:val="1005"/>
-        </w:numPr>
-      </w:pPr>
-      <m:oMath>
-        <m:sSup>
-          <m:e>
-            <m:r>
-              <m:t>a</m:t>
-            </m:r>
-          </m:e>
-          <m:sup>
-            <m:r>
-              <m:t>0</m:t>
-            </m:r>
-          </m:sup>
-        </m:sSup>
-        <m:limUpp>
-          <m:e>
-            <m:r>
-              <m:rPr>
-                <m:sty m:val="p"/>
-              </m:rPr>
-              <m:t>=</m:t>
-            </m:r>
-          </m:e>
-          <m:lim>
-            <m:r>
-              <m:rPr>
-                <m:nor/>
-                <m:sty m:val="p"/>
-              </m:rPr>
-              <m:t>def</m:t>
-            </m:r>
-          </m:lim>
-        </m:limUpp>
-        <m:r>
-          <m:t>1</m:t>
-        </m:r>
-      </m:oMath>
-      <w:r>
-        <w:t xml:space="preserve">, including</w:t>
-      </w:r>
-      <w:r>
-        <w:t xml:space="preserve"> </w:t>
-      </w:r>
-      <m:oMath>
-        <m:sSup>
-          <m:e>
-            <m:r>
-              <m:t>0</m:t>
-            </m:r>
-          </m:e>
-          <m:sup>
-            <m:r>
-              <m:t>0</m:t>
-            </m:r>
-          </m:sup>
-        </m:sSup>
-        <m:r>
-          <m:rPr>
-            <m:sty m:val="p"/>
-          </m:rPr>
-          <m:t>=</m:t>
-        </m:r>
-        <m:r>
-          <m:t>1</m:t>
-        </m:r>
-      </m:oMath>
-      <w:r>
-        <w:t xml:space="preserve"> </w:t>
-      </w:r>
-      <w:r>
-        <w:t xml:space="preserve">by convention;</w:t>
-      </w:r>
-    </w:p>
-    <w:p>
-      <w:pPr>
-        <w:pStyle w:val="Compact"/>
-        <w:numPr>
-          <w:ilvl w:val="0"/>
-          <w:numId w:val="1005"/>
-        </w:numPr>
-      </w:pPr>
-      <m:oMath>
-        <m:sSup>
-          <m:e>
-            <m:r>
-              <m:t>a</m:t>
-            </m:r>
-          </m:e>
-          <m:sup>
-            <m:r>
-              <m:rPr>
-                <m:sty m:val="p"/>
-              </m:rPr>
-              <m:t>−</m:t>
-            </m:r>
-            <m:r>
-              <m:t>n</m:t>
-            </m:r>
-          </m:sup>
-        </m:sSup>
-        <m:limUpp>
-          <m:e>
-            <m:r>
-              <m:rPr>
-                <m:sty m:val="p"/>
-              </m:rPr>
-              <m:t>=</m:t>
-            </m:r>
-          </m:e>
-          <m:lim>
-            <m:r>
-              <m:rPr>
-                <m:nor/>
-                <m:sty m:val="p"/>
-              </m:rPr>
-              <m:t>def</m:t>
-            </m:r>
-          </m:lim>
-        </m:limUpp>
-        <m:f>
-          <m:fPr>
-            <m:type m:val="bar"/>
-          </m:fPr>
-          <m:num>
-            <m:r>
-              <m:t>1</m:t>
-            </m:r>
-          </m:num>
-          <m:den>
-            <m:sSup>
-              <m:e>
-                <m:r>
-                  <m:t>a</m:t>
-                </m:r>
-              </m:e>
-              <m:sup>
-                <m:r>
-                  <m:t>n</m:t>
-                </m:r>
-              </m:sup>
-            </m:sSup>
-          </m:den>
-        </m:f>
-      </m:oMath>
-      <w:r>
-        <w:t xml:space="preserve">, when</w:t>
-      </w:r>
-      <w:r>
-        <w:t xml:space="preserve"> </w:t>
-      </w:r>
-      <m:oMath>
-        <m:r>
-          <m:t>a</m:t>
-        </m:r>
-        <m:r>
-          <m:rPr>
-            <m:sty m:val="p"/>
-          </m:rPr>
-          <m:t>≠</m:t>
-        </m:r>
-        <m:r>
-          <m:t>0</m:t>
-        </m:r>
-      </m:oMath>
-      <w:r>
-        <w:t xml:space="preserve">.</w:t>
-      </w:r>
-    </w:p>
-    <w:p>
-      <w:pPr>
-        <w:pStyle w:val="FirstParagraph"/>
-      </w:pPr>
-      <w:hyperlink r:id="rId28">
-        <w:r>
-          <w:rPr>
-            <w:rStyle w:val="Hyperlink"/>
-          </w:rPr>
-          <w:t xml:space="preserve">Definition 13 in Polynomials, Exponentials and Logarithms</w:t>
-        </w:r>
-      </w:hyperlink>
-      <w:r>
-        <w:t xml:space="preserve"> </w:t>
-      </w:r>
-      <w:r>
-        <w:t xml:space="preserve">extends powers to real exponents when the base is positive.</w:t>
-      </w:r>
-    </w:p>
-    <w:bookmarkEnd w:id="29"/>
-    <w:bookmarkStart w:id="30" w:name="exm-power"/>
+    <w:bookmarkEnd w:id="27"/>
+    <w:bookmarkStart w:id="28" w:name="exm-power"/>
     <w:p>
       <w:pPr>
         <w:pStyle w:val="BodyText"/>
@@ -2980,7 +2749,7 @@
       <w:pPr>
         <w:numPr>
           <w:ilvl w:val="0"/>
-          <w:numId w:val="1006"/>
+          <w:numId w:val="1005"/>
         </w:numPr>
       </w:pPr>
       <m:oMath>
@@ -3109,8 +2878,8 @@
         </m:oMath>
       </m:oMathPara>
     </w:p>
-    <w:bookmarkEnd w:id="30"/>
-    <w:bookmarkStart w:id="31" w:name="def-square-root"/>
+    <w:bookmarkEnd w:id="28"/>
+    <w:bookmarkStart w:id="30" w:name="def-power-integer"/>
     <w:p>
       <w:pPr>
         <w:pStyle w:val="FirstParagraph"/>
@@ -3120,7 +2889,264 @@
           <w:b/>
           <w:bCs/>
         </w:rPr>
-        <w:t xml:space="preserve">Definition 5 (Square root)</w:t>
+        <w:t xml:space="preserve">Definition 5 (Powers with exponent zero or a negative integer)</w:t>
+      </w:r>
+      <w:r>
+        <w:t xml:space="preserve"> </w:t>
+      </w:r>
+      <w:r>
+        <w:t xml:space="preserve">For the exponent</w:t>
+      </w:r>
+      <w:r>
+        <w:t xml:space="preserve"> </w:t>
+      </w:r>
+      <m:oMath>
+        <m:r>
+          <m:t>0</m:t>
+        </m:r>
+      </m:oMath>
+      <w:r>
+        <w:t xml:space="preserve"> </w:t>
+      </w:r>
+      <w:r>
+        <w:t xml:space="preserve">and negative</w:t>
+      </w:r>
+      <w:r>
+        <w:t xml:space="preserve"> </w:t>
+      </w:r>
+      <w:hyperlink r:id="rId29">
+        <w:r>
+          <w:rPr>
+            <w:rStyle w:val="Hyperlink"/>
+          </w:rPr>
+          <w:t xml:space="preserve">integer</w:t>
+        </w:r>
+      </w:hyperlink>
+      <w:r>
+        <w:t xml:space="preserve"> </w:t>
+      </w:r>
+      <w:r>
+        <w:t xml:space="preserve">exponents:</w:t>
+      </w:r>
+    </w:p>
+    <w:p>
+      <w:pPr>
+        <w:pStyle w:val="Compact"/>
+        <w:numPr>
+          <w:ilvl w:val="0"/>
+          <w:numId w:val="1006"/>
+        </w:numPr>
+      </w:pPr>
+      <m:oMath>
+        <m:sSup>
+          <m:e>
+            <m:r>
+              <m:t>a</m:t>
+            </m:r>
+          </m:e>
+          <m:sup>
+            <m:r>
+              <m:t>0</m:t>
+            </m:r>
+          </m:sup>
+        </m:sSup>
+        <m:limUpp>
+          <m:e>
+            <m:r>
+              <m:rPr>
+                <m:sty m:val="p"/>
+              </m:rPr>
+              <m:t>=</m:t>
+            </m:r>
+          </m:e>
+          <m:lim>
+            <m:r>
+              <m:rPr>
+                <m:nor/>
+                <m:sty m:val="p"/>
+              </m:rPr>
+              <m:t>def</m:t>
+            </m:r>
+          </m:lim>
+        </m:limUpp>
+        <m:r>
+          <m:t>1</m:t>
+        </m:r>
+      </m:oMath>
+      <w:r>
+        <w:t xml:space="preserve">, including</w:t>
+      </w:r>
+      <w:r>
+        <w:t xml:space="preserve"> </w:t>
+      </w:r>
+      <m:oMath>
+        <m:sSup>
+          <m:e>
+            <m:r>
+              <m:t>0</m:t>
+            </m:r>
+          </m:e>
+          <m:sup>
+            <m:r>
+              <m:t>0</m:t>
+            </m:r>
+          </m:sup>
+        </m:sSup>
+        <m:r>
+          <m:rPr>
+            <m:sty m:val="p"/>
+          </m:rPr>
+          <m:t>=</m:t>
+        </m:r>
+        <m:r>
+          <m:t>1</m:t>
+        </m:r>
+      </m:oMath>
+      <w:r>
+        <w:t xml:space="preserve"> </w:t>
+      </w:r>
+      <w:r>
+        <w:t xml:space="preserve">by convention;</w:t>
+      </w:r>
+    </w:p>
+    <w:p>
+      <w:pPr>
+        <w:pStyle w:val="Compact"/>
+        <w:numPr>
+          <w:ilvl w:val="0"/>
+          <w:numId w:val="1006"/>
+        </w:numPr>
+      </w:pPr>
+      <m:oMath>
+        <m:sSup>
+          <m:e>
+            <m:r>
+              <m:t>a</m:t>
+            </m:r>
+          </m:e>
+          <m:sup>
+            <m:r>
+              <m:rPr>
+                <m:sty m:val="p"/>
+              </m:rPr>
+              <m:t>−</m:t>
+            </m:r>
+            <m:r>
+              <m:t>n</m:t>
+            </m:r>
+          </m:sup>
+        </m:sSup>
+        <m:limUpp>
+          <m:e>
+            <m:r>
+              <m:rPr>
+                <m:sty m:val="p"/>
+              </m:rPr>
+              <m:t>=</m:t>
+            </m:r>
+          </m:e>
+          <m:lim>
+            <m:r>
+              <m:rPr>
+                <m:nor/>
+                <m:sty m:val="p"/>
+              </m:rPr>
+              <m:t>def</m:t>
+            </m:r>
+          </m:lim>
+        </m:limUpp>
+        <m:f>
+          <m:fPr>
+            <m:type m:val="bar"/>
+          </m:fPr>
+          <m:num>
+            <m:r>
+              <m:t>1</m:t>
+            </m:r>
+          </m:num>
+          <m:den>
+            <m:sSup>
+              <m:e>
+                <m:r>
+                  <m:t>a</m:t>
+                </m:r>
+              </m:e>
+              <m:sup>
+                <m:r>
+                  <m:t>n</m:t>
+                </m:r>
+              </m:sup>
+            </m:sSup>
+          </m:den>
+        </m:f>
+      </m:oMath>
+      <w:r>
+        <w:t xml:space="preserve">, when</w:t>
+      </w:r>
+      <w:r>
+        <w:t xml:space="preserve"> </w:t>
+      </w:r>
+      <m:oMath>
+        <m:r>
+          <m:t>a</m:t>
+        </m:r>
+        <m:r>
+          <m:rPr>
+            <m:sty m:val="p"/>
+          </m:rPr>
+          <m:t>≠</m:t>
+        </m:r>
+        <m:r>
+          <m:t>0</m:t>
+        </m:r>
+      </m:oMath>
+      <w:r>
+        <w:t xml:space="preserve">.</w:t>
+      </w:r>
+    </w:p>
+    <w:bookmarkEnd w:id="30"/>
+    <w:bookmarkStart w:id="32" w:name="rem-power-real-exponents"/>
+    <w:p>
+      <w:pPr>
+        <w:pStyle w:val="FirstParagraph"/>
+      </w:pPr>
+      <w:r>
+        <w:rPr>
+          <w:i/>
+          <w:iCs/>
+        </w:rPr>
+        <w:t xml:space="preserve">Remark 1</w:t>
+      </w:r>
+      <w:r>
+        <w:t xml:space="preserve"> (Powers with real exponents). </w:t>
+      </w:r>
+      <w:hyperlink r:id="rId31">
+        <w:r>
+          <w:rPr>
+            <w:rStyle w:val="Hyperlink"/>
+          </w:rPr>
+          <w:t xml:space="preserve">Definition 14 in Polynomials, Exponentials and Logarithms</w:t>
+        </w:r>
+      </w:hyperlink>
+      <w:r>
+        <w:t xml:space="preserve"> </w:t>
+      </w:r>
+      <w:r>
+        <w:t xml:space="preserve">extends powers to real exponents when the base is positive.</w:t>
+      </w:r>
+    </w:p>
+    <w:bookmarkEnd w:id="32"/>
+    <w:bookmarkStart w:id="33" w:name="def-square-root"/>
+    <w:p>
+      <w:pPr>
+        <w:pStyle w:val="BodyText"/>
+      </w:pPr>
+      <w:r>
+        <w:rPr>
+          <w:b/>
+          <w:bCs/>
+        </w:rPr>
+        <w:t xml:space="preserve">Definition 6 (Square root)</w:t>
       </w:r>
       <w:r>
         <w:t xml:space="preserve"> </w:t>
@@ -3229,8 +3255,8 @@
         <w:t xml:space="preserve">.</w:t>
       </w:r>
     </w:p>
-    <w:bookmarkEnd w:id="31"/>
-    <w:bookmarkStart w:id="33" w:name="exm-square-root"/>
+    <w:bookmarkEnd w:id="33"/>
+    <w:bookmarkStart w:id="35" w:name="exm-square-root"/>
     <w:p>
       <w:pPr>
         <w:pStyle w:val="BodyText"/>
@@ -3534,7 +3560,7 @@
       <w:r>
         <w:t xml:space="preserve"> </w:t>
       </w:r>
-      <w:hyperlink r:id="rId32">
+      <w:hyperlink r:id="rId34">
         <w:r>
           <w:rPr>
             <w:rStyle w:val="Hyperlink"/>
@@ -3546,8 +3572,8 @@
         <w:t xml:space="preserve">).</w:t>
       </w:r>
     </w:p>
-    <w:bookmarkEnd w:id="33"/>
-    <w:bookmarkStart w:id="34" w:name="def-absolute-value"/>
+    <w:bookmarkEnd w:id="35"/>
+    <w:bookmarkStart w:id="36" w:name="def-absolute-value"/>
     <w:p>
       <w:pPr>
         <w:pStyle w:val="FirstParagraph"/>
@@ -3557,7 +3583,7 @@
           <w:b/>
           <w:bCs/>
         </w:rPr>
-        <w:t xml:space="preserve">Definition 6 (Absolute value of a real number)</w:t>
+        <w:t xml:space="preserve">Definition 7 (Absolute value of a real number)</w:t>
       </w:r>
       <w:r>
         <w:t xml:space="preserve"> </w:t>
@@ -3736,111 +3762,11 @@
         </m:oMath>
       </m:oMathPara>
     </w:p>
+    <w:bookmarkEnd w:id="36"/>
+    <w:bookmarkStart w:id="37" w:name="exm-absolute-value"/>
     <w:p>
       <w:pPr>
         <w:pStyle w:val="FirstParagraph"/>
-      </w:pPr>
-      <w:r>
-        <w:t xml:space="preserve">For real numbers</w:t>
-      </w:r>
-      <w:r>
-        <w:t xml:space="preserve"> </w:t>
-      </w:r>
-      <m:oMath>
-        <m:r>
-          <m:t>a</m:t>
-        </m:r>
-      </m:oMath>
-      <w:r>
-        <w:t xml:space="preserve"> </w:t>
-      </w:r>
-      <w:r>
-        <w:t xml:space="preserve">and</w:t>
-      </w:r>
-      <w:r>
-        <w:t xml:space="preserve"> </w:t>
-      </w:r>
-      <m:oMath>
-        <m:r>
-          <m:t>b</m:t>
-        </m:r>
-      </m:oMath>
-      <w:r>
-        <w:t xml:space="preserve">,</w:t>
-      </w:r>
-      <w:r>
-        <w:t xml:space="preserve"> </w:t>
-      </w:r>
-      <m:oMath>
-        <m:r>
-          <m:t>​</m:t>
-        </m:r>
-        <m:d>
-          <m:dPr>
-            <m:begChr m:val="|"/>
-            <m:sepChr m:val=""/>
-            <m:endChr m:val="|"/>
-            <m:grow/>
-          </m:dPr>
-          <m:e>
-            <m:r>
-              <m:t>a</m:t>
-            </m:r>
-            <m:r>
-              <m:rPr>
-                <m:sty m:val="p"/>
-              </m:rPr>
-              <m:t>−</m:t>
-            </m:r>
-            <m:r>
-              <m:t>b</m:t>
-            </m:r>
-          </m:e>
-        </m:d>
-        <m:r>
-          <m:t>​</m:t>
-        </m:r>
-      </m:oMath>
-      <w:r>
-        <w:t xml:space="preserve"> </w:t>
-      </w:r>
-      <w:r>
-        <w:t xml:space="preserve">is the distance between</w:t>
-      </w:r>
-      <w:r>
-        <w:t xml:space="preserve"> </w:t>
-      </w:r>
-      <m:oMath>
-        <m:r>
-          <m:t>a</m:t>
-        </m:r>
-      </m:oMath>
-      <w:r>
-        <w:t xml:space="preserve"> </w:t>
-      </w:r>
-      <w:r>
-        <w:t xml:space="preserve">and</w:t>
-      </w:r>
-      <w:r>
-        <w:t xml:space="preserve"> </w:t>
-      </w:r>
-      <m:oMath>
-        <m:r>
-          <m:t>b</m:t>
-        </m:r>
-      </m:oMath>
-      <w:r>
-        <w:t xml:space="preserve"> </w:t>
-      </w:r>
-      <w:r>
-        <w:t xml:space="preserve">on the number line.</w:t>
-      </w:r>
-    </w:p>
-    <w:bookmarkEnd w:id="34"/>
-    <w:bookmarkStart w:id="35" w:name="exm-absolute-value"/>
-    <w:p>
-      <w:pPr>
-        <w:pStyle w:val="BodyText"/>
       </w:pPr>
       <w:r>
         <w:rPr>
@@ -4304,7 +4230,7 @@
           <w:rPr>
             <w:rStyle w:val="Hyperlink"/>
           </w:rPr>
-          <w:t xml:space="preserve">Definition 5</w:t>
+          <w:t xml:space="preserve">Definition 6</w:t>
         </w:r>
       </w:hyperlink>
       <w:r>
@@ -4438,9 +4364,121 @@
         <w:t xml:space="preserve">.</w:t>
       </w:r>
     </w:p>
-    <w:bookmarkEnd w:id="35"/>
-    <w:bookmarkEnd w:id="36"/>
-    <w:bookmarkStart w:id="51" w:name="sec-min-max"/>
+    <w:bookmarkEnd w:id="37"/>
+    <w:bookmarkStart w:id="38" w:name="rem-absolute-value-distance"/>
+    <w:p>
+      <w:pPr>
+        <w:pStyle w:val="FirstParagraph"/>
+      </w:pPr>
+      <w:r>
+        <w:rPr>
+          <w:i/>
+          <w:iCs/>
+        </w:rPr>
+        <w:t xml:space="preserve">Remark 2</w:t>
+      </w:r>
+      <w:r>
+        <w:t xml:space="preserve"> (Absolute value as distance). </w:t>
+      </w:r>
+      <w:r>
+        <w:t xml:space="preserve">For real numbers</w:t>
+      </w:r>
+      <w:r>
+        <w:t xml:space="preserve"> </w:t>
+      </w:r>
+      <m:oMath>
+        <m:r>
+          <m:t>a</m:t>
+        </m:r>
+      </m:oMath>
+      <w:r>
+        <w:t xml:space="preserve"> </w:t>
+      </w:r>
+      <w:r>
+        <w:t xml:space="preserve">and</w:t>
+      </w:r>
+      <w:r>
+        <w:t xml:space="preserve"> </w:t>
+      </w:r>
+      <m:oMath>
+        <m:r>
+          <m:t>b</m:t>
+        </m:r>
+      </m:oMath>
+      <w:r>
+        <w:t xml:space="preserve">,</w:t>
+      </w:r>
+      <w:r>
+        <w:t xml:space="preserve"> </w:t>
+      </w:r>
+      <m:oMath>
+        <m:r>
+          <m:t>​</m:t>
+        </m:r>
+        <m:d>
+          <m:dPr>
+            <m:begChr m:val="|"/>
+            <m:sepChr m:val=""/>
+            <m:endChr m:val="|"/>
+            <m:grow/>
+          </m:dPr>
+          <m:e>
+            <m:r>
+              <m:t>a</m:t>
+            </m:r>
+            <m:r>
+              <m:rPr>
+                <m:sty m:val="p"/>
+              </m:rPr>
+              <m:t>−</m:t>
+            </m:r>
+            <m:r>
+              <m:t>b</m:t>
+            </m:r>
+          </m:e>
+        </m:d>
+        <m:r>
+          <m:t>​</m:t>
+        </m:r>
+      </m:oMath>
+      <w:r>
+        <w:t xml:space="preserve"> </w:t>
+      </w:r>
+      <w:r>
+        <w:t xml:space="preserve">is the distance between</w:t>
+      </w:r>
+      <w:r>
+        <w:t xml:space="preserve"> </w:t>
+      </w:r>
+      <m:oMath>
+        <m:r>
+          <m:t>a</m:t>
+        </m:r>
+      </m:oMath>
+      <w:r>
+        <w:t xml:space="preserve"> </w:t>
+      </w:r>
+      <w:r>
+        <w:t xml:space="preserve">and</w:t>
+      </w:r>
+      <w:r>
+        <w:t xml:space="preserve"> </w:t>
+      </w:r>
+      <m:oMath>
+        <m:r>
+          <m:t>b</m:t>
+        </m:r>
+      </m:oMath>
+      <w:r>
+        <w:t xml:space="preserve"> </w:t>
+      </w:r>
+      <w:r>
+        <w:t xml:space="preserve">on the number line.</w:t>
+      </w:r>
+    </w:p>
+    <w:bookmarkEnd w:id="38"/>
+    <w:bookmarkEnd w:id="39"/>
+    <w:bookmarkStart w:id="54" w:name="sec-min-max"/>
     <w:p>
       <w:pPr>
         <w:pStyle w:val="Heading2"/>
@@ -4449,7 +4487,7 @@
         <w:t xml:space="preserve">4 Minimum, maximum, argmin and argmax</w:t>
       </w:r>
     </w:p>
-    <w:bookmarkStart w:id="37" w:name="exr-min-and-argmin"/>
+    <w:bookmarkStart w:id="40" w:name="exr-min-and-argmin"/>
     <w:p>
       <w:pPr>
         <w:pStyle w:val="FirstParagraph"/>
@@ -4813,8 +4851,8 @@
         <w:t xml:space="preserve">does it take that value?</w:t>
       </w:r>
     </w:p>
-    <w:bookmarkEnd w:id="37"/>
-    <w:bookmarkStart w:id="38" w:name="sol-min-and-argmin"/>
+    <w:bookmarkEnd w:id="40"/>
+    <w:bookmarkStart w:id="41" w:name="sol-min-and-argmin"/>
     <w:p>
       <w:pPr>
         <w:pStyle w:val="FirstParagraph"/>
@@ -5542,8 +5580,8 @@
         <w:t xml:space="preserve">not a single number.</w:t>
       </w:r>
     </w:p>
-    <w:bookmarkEnd w:id="38"/>
-    <w:bookmarkStart w:id="39" w:name="def-minimum"/>
+    <w:bookmarkEnd w:id="41"/>
+    <w:bookmarkStart w:id="42" w:name="def-minimum"/>
     <w:p>
       <w:pPr>
         <w:pStyle w:val="FirstParagraph"/>
@@ -5553,7 +5591,7 @@
           <w:b/>
           <w:bCs/>
         </w:rPr>
-        <w:t xml:space="preserve">Definition 7 (Minimum)</w:t>
+        <w:t xml:space="preserve">Definition 8 (Minimum)</w:t>
       </w:r>
       <w:r>
         <w:t xml:space="preserve"> </w:t>
@@ -5728,8 +5766,8 @@
         <w:t xml:space="preserve">.</w:t>
       </w:r>
     </w:p>
-    <w:bookmarkEnd w:id="39"/>
-    <w:bookmarkStart w:id="41" w:name="rem-minimum-may-not-exist"/>
+    <w:bookmarkEnd w:id="42"/>
+    <w:bookmarkStart w:id="44" w:name="rem-minimum-may-not-exist"/>
     <w:p>
       <w:pPr>
         <w:pStyle w:val="BodyText"/>
@@ -5739,7 +5777,7 @@
           <w:i/>
           <w:iCs/>
         </w:rPr>
-        <w:t xml:space="preserve">Remark 1</w:t>
+        <w:t xml:space="preserve">Remark 3</w:t>
       </w:r>
       <w:r>
         <w:t xml:space="preserve"> (Not every set has a minimum). </w:t>
@@ -5815,7 +5853,7 @@
       <w:r>
         <w:t xml:space="preserve"> </w:t>
       </w:r>
-      <w:hyperlink r:id="rId40">
+      <w:hyperlink r:id="rId43">
         <w:r>
           <w:rPr>
             <w:rStyle w:val="Hyperlink"/>
@@ -5951,8 +5989,8 @@
         <w:t xml:space="preserve">, also in it.</w:t>
       </w:r>
     </w:p>
-    <w:bookmarkEnd w:id="41"/>
-    <w:bookmarkStart w:id="42" w:name="def-maximum"/>
+    <w:bookmarkEnd w:id="44"/>
+    <w:bookmarkStart w:id="45" w:name="def-maximum"/>
     <w:p>
       <w:pPr>
         <w:pStyle w:val="BodyText"/>
@@ -5962,7 +6000,7 @@
           <w:b/>
           <w:bCs/>
         </w:rPr>
-        <w:t xml:space="preserve">Definition 8 (Maximum)</w:t>
+        <w:t xml:space="preserve">Definition 9 (Maximum)</w:t>
       </w:r>
       <w:r>
         <w:t xml:space="preserve"> </w:t>
@@ -6137,8 +6175,8 @@
         <w:t xml:space="preserve">.</w:t>
       </w:r>
     </w:p>
-    <w:bookmarkEnd w:id="42"/>
-    <w:bookmarkStart w:id="43" w:name="exm-maximum"/>
+    <w:bookmarkEnd w:id="45"/>
+    <w:bookmarkStart w:id="46" w:name="exm-maximum"/>
     <w:p>
       <w:pPr>
         <w:pStyle w:val="BodyText"/>
@@ -6592,8 +6630,8 @@
         <w:t xml:space="preserve">is at least as large as every element.</w:t>
       </w:r>
     </w:p>
-    <w:bookmarkEnd w:id="43"/>
-    <w:bookmarkStart w:id="45" w:name="def-argmin"/>
+    <w:bookmarkEnd w:id="46"/>
+    <w:bookmarkStart w:id="48" w:name="def-argmin"/>
     <w:p>
       <w:pPr>
         <w:pStyle w:val="FirstParagraph"/>
@@ -6603,7 +6641,7 @@
           <w:b/>
           <w:bCs/>
         </w:rPr>
-        <w:t xml:space="preserve">Definition 9 (Argmin)</w:t>
+        <w:t xml:space="preserve">Definition 10 (Argmin)</w:t>
       </w:r>
       <w:r>
         <w:t xml:space="preserve"> </w:t>
@@ -6650,7 +6688,7 @@
       <w:r>
         <w:t xml:space="preserve"> </w:t>
       </w:r>
-      <w:hyperlink r:id="rId44">
+      <w:hyperlink r:id="rId47">
         <w:r>
           <w:rPr>
             <w:rStyle w:val="Hyperlink"/>
@@ -7012,8 +7050,8 @@
         <w:t xml:space="preserve">.</w:t>
       </w:r>
     </w:p>
-    <w:bookmarkEnd w:id="45"/>
-    <w:bookmarkStart w:id="47" w:name="rem-argmin-vs-minimum"/>
+    <w:bookmarkEnd w:id="48"/>
+    <w:bookmarkStart w:id="50" w:name="rem-argmin-vs-minimum"/>
     <w:p>
       <w:pPr>
         <w:pStyle w:val="BodyText"/>
@@ -7023,7 +7061,7 @@
           <w:i/>
           <w:iCs/>
         </w:rPr>
-        <w:t xml:space="preserve">Remark 2</w:t>
+        <w:t xml:space="preserve">Remark 4</w:t>
       </w:r>
       <w:r>
         <w:t xml:space="preserve"> (Smallest value versus where it occurs). </w:t>
@@ -7074,7 +7112,7 @@
           <w:rPr>
             <w:rStyle w:val="Hyperlink"/>
           </w:rPr>
-          <w:t xml:space="preserve">Definition 7</w:t>
+          <w:t xml:space="preserve">Definition 8</w:t>
         </w:r>
       </w:hyperlink>
       <w:r>
@@ -7089,7 +7127,7 @@
       <w:r>
         <w:t xml:space="preserve"> </w:t>
       </w:r>
-      <w:hyperlink r:id="rId46">
+      <w:hyperlink r:id="rId49">
         <w:r>
           <w:rPr>
             <w:rStyle w:val="Hyperlink"/>
@@ -7541,8 +7579,8 @@
         <w:t xml:space="preserve">.</w:t>
       </w:r>
     </w:p>
-    <w:bookmarkEnd w:id="47"/>
-    <w:bookmarkStart w:id="48" w:name="def-argmax"/>
+    <w:bookmarkEnd w:id="50"/>
+    <w:bookmarkStart w:id="51" w:name="def-argmax"/>
     <w:p>
       <w:pPr>
         <w:pStyle w:val="BodyText"/>
@@ -7552,7 +7590,7 @@
           <w:b/>
           <w:bCs/>
         </w:rPr>
-        <w:t xml:space="preserve">Definition 10 (Argmax)</w:t>
+        <w:t xml:space="preserve">Definition 11 (Argmax)</w:t>
       </w:r>
       <w:r>
         <w:t xml:space="preserve"> </w:t>
@@ -7599,7 +7637,7 @@
       <w:r>
         <w:t xml:space="preserve"> </w:t>
       </w:r>
-      <w:hyperlink r:id="rId44">
+      <w:hyperlink r:id="rId47">
         <w:r>
           <w:rPr>
             <w:rStyle w:val="Hyperlink"/>
@@ -7961,8 +7999,8 @@
         <w:t xml:space="preserve">.</w:t>
       </w:r>
     </w:p>
-    <w:bookmarkEnd w:id="48"/>
-    <w:bookmarkStart w:id="50" w:name="exm-argmax"/>
+    <w:bookmarkEnd w:id="51"/>
+    <w:bookmarkStart w:id="53" w:name="exm-argmax"/>
     <w:p>
       <w:pPr>
         <w:pStyle w:val="BodyText"/>
@@ -8643,7 +8681,7 @@
       <w:r>
         <w:t xml:space="preserve"> </w:t>
       </w:r>
-      <w:hyperlink r:id="rId49">
+      <w:hyperlink r:id="rId52">
         <w:r>
           <w:rPr>
             <w:rStyle w:val="Hyperlink"/>
@@ -8655,9 +8693,9 @@
         <w:t xml:space="preserve">.</w:t>
       </w:r>
     </w:p>
-    <w:bookmarkEnd w:id="50"/>
-    <w:bookmarkEnd w:id="51"/>
-    <w:bookmarkStart w:id="61" w:name="sec-minimizers"/>
+    <w:bookmarkEnd w:id="53"/>
+    <w:bookmarkEnd w:id="54"/>
+    <w:bookmarkStart w:id="64" w:name="sec-minimizers"/>
     <w:p>
       <w:pPr>
         <w:pStyle w:val="Heading2"/>
@@ -8666,7 +8704,7 @@
         <w:t xml:space="preserve">5 Global and local minimizers</w:t>
       </w:r>
     </w:p>
-    <w:bookmarkStart w:id="52" w:name="exr-local-vs-global-min"/>
+    <w:bookmarkStart w:id="55" w:name="exr-local-vs-global-min"/>
     <w:p>
       <w:pPr>
         <w:pStyle w:val="FirstParagraph"/>
@@ -9153,8 +9191,8 @@
         <w:t xml:space="preserve">?</w:t>
       </w:r>
     </w:p>
-    <w:bookmarkEnd w:id="52"/>
-    <w:bookmarkStart w:id="53" w:name="sol-local-vs-global-min"/>
+    <w:bookmarkEnd w:id="55"/>
+    <w:bookmarkStart w:id="56" w:name="sol-local-vs-global-min"/>
     <w:p>
       <w:pPr>
         <w:pStyle w:val="FirstParagraph"/>
@@ -10457,8 +10495,8 @@
         <w:t xml:space="preserve">.</w:t>
       </w:r>
     </w:p>
-    <w:bookmarkEnd w:id="53"/>
-    <w:bookmarkStart w:id="54" w:name="def-global-minimizer"/>
+    <w:bookmarkEnd w:id="56"/>
+    <w:bookmarkStart w:id="57" w:name="def-global-minimizer"/>
     <w:p>
       <w:pPr>
         <w:pStyle w:val="FirstParagraph"/>
@@ -10468,7 +10506,7 @@
           <w:b/>
           <w:bCs/>
         </w:rPr>
-        <w:t xml:space="preserve">Definition 11 (Global minimizer)</w:t>
+        <w:t xml:space="preserve">Definition 12 (Global minimizer)</w:t>
       </w:r>
       <w:r>
         <w:t xml:space="preserve"> </w:t>
@@ -10551,7 +10589,7 @@
       <w:r>
         <w:t xml:space="preserve"> </w:t>
       </w:r>
-      <w:hyperlink r:id="rId44">
+      <w:hyperlink r:id="rId47">
         <w:r>
           <w:rPr>
             <w:rStyle w:val="Hyperlink"/>
@@ -10733,8 +10771,8 @@
         <w:t xml:space="preserve">.</w:t>
       </w:r>
     </w:p>
-    <w:bookmarkEnd w:id="54"/>
-    <w:bookmarkStart w:id="55" w:name="rem-global-minimizer-argmin"/>
+    <w:bookmarkEnd w:id="57"/>
+    <w:bookmarkStart w:id="58" w:name="rem-global-minimizer-argmin"/>
     <w:p>
       <w:pPr>
         <w:pStyle w:val="BodyText"/>
@@ -10744,7 +10782,7 @@
           <w:i/>
           <w:iCs/>
         </w:rPr>
-        <w:t xml:space="preserve">Remark 3</w:t>
+        <w:t xml:space="preserve">Remark 5</w:t>
       </w:r>
       <w:r>
         <w:t xml:space="preserve"> (Global minimizers form the argmin). </w:t>
@@ -10830,7 +10868,7 @@
           <w:rPr>
             <w:rStyle w:val="Hyperlink"/>
           </w:rPr>
-          <w:t xml:space="preserve">Definition 9</w:t>
+          <w:t xml:space="preserve">Definition 10</w:t>
         </w:r>
       </w:hyperlink>
       <w:r>
@@ -11229,8 +11267,8 @@
         <w:t xml:space="preserve">.</w:t>
       </w:r>
     </w:p>
-    <w:bookmarkEnd w:id="55"/>
-    <w:bookmarkStart w:id="57" w:name="def-local-minimizer"/>
+    <w:bookmarkEnd w:id="58"/>
+    <w:bookmarkStart w:id="60" w:name="def-local-minimizer"/>
     <w:p>
       <w:pPr>
         <w:pStyle w:val="BodyText"/>
@@ -11240,7 +11278,7 @@
           <w:b/>
           <w:bCs/>
         </w:rPr>
-        <w:t xml:space="preserve">Definition 12 (Local minimizer)</w:t>
+        <w:t xml:space="preserve">Definition 13 (Local minimizer)</w:t>
       </w:r>
       <w:r>
         <w:t xml:space="preserve"> </w:t>
@@ -11323,7 +11361,7 @@
       <w:r>
         <w:t xml:space="preserve"> </w:t>
       </w:r>
-      <w:hyperlink r:id="rId44">
+      <w:hyperlink r:id="rId47">
         <w:r>
           <w:rPr>
             <w:rStyle w:val="Hyperlink"/>
@@ -11615,7 +11653,7 @@
       <w:r>
         <w:t xml:space="preserve"> </w:t>
       </w:r>
-      <w:hyperlink r:id="rId56">
+      <w:hyperlink r:id="rId59">
         <w:r>
           <w:rPr>
             <w:rStyle w:val="Hyperlink"/>
@@ -11627,8 +11665,8 @@
         <w:t xml:space="preserve">.</w:t>
       </w:r>
     </w:p>
-    <w:bookmarkEnd w:id="57"/>
-    <w:bookmarkStart w:id="59" w:name="rem-local-minimizer"/>
+    <w:bookmarkEnd w:id="60"/>
+    <w:bookmarkStart w:id="62" w:name="rem-local-minimizer"/>
     <w:p>
       <w:pPr>
         <w:pStyle w:val="BodyText"/>
@@ -11638,7 +11676,7 @@
           <w:i/>
           <w:iCs/>
         </w:rPr>
-        <w:t xml:space="preserve">Remark 4</w:t>
+        <w:t xml:space="preserve">Remark 6</w:t>
       </w:r>
       <w:r>
         <w:t xml:space="preserve"> (Local and global minimizers). </w:t>
@@ -11917,7 +11955,7 @@
           <w:rPr>
             <w:rStyle w:val="Hyperlink"/>
           </w:rPr>
-          <w:t xml:space="preserve">Definition 11</w:t>
+          <w:t xml:space="preserve">Definition 12</w:t>
         </w:r>
       </w:hyperlink>
       <w:r>
@@ -12069,7 +12107,7 @@
       <w:r>
         <w:t xml:space="preserve"> </w:t>
       </w:r>
-      <w:hyperlink r:id="rId58">
+      <w:hyperlink r:id="rId61">
         <w:r>
           <w:rPr>
             <w:rStyle w:val="Hyperlink"/>
@@ -12224,8 +12262,8 @@
         <w:t xml:space="preserve">but not a global one.</w:t>
       </w:r>
     </w:p>
-    <w:bookmarkEnd w:id="59"/>
-    <w:bookmarkStart w:id="60" w:name="exm-not-local-minimizer"/>
+    <w:bookmarkEnd w:id="62"/>
+    <w:bookmarkStart w:id="63" w:name="exm-not-local-minimizer"/>
     <w:p>
       <w:pPr>
         <w:pStyle w:val="BodyText"/>
@@ -13648,8 +13686,8 @@
         </m:oMath>
       </m:oMathPara>
     </w:p>
-    <w:bookmarkEnd w:id="60"/>
-    <w:bookmarkEnd w:id="61"/>
+    <w:bookmarkEnd w:id="63"/>
+    <w:bookmarkEnd w:id="64"/>
     <w:sectPr>
       <w:footnotePr>
         <w:numRestart w:val="eachSect"/>

</xml_diff>

<commit_message>
Deploying to gh-pages from @ Morrison-Lab/mds@e60e3cb6a480c22240f8aaf32eb000f3ac705f59 🚀
</commit_message>
<xml_diff>
--- a/algebra-basics.docx
+++ b/algebra-basics.docx
@@ -15,7 +15,7 @@
         <w:pStyle w:val="Date"/>
       </w:pPr>
       <w:r>
-        <w:t xml:space="preserve">Last modified: 2026-10-15 03:52:50 (PDT)</w:t>
+        <w:t xml:space="preserve">Last modified: 2026-10-15 04:45:51 (PDT)</w:t>
       </w:r>
     </w:p>
     <w:bookmarkStart w:id="18" w:name="equalities"/>
@@ -8815,7 +8815,7 @@
         </w:numPr>
       </w:pPr>
       <w:r>
-        <w:t xml:space="preserve">Show that</w:t>
+        <w:t xml:space="preserve">Factor</w:t>
       </w:r>
       <w:r>
         <w:t xml:space="preserve"> </w:t>
@@ -8863,72 +8863,12 @@
           </m:rPr>
           <m:t>)</m:t>
         </m:r>
-        <m:r>
-          <m:rPr>
-            <m:sty m:val="p"/>
-          </m:rPr>
-          <m:t>=</m:t>
-        </m:r>
-        <m:r>
-          <m:rPr>
-            <m:sty m:val="p"/>
-          </m:rPr>
-          <m:t>(</m:t>
-        </m:r>
-        <m:r>
-          <m:t>x</m:t>
-        </m:r>
-        <m:r>
-          <m:rPr>
-            <m:sty m:val="p"/>
-          </m:rPr>
-          <m:t>−</m:t>
-        </m:r>
-        <m:r>
-          <m:t>1</m:t>
-        </m:r>
-        <m:sSup>
-          <m:e>
-            <m:r>
-              <m:rPr>
-                <m:sty m:val="p"/>
-              </m:rPr>
-              <m:t>)</m:t>
-            </m:r>
-          </m:e>
-          <m:sup>
-            <m:r>
-              <m:t>2</m:t>
-            </m:r>
-          </m:sup>
-        </m:sSup>
-        <m:r>
-          <m:rPr>
-            <m:sty m:val="p"/>
-          </m:rPr>
-          <m:t>(</m:t>
-        </m:r>
-        <m:r>
-          <m:t>x</m:t>
-        </m:r>
-        <m:r>
-          <m:rPr>
-            <m:sty m:val="p"/>
-          </m:rPr>
-          <m:t>+</m:t>
-        </m:r>
-        <m:r>
-          <m:t>2</m:t>
-        </m:r>
-        <m:r>
-          <m:rPr>
-            <m:sty m:val="p"/>
-          </m:rPr>
-          <m:t>)</m:t>
-        </m:r>
-      </m:oMath>
-      <w:r>
-        <w:t xml:space="preserve">.</w:t>
+      </m:oMath>
+      <w:r>
+        <w:t xml:space="preserve"> </w:t>
+      </w:r>
+      <w:r>
+        <w:t xml:space="preserve">completely.</w:t>
       </w:r>
     </w:p>
     <w:p>
@@ -8940,7 +8880,7 @@
         </w:numPr>
       </w:pPr>
       <w:r>
-        <w:t xml:space="preserve">Use part 1 to show that</w:t>
+        <w:t xml:space="preserve">Use part 1 to compare</w:t>
       </w:r>
       <w:r>
         <w:t xml:space="preserve"> </w:t>
@@ -8964,12 +8904,17 @@
           </m:rPr>
           <m:t>)</m:t>
         </m:r>
-        <m:r>
-          <m:rPr>
-            <m:sty m:val="p"/>
-          </m:rPr>
-          <m:t>≥</m:t>
-        </m:r>
+      </m:oMath>
+      <w:r>
+        <w:t xml:space="preserve"> </w:t>
+      </w:r>
+      <w:r>
+        <w:t xml:space="preserve">with</w:t>
+      </w:r>
+      <w:r>
+        <w:t xml:space="preserve"> </w:t>
+      </w:r>
+      <m:oMath>
         <m:r>
           <m:t>f</m:t>
         </m:r>
@@ -9040,6 +8985,84 @@
       </m:oMath>
       <w:r>
         <w:t xml:space="preserve">.</w:t>
+      </w:r>
+      <w:r>
+        <w:t xml:space="preserve"> </w:t>
+      </w:r>
+      <w:r>
+        <w:t xml:space="preserve">Is</w:t>
+      </w:r>
+      <w:r>
+        <w:t xml:space="preserve"> </w:t>
+      </w:r>
+      <m:oMath>
+        <m:r>
+          <m:t>f</m:t>
+        </m:r>
+        <m:r>
+          <m:rPr>
+            <m:sty m:val="p"/>
+          </m:rPr>
+          <m:t>(</m:t>
+        </m:r>
+        <m:r>
+          <m:t>x</m:t>
+        </m:r>
+        <m:r>
+          <m:rPr>
+            <m:sty m:val="p"/>
+          </m:rPr>
+          <m:t>)</m:t>
+        </m:r>
+      </m:oMath>
+      <w:r>
+        <w:t xml:space="preserve"> </w:t>
+      </w:r>
+      <w:r>
+        <w:t xml:space="preserve">larger than, smaller than, or equal to</w:t>
+      </w:r>
+      <w:r>
+        <w:t xml:space="preserve"> </w:t>
+      </w:r>
+      <m:oMath>
+        <m:r>
+          <m:t>f</m:t>
+        </m:r>
+        <m:r>
+          <m:rPr>
+            <m:sty m:val="p"/>
+          </m:rPr>
+          <m:t>(</m:t>
+        </m:r>
+        <m:r>
+          <m:t>1</m:t>
+        </m:r>
+        <m:r>
+          <m:rPr>
+            <m:sty m:val="p"/>
+          </m:rPr>
+          <m:t>)</m:t>
+        </m:r>
+      </m:oMath>
+      <w:r>
+        <w:t xml:space="preserve">,</w:t>
+      </w:r>
+      <w:r>
+        <w:t xml:space="preserve"> </w:t>
+      </w:r>
+      <w:r>
+        <w:t xml:space="preserve">and for which</w:t>
+      </w:r>
+      <w:r>
+        <w:t xml:space="preserve"> </w:t>
+      </w:r>
+      <m:oMath>
+        <m:r>
+          <m:t>x</m:t>
+        </m:r>
+      </m:oMath>
+      <w:r>
+        <w:t xml:space="preserve">?</w:t>
       </w:r>
     </w:p>
     <w:p>
@@ -9905,6 +9928,283 @@
         </m:r>
         <m:r>
           <m:t>1</m:t>
+        </m:r>
+        <m:r>
+          <m:rPr>
+            <m:sty m:val="p"/>
+          </m:rPr>
+          <m:t>)</m:t>
+        </m:r>
+      </m:oMath>
+      <w:r>
+        <w:t xml:space="preserve">.</w:t>
+      </w:r>
+      <w:r>
+        <w:t xml:space="preserve"> </w:t>
+      </w:r>
+      <w:r>
+        <w:t xml:space="preserve">So</w:t>
+      </w:r>
+      <w:r>
+        <w:t xml:space="preserve"> </w:t>
+      </w:r>
+      <m:oMath>
+        <m:r>
+          <m:t>f</m:t>
+        </m:r>
+        <m:r>
+          <m:rPr>
+            <m:sty m:val="p"/>
+          </m:rPr>
+          <m:t>(</m:t>
+        </m:r>
+        <m:r>
+          <m:t>x</m:t>
+        </m:r>
+        <m:r>
+          <m:rPr>
+            <m:sty m:val="p"/>
+          </m:rPr>
+          <m:t>)</m:t>
+        </m:r>
+      </m:oMath>
+      <w:r>
+        <w:t xml:space="preserve"> </w:t>
+      </w:r>
+      <w:r>
+        <w:t xml:space="preserve">is never smaller than</w:t>
+      </w:r>
+      <w:r>
+        <w:t xml:space="preserve"> </w:t>
+      </w:r>
+      <m:oMath>
+        <m:r>
+          <m:t>f</m:t>
+        </m:r>
+        <m:r>
+          <m:rPr>
+            <m:sty m:val="p"/>
+          </m:rPr>
+          <m:t>(</m:t>
+        </m:r>
+        <m:r>
+          <m:t>1</m:t>
+        </m:r>
+        <m:r>
+          <m:rPr>
+            <m:sty m:val="p"/>
+          </m:rPr>
+          <m:t>)</m:t>
+        </m:r>
+      </m:oMath>
+      <w:r>
+        <w:t xml:space="preserve"> </w:t>
+      </w:r>
+      <w:r>
+        <w:t xml:space="preserve">on</w:t>
+      </w:r>
+      <w:r>
+        <w:t xml:space="preserve"> </w:t>
+      </w:r>
+      <m:oMath>
+        <m:r>
+          <m:rPr>
+            <m:sty m:val="p"/>
+          </m:rPr>
+          <m:t>(</m:t>
+        </m:r>
+        <m:r>
+          <m:t>0</m:t>
+        </m:r>
+        <m:r>
+          <m:rPr>
+            <m:sty m:val="p"/>
+          </m:rPr>
+          <m:t>,</m:t>
+        </m:r>
+        <m:r>
+          <m:t>2</m:t>
+        </m:r>
+        <m:r>
+          <m:rPr>
+            <m:sty m:val="p"/>
+          </m:rPr>
+          <m:t>)</m:t>
+        </m:r>
+      </m:oMath>
+      <w:r>
+        <w:t xml:space="preserve">.</w:t>
+      </w:r>
+      <w:r>
+        <w:t xml:space="preserve"> </w:t>
+      </w:r>
+      <w:r>
+        <w:t xml:space="preserve">It equals</w:t>
+      </w:r>
+      <w:r>
+        <w:t xml:space="preserve"> </w:t>
+      </w:r>
+      <m:oMath>
+        <m:r>
+          <m:t>f</m:t>
+        </m:r>
+        <m:r>
+          <m:rPr>
+            <m:sty m:val="p"/>
+          </m:rPr>
+          <m:t>(</m:t>
+        </m:r>
+        <m:r>
+          <m:t>1</m:t>
+        </m:r>
+        <m:r>
+          <m:rPr>
+            <m:sty m:val="p"/>
+          </m:rPr>
+          <m:t>)</m:t>
+        </m:r>
+      </m:oMath>
+      <w:r>
+        <w:t xml:space="preserve"> </w:t>
+      </w:r>
+      <w:r>
+        <w:t xml:space="preserve">only when</w:t>
+      </w:r>
+      <w:r>
+        <w:t xml:space="preserve"> </w:t>
+      </w:r>
+      <m:oMath>
+        <m:r>
+          <m:rPr>
+            <m:sty m:val="p"/>
+          </m:rPr>
+          <m:t>(</m:t>
+        </m:r>
+        <m:r>
+          <m:t>x</m:t>
+        </m:r>
+        <m:r>
+          <m:rPr>
+            <m:sty m:val="p"/>
+          </m:rPr>
+          <m:t>−</m:t>
+        </m:r>
+        <m:r>
+          <m:t>1</m:t>
+        </m:r>
+        <m:sSup>
+          <m:e>
+            <m:r>
+              <m:rPr>
+                <m:sty m:val="p"/>
+              </m:rPr>
+              <m:t>)</m:t>
+            </m:r>
+          </m:e>
+          <m:sup>
+            <m:r>
+              <m:t>2</m:t>
+            </m:r>
+          </m:sup>
+        </m:sSup>
+        <m:r>
+          <m:rPr>
+            <m:sty m:val="p"/>
+          </m:rPr>
+          <m:t>=</m:t>
+        </m:r>
+        <m:r>
+          <m:t>0</m:t>
+        </m:r>
+      </m:oMath>
+      <w:r>
+        <w:t xml:space="preserve">, that is, only at</w:t>
+      </w:r>
+      <w:r>
+        <w:t xml:space="preserve"> </w:t>
+      </w:r>
+      <m:oMath>
+        <m:r>
+          <m:t>x</m:t>
+        </m:r>
+        <m:r>
+          <m:rPr>
+            <m:sty m:val="p"/>
+          </m:rPr>
+          <m:t>=</m:t>
+        </m:r>
+        <m:r>
+          <m:t>1</m:t>
+        </m:r>
+      </m:oMath>
+      <w:r>
+        <w:t xml:space="preserve">,</w:t>
+      </w:r>
+      <w:r>
+        <w:t xml:space="preserve"> </w:t>
+      </w:r>
+      <w:r>
+        <w:t xml:space="preserve">and it is larger than</w:t>
+      </w:r>
+      <w:r>
+        <w:t xml:space="preserve"> </w:t>
+      </w:r>
+      <m:oMath>
+        <m:r>
+          <m:t>f</m:t>
+        </m:r>
+        <m:r>
+          <m:rPr>
+            <m:sty m:val="p"/>
+          </m:rPr>
+          <m:t>(</m:t>
+        </m:r>
+        <m:r>
+          <m:t>1</m:t>
+        </m:r>
+        <m:r>
+          <m:rPr>
+            <m:sty m:val="p"/>
+          </m:rPr>
+          <m:t>)</m:t>
+        </m:r>
+      </m:oMath>
+      <w:r>
+        <w:t xml:space="preserve"> </w:t>
+      </w:r>
+      <w:r>
+        <w:t xml:space="preserve">at every other</w:t>
+      </w:r>
+      <w:r>
+        <w:t xml:space="preserve"> </w:t>
+      </w:r>
+      <m:oMath>
+        <m:r>
+          <m:t>x</m:t>
+        </m:r>
+        <m:r>
+          <m:rPr>
+            <m:sty m:val="p"/>
+          </m:rPr>
+          <m:t>∈</m:t>
+        </m:r>
+        <m:r>
+          <m:rPr>
+            <m:sty m:val="p"/>
+          </m:rPr>
+          <m:t>(</m:t>
+        </m:r>
+        <m:r>
+          <m:t>0</m:t>
+        </m:r>
+        <m:r>
+          <m:rPr>
+            <m:sty m:val="p"/>
+          </m:rPr>
+          <m:t>,</m:t>
+        </m:r>
+        <m:r>
+          <m:t>2</m:t>
         </m:r>
         <m:r>
           <m:rPr>

</xml_diff>

<commit_message>
Deploying to gh-pages from @ Morrison-Lab/mds@b143ffefeaf686e697f408c873d127508c9929d4 🚀
</commit_message>
<xml_diff>
--- a/algebra-basics.docx
+++ b/algebra-basics.docx
@@ -15,7 +15,7 @@
         <w:pStyle w:val="Date"/>
       </w:pPr>
       <w:r>
-        <w:t xml:space="preserve">Last modified: 2026-10-15 08:28:32 (PDT)</w:t>
+        <w:t xml:space="preserve">Last modified: 2026-10-15 09:23:43 (PDT)</w:t>
       </w:r>
     </w:p>
     <w:bookmarkStart w:id="18" w:name="equalities"/>
@@ -1056,7 +1056,7 @@
     </w:p>
     <w:bookmarkEnd w:id="17"/>
     <w:bookmarkEnd w:id="18"/>
-    <w:bookmarkStart w:id="25" w:name="inequalities"/>
+    <w:bookmarkStart w:id="26" w:name="inequalities"/>
     <w:p>
       <w:pPr>
         <w:pStyle w:val="Heading2"/>
@@ -1075,7 +1075,7 @@
           <w:b/>
           <w:bCs/>
         </w:rPr>
-        <w:t xml:space="preserve">Definition 3 (Strict and non-strict inequalities)</w:t>
+        <w:t xml:space="preserve">Definition 3 (Strict inequalities)</w:t>
       </w:r>
       <w:r>
         <w:t xml:space="preserve"> </w:t>
@@ -1246,11 +1246,67 @@
       <w:r>
         <w:t xml:space="preserve">.</w:t>
       </w:r>
-      <w:r>
-        <w:t xml:space="preserve"> </w:t>
-      </w:r>
-      <w:r>
-        <w:t xml:space="preserve">The</w:t>
+    </w:p>
+    <w:bookmarkEnd w:id="19"/>
+    <w:bookmarkStart w:id="20" w:name="def-non-strict-inequality"/>
+    <w:p>
+      <w:pPr>
+        <w:pStyle w:val="BodyText"/>
+      </w:pPr>
+      <w:r>
+        <w:rPr>
+          <w:b/>
+          <w:bCs/>
+        </w:rPr>
+        <w:t xml:space="preserve">Definition 4 (Non-strict inequalities)</w:t>
+      </w:r>
+      <w:r>
+        <w:t xml:space="preserve"> </w:t>
+      </w:r>
+      <w:r>
+        <w:t xml:space="preserve">For</w:t>
+      </w:r>
+      <w:r>
+        <w:t xml:space="preserve"> </w:t>
+      </w:r>
+      <w:hyperlink r:id="rId15">
+        <w:r>
+          <w:rPr>
+            <w:rStyle w:val="Hyperlink"/>
+          </w:rPr>
+          <w:t xml:space="preserve">real numbers</w:t>
+        </w:r>
+      </w:hyperlink>
+      <w:r>
+        <w:t xml:space="preserve"> </w:t>
+      </w:r>
+      <m:oMath>
+        <m:r>
+          <m:t>a</m:t>
+        </m:r>
+      </m:oMath>
+      <w:r>
+        <w:t xml:space="preserve"> </w:t>
+      </w:r>
+      <w:r>
+        <w:t xml:space="preserve">and</w:t>
+      </w:r>
+      <w:r>
+        <w:t xml:space="preserve"> </w:t>
+      </w:r>
+      <m:oMath>
+        <m:r>
+          <m:t>b</m:t>
+        </m:r>
+      </m:oMath>
+      <w:r>
+        <w:t xml:space="preserve">,</w:t>
+      </w:r>
+      <w:r>
+        <w:t xml:space="preserve"> </w:t>
+      </w:r>
+      <w:r>
+        <w:t xml:space="preserve">the</w:t>
       </w:r>
       <w:r>
         <w:t xml:space="preserve"> </w:t>
@@ -1266,7 +1322,24 @@
         <w:t xml:space="preserve"> </w:t>
       </w:r>
       <w:r>
-        <w:t xml:space="preserve">also allow equality:</w:t>
+        <w:t xml:space="preserve">also allow equality,</w:t>
+      </w:r>
+      <w:r>
+        <w:t xml:space="preserve"> </w:t>
+      </w:r>
+      <w:r>
+        <w:t xml:space="preserve">unlike the strict inequalities (</w:t>
+      </w:r>
+      <w:hyperlink w:anchor="def-strict-inequality">
+        <w:r>
+          <w:rPr>
+            <w:rStyle w:val="Hyperlink"/>
+          </w:rPr>
+          <w:t xml:space="preserve">Definition 3</w:t>
+        </w:r>
+      </w:hyperlink>
+      <w:r>
+        <w:t xml:space="preserve">):</w:t>
       </w:r>
     </w:p>
     <w:p>
@@ -1413,8 +1486,8 @@
         <w:t xml:space="preserve">.</w:t>
       </w:r>
     </w:p>
-    <w:bookmarkEnd w:id="19"/>
-    <w:bookmarkStart w:id="20" w:name="exm-strict-inequality"/>
+    <w:bookmarkEnd w:id="20"/>
+    <w:bookmarkStart w:id="21" w:name="exm-strict-inequality"/>
     <w:p>
       <w:pPr>
         <w:pStyle w:val="FirstParagraph"/>
@@ -1638,8 +1711,8 @@
         <w:t xml:space="preserve">are both false.</w:t>
       </w:r>
     </w:p>
-    <w:bookmarkEnd w:id="20"/>
-    <w:bookmarkStart w:id="21" w:name="thm-add-ineq"/>
+    <w:bookmarkEnd w:id="21"/>
+    <w:bookmarkStart w:id="22" w:name="thm-add-ineq"/>
     <w:p>
       <w:pPr>
         <w:pStyle w:val="FirstParagraph"/>
@@ -1713,8 +1786,8 @@
         </m:r>
       </m:oMath>
     </w:p>
-    <w:bookmarkEnd w:id="21"/>
-    <w:bookmarkStart w:id="22" w:name="thm-neg-ineq"/>
+    <w:bookmarkEnd w:id="22"/>
+    <w:bookmarkStart w:id="23" w:name="thm-neg-ineq"/>
     <w:p>
       <w:pPr>
         <w:pStyle w:val="BodyText"/>
@@ -1782,8 +1855,8 @@
         </m:r>
       </m:oMath>
     </w:p>
-    <w:bookmarkEnd w:id="22"/>
-    <w:bookmarkStart w:id="23" w:name="thm-mult-ineq"/>
+    <w:bookmarkEnd w:id="23"/>
+    <w:bookmarkStart w:id="24" w:name="thm-mult-ineq"/>
     <w:p>
       <w:pPr>
         <w:pStyle w:val="BodyText"/>
@@ -1871,8 +1944,8 @@
         <w:t xml:space="preserve">.</w:t>
       </w:r>
     </w:p>
-    <w:bookmarkEnd w:id="23"/>
-    <w:bookmarkStart w:id="24" w:name="thm-negative-one"/>
+    <w:bookmarkEnd w:id="24"/>
+    <w:bookmarkStart w:id="25" w:name="thm-negative-one"/>
     <w:p>
       <w:pPr>
         <w:pStyle w:val="BodyText"/>
@@ -1967,9 +2040,9 @@
         </m:oMath>
       </m:oMathPara>
     </w:p>
-    <w:bookmarkEnd w:id="24"/>
     <w:bookmarkEnd w:id="25"/>
-    <w:bookmarkStart w:id="39" w:name="sec-powers-roots-abs"/>
+    <w:bookmarkEnd w:id="26"/>
+    <w:bookmarkStart w:id="43" w:name="sec-powers-roots-abs"/>
     <w:p>
       <w:pPr>
         <w:pStyle w:val="Heading2"/>
@@ -1978,7 +2051,7 @@
         <w:t xml:space="preserve">3 Powers, square roots, and absolute values</w:t>
       </w:r>
     </w:p>
-    <w:bookmarkStart w:id="27" w:name="def-power"/>
+    <w:bookmarkStart w:id="28" w:name="def-power"/>
     <w:p>
       <w:pPr>
         <w:pStyle w:val="FirstParagraph"/>
@@ -1988,7 +2061,7 @@
           <w:b/>
           <w:bCs/>
         </w:rPr>
-        <w:t xml:space="preserve">Definition 4 (Power, base, and exponent)</w:t>
+        <w:t xml:space="preserve">Definition 5 (Power)</w:t>
       </w:r>
       <w:r>
         <w:t xml:space="preserve"> </w:t>
@@ -2027,7 +2100,7 @@
       <w:r>
         <w:t xml:space="preserve"> </w:t>
       </w:r>
-      <w:hyperlink r:id="rId26">
+      <w:hyperlink r:id="rId27">
         <w:r>
           <w:rPr>
             <w:rStyle w:val="Hyperlink"/>
@@ -2215,11 +2288,23 @@
         </m:oMath>
       </m:oMathPara>
     </w:p>
+    <w:bookmarkEnd w:id="28"/>
+    <w:bookmarkStart w:id="29" w:name="def-power-base"/>
     <w:p>
       <w:pPr>
         <w:pStyle w:val="FirstParagraph"/>
       </w:pPr>
       <w:r>
+        <w:rPr>
+          <w:b/>
+          <w:bCs/>
+        </w:rPr>
+        <w:t xml:space="preserve">Definition 6 (Base of a power)</w:t>
+      </w:r>
+      <w:r>
+        <w:t xml:space="preserve"> </w:t>
+      </w:r>
+      <w:r>
         <w:t xml:space="preserve">In</w:t>
       </w:r>
       <w:r>
@@ -2240,7 +2325,21 @@
         </m:sSup>
       </m:oMath>
       <w:r>
-        <w:t xml:space="preserve">,</w:t>
+        <w:t xml:space="preserve"> </w:t>
+      </w:r>
+      <w:r>
+        <w:t xml:space="preserve">(</w:t>
+      </w:r>
+      <w:hyperlink w:anchor="def-power">
+        <w:r>
+          <w:rPr>
+            <w:rStyle w:val="Hyperlink"/>
+          </w:rPr>
+          <w:t xml:space="preserve">Definition 5</w:t>
+        </w:r>
+      </w:hyperlink>
+      <w:r>
+        <w:t xml:space="preserve">),</w:t>
       </w:r>
       <w:r>
         <w:t xml:space="preserve"> </w:t>
@@ -2267,10 +2366,61 @@
         <w:t xml:space="preserve">base</w:t>
       </w:r>
       <w:r>
-        <w:t xml:space="preserve"> </w:t>
-      </w:r>
-      <w:r>
-        <w:t xml:space="preserve">and</w:t>
+        <w:t xml:space="preserve">.</w:t>
+      </w:r>
+    </w:p>
+    <w:bookmarkEnd w:id="29"/>
+    <w:bookmarkStart w:id="30" w:name="def-power-exponent"/>
+    <w:p>
+      <w:pPr>
+        <w:pStyle w:val="BodyText"/>
+      </w:pPr>
+      <w:r>
+        <w:rPr>
+          <w:b/>
+          <w:bCs/>
+        </w:rPr>
+        <w:t xml:space="preserve">Definition 7 (Exponent of a power)</w:t>
+      </w:r>
+      <w:r>
+        <w:t xml:space="preserve"> </w:t>
+      </w:r>
+      <w:r>
+        <w:t xml:space="preserve">In</w:t>
+      </w:r>
+      <w:r>
+        <w:t xml:space="preserve"> </w:t>
+      </w:r>
+      <m:oMath>
+        <m:sSup>
+          <m:e>
+            <m:r>
+              <m:t>a</m:t>
+            </m:r>
+          </m:e>
+          <m:sup>
+            <m:r>
+              <m:t>n</m:t>
+            </m:r>
+          </m:sup>
+        </m:sSup>
+      </m:oMath>
+      <w:r>
+        <w:t xml:space="preserve"> </w:t>
+      </w:r>
+      <w:r>
+        <w:t xml:space="preserve">(</w:t>
+      </w:r>
+      <w:hyperlink w:anchor="def-power">
+        <w:r>
+          <w:rPr>
+            <w:rStyle w:val="Hyperlink"/>
+          </w:rPr>
+          <w:t xml:space="preserve">Definition 5</w:t>
+        </w:r>
+      </w:hyperlink>
+      <w:r>
+        <w:t xml:space="preserve">),</w:t>
       </w:r>
       <w:r>
         <w:t xml:space="preserve"> </w:t>
@@ -2299,6 +2449,20 @@
       <w:r>
         <w:t xml:space="preserve">.</w:t>
       </w:r>
+    </w:p>
+    <w:bookmarkEnd w:id="30"/>
+    <w:bookmarkStart w:id="31" w:name="def-square"/>
+    <w:p>
+      <w:pPr>
+        <w:pStyle w:val="BodyText"/>
+      </w:pPr>
+      <w:r>
+        <w:rPr>
+          <w:b/>
+          <w:bCs/>
+        </w:rPr>
+        <w:t xml:space="preserve">Definition 8 (Square)</w:t>
+      </w:r>
       <w:r>
         <w:t xml:space="preserve"> </w:t>
       </w:r>
@@ -2326,7 +2490,18 @@
         <w:t xml:space="preserve"> </w:t>
       </w:r>
       <w:r>
-        <w:t xml:space="preserve">is the</w:t>
+        <w:t xml:space="preserve">(</w:t>
+      </w:r>
+      <w:hyperlink w:anchor="def-power">
+        <w:r>
+          <w:rPr>
+            <w:rStyle w:val="Hyperlink"/>
+          </w:rPr>
+          <w:t xml:space="preserve">Definition 5</w:t>
+        </w:r>
+      </w:hyperlink>
+      <w:r>
+        <w:t xml:space="preserve">) is the</w:t>
       </w:r>
       <w:r>
         <w:t xml:space="preserve"> </w:t>
@@ -2356,8 +2531,8 @@
         <w:t xml:space="preserve">.</w:t>
       </w:r>
     </w:p>
-    <w:bookmarkEnd w:id="27"/>
-    <w:bookmarkStart w:id="28" w:name="exm-power"/>
+    <w:bookmarkEnd w:id="31"/>
+    <w:bookmarkStart w:id="32" w:name="exm-power"/>
     <w:p>
       <w:pPr>
         <w:pStyle w:val="BodyText"/>
@@ -2878,8 +3053,8 @@
         </m:oMath>
       </m:oMathPara>
     </w:p>
-    <w:bookmarkEnd w:id="28"/>
-    <w:bookmarkStart w:id="30" w:name="def-power-integer"/>
+    <w:bookmarkEnd w:id="32"/>
+    <w:bookmarkStart w:id="34" w:name="def-power-integer"/>
     <w:p>
       <w:pPr>
         <w:pStyle w:val="FirstParagraph"/>
@@ -2889,7 +3064,7 @@
           <w:b/>
           <w:bCs/>
         </w:rPr>
-        <w:t xml:space="preserve">Definition 5 (Powers with exponent zero or a negative integer)</w:t>
+        <w:t xml:space="preserve">Definition 9 (Powers with exponent zero or a negative integer)</w:t>
       </w:r>
       <w:r>
         <w:t xml:space="preserve"> </w:t>
@@ -2914,7 +3089,7 @@
       <w:r>
         <w:t xml:space="preserve"> </w:t>
       </w:r>
-      <w:hyperlink r:id="rId29">
+      <w:hyperlink r:id="rId33">
         <w:r>
           <w:rPr>
             <w:rStyle w:val="Hyperlink"/>
@@ -3104,8 +3279,8 @@
         <w:t xml:space="preserve">.</w:t>
       </w:r>
     </w:p>
-    <w:bookmarkEnd w:id="30"/>
-    <w:bookmarkStart w:id="32" w:name="rem-power-real-exponents"/>
+    <w:bookmarkEnd w:id="34"/>
+    <w:bookmarkStart w:id="36" w:name="rem-power-real-exponents"/>
     <w:p>
       <w:pPr>
         <w:pStyle w:val="FirstParagraph"/>
@@ -3120,12 +3295,12 @@
       <w:r>
         <w:t xml:space="preserve"> (Powers with real exponents). </w:t>
       </w:r>
-      <w:hyperlink r:id="rId31">
+      <w:hyperlink r:id="rId35">
         <w:r>
           <w:rPr>
             <w:rStyle w:val="Hyperlink"/>
           </w:rPr>
-          <w:t xml:space="preserve">Definition 14 in Polynomials, Exponentials and Logarithms</w:t>
+          <w:t xml:space="preserve">Definition 21 in Polynomials, Exponentials and Logarithms</w:t>
         </w:r>
       </w:hyperlink>
       <w:r>
@@ -3135,8 +3310,8 @@
         <w:t xml:space="preserve">extends powers to real exponents when the base is positive.</w:t>
       </w:r>
     </w:p>
-    <w:bookmarkEnd w:id="32"/>
-    <w:bookmarkStart w:id="33" w:name="def-square-root"/>
+    <w:bookmarkEnd w:id="36"/>
+    <w:bookmarkStart w:id="37" w:name="def-square-root"/>
     <w:p>
       <w:pPr>
         <w:pStyle w:val="BodyText"/>
@@ -3146,7 +3321,7 @@
           <w:b/>
           <w:bCs/>
         </w:rPr>
-        <w:t xml:space="preserve">Definition 6 (Square root)</w:t>
+        <w:t xml:space="preserve">Definition 10 (Square root)</w:t>
       </w:r>
       <w:r>
         <w:t xml:space="preserve"> </w:t>
@@ -3237,7 +3412,7 @@
           <w:rPr>
             <w:rStyle w:val="Hyperlink"/>
           </w:rPr>
-          <w:t xml:space="preserve">Definition 4</w:t>
+          <w:t xml:space="preserve">Definition 5</w:t>
         </w:r>
       </w:hyperlink>
       <w:r>
@@ -3255,8 +3430,8 @@
         <w:t xml:space="preserve">.</w:t>
       </w:r>
     </w:p>
-    <w:bookmarkEnd w:id="33"/>
-    <w:bookmarkStart w:id="35" w:name="exm-square-root"/>
+    <w:bookmarkEnd w:id="37"/>
+    <w:bookmarkStart w:id="39" w:name="exm-square-root"/>
     <w:p>
       <w:pPr>
         <w:pStyle w:val="BodyText"/>
@@ -3560,7 +3735,7 @@
       <w:r>
         <w:t xml:space="preserve"> </w:t>
       </w:r>
-      <w:hyperlink r:id="rId34">
+      <w:hyperlink r:id="rId38">
         <w:r>
           <w:rPr>
             <w:rStyle w:val="Hyperlink"/>
@@ -3572,8 +3747,8 @@
         <w:t xml:space="preserve">).</w:t>
       </w:r>
     </w:p>
-    <w:bookmarkEnd w:id="35"/>
-    <w:bookmarkStart w:id="36" w:name="def-absolute-value"/>
+    <w:bookmarkEnd w:id="39"/>
+    <w:bookmarkStart w:id="40" w:name="def-absolute-value"/>
     <w:p>
       <w:pPr>
         <w:pStyle w:val="FirstParagraph"/>
@@ -3583,7 +3758,7 @@
           <w:b/>
           <w:bCs/>
         </w:rPr>
-        <w:t xml:space="preserve">Definition 7 (Absolute value of a real number)</w:t>
+        <w:t xml:space="preserve">Definition 11 (Absolute value of a real number)</w:t>
       </w:r>
       <w:r>
         <w:t xml:space="preserve"> </w:t>
@@ -3762,8 +3937,8 @@
         </m:oMath>
       </m:oMathPara>
     </w:p>
-    <w:bookmarkEnd w:id="36"/>
-    <w:bookmarkStart w:id="37" w:name="exm-absolute-value"/>
+    <w:bookmarkEnd w:id="40"/>
+    <w:bookmarkStart w:id="41" w:name="exm-absolute-value"/>
     <w:p>
       <w:pPr>
         <w:pStyle w:val="FirstParagraph"/>
@@ -4230,7 +4405,7 @@
           <w:rPr>
             <w:rStyle w:val="Hyperlink"/>
           </w:rPr>
-          <w:t xml:space="preserve">Definition 6</w:t>
+          <w:t xml:space="preserve">Definition 10</w:t>
         </w:r>
       </w:hyperlink>
       <w:r>
@@ -4364,8 +4539,8 @@
         <w:t xml:space="preserve">.</w:t>
       </w:r>
     </w:p>
-    <w:bookmarkEnd w:id="37"/>
-    <w:bookmarkStart w:id="38" w:name="rem-absolute-value-distance"/>
+    <w:bookmarkEnd w:id="41"/>
+    <w:bookmarkStart w:id="42" w:name="rem-absolute-value-distance"/>
     <w:p>
       <w:pPr>
         <w:pStyle w:val="FirstParagraph"/>
@@ -4476,9 +4651,9 @@
         <w:t xml:space="preserve">on the number line.</w:t>
       </w:r>
     </w:p>
-    <w:bookmarkEnd w:id="38"/>
-    <w:bookmarkEnd w:id="39"/>
-    <w:bookmarkStart w:id="54" w:name="sec-min-max"/>
+    <w:bookmarkEnd w:id="42"/>
+    <w:bookmarkEnd w:id="43"/>
+    <w:bookmarkStart w:id="58" w:name="sec-min-max"/>
     <w:p>
       <w:pPr>
         <w:pStyle w:val="Heading2"/>
@@ -4487,7 +4662,7 @@
         <w:t xml:space="preserve">4 Minimum, maximum, argmin and argmax</w:t>
       </w:r>
     </w:p>
-    <w:bookmarkStart w:id="40" w:name="exr-min-and-argmin"/>
+    <w:bookmarkStart w:id="44" w:name="exr-min-and-argmin"/>
     <w:p>
       <w:pPr>
         <w:pStyle w:val="FirstParagraph"/>
@@ -4851,8 +5026,8 @@
         <w:t xml:space="preserve">does it take that value?</w:t>
       </w:r>
     </w:p>
-    <w:bookmarkEnd w:id="40"/>
-    <w:bookmarkStart w:id="41" w:name="sol-min-and-argmin"/>
+    <w:bookmarkEnd w:id="44"/>
+    <w:bookmarkStart w:id="45" w:name="sol-min-and-argmin"/>
     <w:p>
       <w:pPr>
         <w:pStyle w:val="FirstParagraph"/>
@@ -5580,8 +5755,8 @@
         <w:t xml:space="preserve">not a single number.</w:t>
       </w:r>
     </w:p>
-    <w:bookmarkEnd w:id="41"/>
-    <w:bookmarkStart w:id="42" w:name="def-minimum"/>
+    <w:bookmarkEnd w:id="45"/>
+    <w:bookmarkStart w:id="46" w:name="def-minimum"/>
     <w:p>
       <w:pPr>
         <w:pStyle w:val="FirstParagraph"/>
@@ -5591,7 +5766,7 @@
           <w:b/>
           <w:bCs/>
         </w:rPr>
-        <w:t xml:space="preserve">Definition 8 (Minimum)</w:t>
+        <w:t xml:space="preserve">Definition 12 (Minimum)</w:t>
       </w:r>
       <w:r>
         <w:t xml:space="preserve"> </w:t>
@@ -5766,8 +5941,8 @@
         <w:t xml:space="preserve">.</w:t>
       </w:r>
     </w:p>
-    <w:bookmarkEnd w:id="42"/>
-    <w:bookmarkStart w:id="44" w:name="rem-minimum-may-not-exist"/>
+    <w:bookmarkEnd w:id="46"/>
+    <w:bookmarkStart w:id="48" w:name="rem-minimum-may-not-exist"/>
     <w:p>
       <w:pPr>
         <w:pStyle w:val="BodyText"/>
@@ -5853,7 +6028,7 @@
       <w:r>
         <w:t xml:space="preserve"> </w:t>
       </w:r>
-      <w:hyperlink r:id="rId43">
+      <w:hyperlink r:id="rId47">
         <w:r>
           <w:rPr>
             <w:rStyle w:val="Hyperlink"/>
@@ -5989,8 +6164,8 @@
         <w:t xml:space="preserve">, also in it.</w:t>
       </w:r>
     </w:p>
-    <w:bookmarkEnd w:id="44"/>
-    <w:bookmarkStart w:id="45" w:name="def-maximum"/>
+    <w:bookmarkEnd w:id="48"/>
+    <w:bookmarkStart w:id="49" w:name="def-maximum"/>
     <w:p>
       <w:pPr>
         <w:pStyle w:val="BodyText"/>
@@ -6000,7 +6175,7 @@
           <w:b/>
           <w:bCs/>
         </w:rPr>
-        <w:t xml:space="preserve">Definition 9 (Maximum)</w:t>
+        <w:t xml:space="preserve">Definition 13 (Maximum)</w:t>
       </w:r>
       <w:r>
         <w:t xml:space="preserve"> </w:t>
@@ -6175,8 +6350,8 @@
         <w:t xml:space="preserve">.</w:t>
       </w:r>
     </w:p>
-    <w:bookmarkEnd w:id="45"/>
-    <w:bookmarkStart w:id="46" w:name="exm-maximum"/>
+    <w:bookmarkEnd w:id="49"/>
+    <w:bookmarkStart w:id="50" w:name="exm-maximum"/>
     <w:p>
       <w:pPr>
         <w:pStyle w:val="BodyText"/>
@@ -6630,8 +6805,8 @@
         <w:t xml:space="preserve">is at least as large as every element.</w:t>
       </w:r>
     </w:p>
-    <w:bookmarkEnd w:id="46"/>
-    <w:bookmarkStart w:id="48" w:name="def-argmin"/>
+    <w:bookmarkEnd w:id="50"/>
+    <w:bookmarkStart w:id="52" w:name="def-argmin"/>
     <w:p>
       <w:pPr>
         <w:pStyle w:val="FirstParagraph"/>
@@ -6641,7 +6816,7 @@
           <w:b/>
           <w:bCs/>
         </w:rPr>
-        <w:t xml:space="preserve">Definition 10 (Argmin)</w:t>
+        <w:t xml:space="preserve">Definition 14 (Argmin)</w:t>
       </w:r>
       <w:r>
         <w:t xml:space="preserve"> </w:t>
@@ -6688,7 +6863,7 @@
       <w:r>
         <w:t xml:space="preserve"> </w:t>
       </w:r>
-      <w:hyperlink r:id="rId47">
+      <w:hyperlink r:id="rId51">
         <w:r>
           <w:rPr>
             <w:rStyle w:val="Hyperlink"/>
@@ -7050,8 +7225,8 @@
         <w:t xml:space="preserve">.</w:t>
       </w:r>
     </w:p>
-    <w:bookmarkEnd w:id="48"/>
-    <w:bookmarkStart w:id="50" w:name="rem-argmin-vs-minimum"/>
+    <w:bookmarkEnd w:id="52"/>
+    <w:bookmarkStart w:id="54" w:name="rem-argmin-vs-minimum"/>
     <w:p>
       <w:pPr>
         <w:pStyle w:val="BodyText"/>
@@ -7112,7 +7287,7 @@
           <w:rPr>
             <w:rStyle w:val="Hyperlink"/>
           </w:rPr>
-          <w:t xml:space="preserve">Definition 8</w:t>
+          <w:t xml:space="preserve">Definition 12</w:t>
         </w:r>
       </w:hyperlink>
       <w:r>
@@ -7127,7 +7302,7 @@
       <w:r>
         <w:t xml:space="preserve"> </w:t>
       </w:r>
-      <w:hyperlink r:id="rId49">
+      <w:hyperlink r:id="rId53">
         <w:r>
           <w:rPr>
             <w:rStyle w:val="Hyperlink"/>
@@ -7579,8 +7754,8 @@
         <w:t xml:space="preserve">.</w:t>
       </w:r>
     </w:p>
-    <w:bookmarkEnd w:id="50"/>
-    <w:bookmarkStart w:id="51" w:name="def-argmax"/>
+    <w:bookmarkEnd w:id="54"/>
+    <w:bookmarkStart w:id="55" w:name="def-argmax"/>
     <w:p>
       <w:pPr>
         <w:pStyle w:val="BodyText"/>
@@ -7590,7 +7765,7 @@
           <w:b/>
           <w:bCs/>
         </w:rPr>
-        <w:t xml:space="preserve">Definition 11 (Argmax)</w:t>
+        <w:t xml:space="preserve">Definition 15 (Argmax)</w:t>
       </w:r>
       <w:r>
         <w:t xml:space="preserve"> </w:t>
@@ -7637,7 +7812,7 @@
       <w:r>
         <w:t xml:space="preserve"> </w:t>
       </w:r>
-      <w:hyperlink r:id="rId47">
+      <w:hyperlink r:id="rId51">
         <w:r>
           <w:rPr>
             <w:rStyle w:val="Hyperlink"/>
@@ -7999,8 +8174,8 @@
         <w:t xml:space="preserve">.</w:t>
       </w:r>
     </w:p>
-    <w:bookmarkEnd w:id="51"/>
-    <w:bookmarkStart w:id="53" w:name="exm-argmax"/>
+    <w:bookmarkEnd w:id="55"/>
+    <w:bookmarkStart w:id="57" w:name="exm-argmax"/>
     <w:p>
       <w:pPr>
         <w:pStyle w:val="BodyText"/>
@@ -8681,7 +8856,7 @@
       <w:r>
         <w:t xml:space="preserve"> </w:t>
       </w:r>
-      <w:hyperlink r:id="rId52">
+      <w:hyperlink r:id="rId56">
         <w:r>
           <w:rPr>
             <w:rStyle w:val="Hyperlink"/>
@@ -8693,9 +8868,9 @@
         <w:t xml:space="preserve">.</w:t>
       </w:r>
     </w:p>
-    <w:bookmarkEnd w:id="53"/>
-    <w:bookmarkEnd w:id="54"/>
-    <w:bookmarkStart w:id="64" w:name="sec-minimizers"/>
+    <w:bookmarkEnd w:id="57"/>
+    <w:bookmarkEnd w:id="58"/>
+    <w:bookmarkStart w:id="68" w:name="sec-minimizers"/>
     <w:p>
       <w:pPr>
         <w:pStyle w:val="Heading2"/>
@@ -8704,7 +8879,7 @@
         <w:t xml:space="preserve">5 Global and local minimizers</w:t>
       </w:r>
     </w:p>
-    <w:bookmarkStart w:id="55" w:name="exr-local-vs-global-min"/>
+    <w:bookmarkStart w:id="59" w:name="exr-local-vs-global-min"/>
     <w:p>
       <w:pPr>
         <w:pStyle w:val="FirstParagraph"/>
@@ -9214,8 +9389,8 @@
         <w:t xml:space="preserve">?</w:t>
       </w:r>
     </w:p>
-    <w:bookmarkEnd w:id="55"/>
-    <w:bookmarkStart w:id="56" w:name="sol-local-vs-global-min"/>
+    <w:bookmarkEnd w:id="59"/>
+    <w:bookmarkStart w:id="60" w:name="sol-local-vs-global-min"/>
     <w:p>
       <w:pPr>
         <w:pStyle w:val="FirstParagraph"/>
@@ -10795,8 +10970,8 @@
         <w:t xml:space="preserve">.</w:t>
       </w:r>
     </w:p>
-    <w:bookmarkEnd w:id="56"/>
-    <w:bookmarkStart w:id="57" w:name="def-global-minimizer"/>
+    <w:bookmarkEnd w:id="60"/>
+    <w:bookmarkStart w:id="61" w:name="def-global-minimizer"/>
     <w:p>
       <w:pPr>
         <w:pStyle w:val="FirstParagraph"/>
@@ -10806,7 +10981,7 @@
           <w:b/>
           <w:bCs/>
         </w:rPr>
-        <w:t xml:space="preserve">Definition 12 (Global minimizer)</w:t>
+        <w:t xml:space="preserve">Definition 16 (Global minimizer)</w:t>
       </w:r>
       <w:r>
         <w:t xml:space="preserve"> </w:t>
@@ -10889,7 +11064,7 @@
       <w:r>
         <w:t xml:space="preserve"> </w:t>
       </w:r>
-      <w:hyperlink r:id="rId47">
+      <w:hyperlink r:id="rId51">
         <w:r>
           <w:rPr>
             <w:rStyle w:val="Hyperlink"/>
@@ -11071,8 +11246,8 @@
         <w:t xml:space="preserve">.</w:t>
       </w:r>
     </w:p>
-    <w:bookmarkEnd w:id="57"/>
-    <w:bookmarkStart w:id="58" w:name="rem-global-minimizer-argmin"/>
+    <w:bookmarkEnd w:id="61"/>
+    <w:bookmarkStart w:id="62" w:name="rem-global-minimizer-argmin"/>
     <w:p>
       <w:pPr>
         <w:pStyle w:val="BodyText"/>
@@ -11168,7 +11343,7 @@
           <w:rPr>
             <w:rStyle w:val="Hyperlink"/>
           </w:rPr>
-          <w:t xml:space="preserve">Definition 10</w:t>
+          <w:t xml:space="preserve">Definition 14</w:t>
         </w:r>
       </w:hyperlink>
       <w:r>
@@ -11567,8 +11742,8 @@
         <w:t xml:space="preserve">.</w:t>
       </w:r>
     </w:p>
-    <w:bookmarkEnd w:id="58"/>
-    <w:bookmarkStart w:id="60" w:name="def-local-minimizer"/>
+    <w:bookmarkEnd w:id="62"/>
+    <w:bookmarkStart w:id="64" w:name="def-local-minimizer"/>
     <w:p>
       <w:pPr>
         <w:pStyle w:val="BodyText"/>
@@ -11578,7 +11753,7 @@
           <w:b/>
           <w:bCs/>
         </w:rPr>
-        <w:t xml:space="preserve">Definition 13 (Local minimizer)</w:t>
+        <w:t xml:space="preserve">Definition 17 (Local minimizer)</w:t>
       </w:r>
       <w:r>
         <w:t xml:space="preserve"> </w:t>
@@ -11661,7 +11836,7 @@
       <w:r>
         <w:t xml:space="preserve"> </w:t>
       </w:r>
-      <w:hyperlink r:id="rId47">
+      <w:hyperlink r:id="rId51">
         <w:r>
           <w:rPr>
             <w:rStyle w:val="Hyperlink"/>
@@ -11953,7 +12128,7 @@
       <w:r>
         <w:t xml:space="preserve"> </w:t>
       </w:r>
-      <w:hyperlink r:id="rId59">
+      <w:hyperlink r:id="rId63">
         <w:r>
           <w:rPr>
             <w:rStyle w:val="Hyperlink"/>
@@ -11965,8 +12140,8 @@
         <w:t xml:space="preserve">.</w:t>
       </w:r>
     </w:p>
-    <w:bookmarkEnd w:id="60"/>
-    <w:bookmarkStart w:id="62" w:name="rem-local-minimizer"/>
+    <w:bookmarkEnd w:id="64"/>
+    <w:bookmarkStart w:id="66" w:name="rem-local-minimizer"/>
     <w:p>
       <w:pPr>
         <w:pStyle w:val="BodyText"/>
@@ -12255,7 +12430,7 @@
           <w:rPr>
             <w:rStyle w:val="Hyperlink"/>
           </w:rPr>
-          <w:t xml:space="preserve">Definition 12</w:t>
+          <w:t xml:space="preserve">Definition 16</w:t>
         </w:r>
       </w:hyperlink>
       <w:r>
@@ -12407,7 +12582,7 @@
       <w:r>
         <w:t xml:space="preserve"> </w:t>
       </w:r>
-      <w:hyperlink r:id="rId61">
+      <w:hyperlink r:id="rId65">
         <w:r>
           <w:rPr>
             <w:rStyle w:val="Hyperlink"/>
@@ -12562,8 +12737,8 @@
         <w:t xml:space="preserve">but not a global one.</w:t>
       </w:r>
     </w:p>
-    <w:bookmarkEnd w:id="62"/>
-    <w:bookmarkStart w:id="63" w:name="exm-not-local-minimizer"/>
+    <w:bookmarkEnd w:id="66"/>
+    <w:bookmarkStart w:id="67" w:name="exm-not-local-minimizer"/>
     <w:p>
       <w:pPr>
         <w:pStyle w:val="BodyText"/>
@@ -13986,8 +14161,8 @@
         </m:oMath>
       </m:oMathPara>
     </w:p>
-    <w:bookmarkEnd w:id="63"/>
-    <w:bookmarkEnd w:id="64"/>
+    <w:bookmarkEnd w:id="67"/>
+    <w:bookmarkEnd w:id="68"/>
     <w:sectPr>
       <w:footnotePr>
         <w:numRestart w:val="eachSect"/>

</xml_diff>

<commit_message>
Deploying to gh-pages from @ Morrison-Lab/mds@46db5c00f7ccf98d4eec0a47e38f4a358b0a8d5a 🚀
</commit_message>
<xml_diff>
--- a/algebra-basics.docx
+++ b/algebra-basics.docx
@@ -15,7 +15,7 @@
         <w:pStyle w:val="Date"/>
       </w:pPr>
       <w:r>
-        <w:t xml:space="preserve">Last modified: 2026-10-15 17:47:31 (PDT)</w:t>
+        <w:t xml:space="preserve">Last modified: 2026-10-15 18:37:38 (PDT)</w:t>
       </w:r>
     </w:p>
     <w:bookmarkStart w:id="18" w:name="equalities"/>
@@ -4653,16 +4653,511 @@
     </w:p>
     <w:bookmarkEnd w:id="42"/>
     <w:bookmarkEnd w:id="43"/>
-    <w:bookmarkStart w:id="58" w:name="sec-min-max"/>
+    <w:bookmarkStart w:id="47" w:name="sec-percent"/>
     <w:p>
       <w:pPr>
         <w:pStyle w:val="Heading2"/>
       </w:pPr>
       <w:r>
-        <w:t xml:space="preserve">4 Minimum, maximum, argmin and argmax</w:t>
+        <w:t xml:space="preserve">4 Percent</w:t>
       </w:r>
     </w:p>
-    <w:bookmarkStart w:id="44" w:name="exr-min-and-argmin"/>
+    <w:p>
+      <w:pPr>
+        <w:pStyle w:val="FirstParagraph"/>
+      </w:pPr>
+      <w:r>
+        <w:t xml:space="preserve">The word</w:t>
+      </w:r>
+      <w:r>
+        <w:t xml:space="preserve"> </w:t>
+      </w:r>
+      <w:r>
+        <w:t xml:space="preserve">“percent”</w:t>
+      </w:r>
+      <w:r>
+        <w:t xml:space="preserve"> </w:t>
+      </w:r>
+      <w:r>
+        <w:t xml:space="preserve">comes from the Latin</w:t>
+      </w:r>
+      <w:r>
+        <w:t xml:space="preserve"> </w:t>
+      </w:r>
+      <w:r>
+        <w:t xml:space="preserve">“per centum”</w:t>
+      </w:r>
+      <w:r>
+        <w:t xml:space="preserve">;</w:t>
+      </w:r>
+      <w:r>
+        <w:t xml:space="preserve"> </w:t>
+      </w:r>
+      <w:r>
+        <w:t xml:space="preserve">“centum”</w:t>
+      </w:r>
+      <w:r>
+        <w:t xml:space="preserve"> </w:t>
+      </w:r>
+      <w:r>
+        <w:t xml:space="preserve">is Latin for 100,</w:t>
+      </w:r>
+      <w:r>
+        <w:t xml:space="preserve"> </w:t>
+      </w:r>
+      <w:r>
+        <w:t xml:space="preserve">so</w:t>
+      </w:r>
+      <w:r>
+        <w:t xml:space="preserve"> </w:t>
+      </w:r>
+      <w:r>
+        <w:t xml:space="preserve">“percent”</w:t>
+      </w:r>
+      <w:r>
+        <w:t xml:space="preserve"> </w:t>
+      </w:r>
+      <w:r>
+        <w:t xml:space="preserve">means</w:t>
+      </w:r>
+      <w:r>
+        <w:t xml:space="preserve"> </w:t>
+      </w:r>
+      <w:r>
+        <w:t xml:space="preserve">“per hundred”</w:t>
+      </w:r>
+      <w:r>
+        <w:t xml:space="preserve"> </w:t>
+      </w:r>
+      <w:r>
+        <w:t xml:space="preserve">(cf. </w:t>
+      </w:r>
+      <w:hyperlink r:id="rId44">
+        <w:r>
+          <w:rPr>
+            <w:rStyle w:val="Hyperlink"/>
+          </w:rPr>
+          <w:t xml:space="preserve">https://en.wikipedia.org/wiki/Percentage</w:t>
+        </w:r>
+      </w:hyperlink>
+      <w:r>
+        <w:t xml:space="preserve">).</w:t>
+      </w:r>
+    </w:p>
+    <w:bookmarkStart w:id="45" w:name="def-percent"/>
+    <w:p>
+      <w:pPr>
+        <w:pStyle w:val="BodyText"/>
+      </w:pPr>
+      <w:r>
+        <w:rPr>
+          <w:b/>
+          <w:bCs/>
+        </w:rPr>
+        <w:t xml:space="preserve">Definition 12 (Percent)</w:t>
+      </w:r>
+      <w:r>
+        <w:t xml:space="preserve"> </w:t>
+      </w:r>
+      <w:r>
+        <w:t xml:space="preserve">For a real number</w:t>
+      </w:r>
+      <w:r>
+        <w:t xml:space="preserve"> </w:t>
+      </w:r>
+      <m:oMath>
+        <m:r>
+          <m:t>x</m:t>
+        </m:r>
+      </m:oMath>
+      <w:r>
+        <w:t xml:space="preserve">,</w:t>
+      </w:r>
+      <w:r>
+        <w:t xml:space="preserve"> </w:t>
+      </w:r>
+      <w:r>
+        <w:t xml:space="preserve">“</w:t>
+      </w:r>
+      <m:oMath>
+        <m:r>
+          <m:t>x</m:t>
+        </m:r>
+      </m:oMath>
+      <w:r>
+        <w:t xml:space="preserve"> </w:t>
+      </w:r>
+      <w:r>
+        <w:rPr>
+          <w:b/>
+          <w:bCs/>
+        </w:rPr>
+        <w:t xml:space="preserve">percent</w:t>
+      </w:r>
+      <w:r>
+        <w:t xml:space="preserve">”</w:t>
+      </w:r>
+      <w:r>
+        <w:t xml:space="preserve">, written</w:t>
+      </w:r>
+      <w:r>
+        <w:t xml:space="preserve"> </w:t>
+      </w:r>
+      <m:oMath>
+        <m:r>
+          <m:t>x</m:t>
+        </m:r>
+        <m:r>
+          <m:rPr>
+            <m:sty m:val="p"/>
+          </m:rPr>
+          <m:t>%</m:t>
+        </m:r>
+      </m:oMath>
+      <w:r>
+        <w:t xml:space="preserve">, means</w:t>
+      </w:r>
+      <w:r>
+        <w:t xml:space="preserve"> </w:t>
+      </w:r>
+      <m:oMath>
+        <m:r>
+          <m:t>x</m:t>
+        </m:r>
+        <m:r>
+          <m:rPr>
+            <m:sty m:val="p"/>
+          </m:rPr>
+          <m:t>/</m:t>
+        </m:r>
+        <m:r>
+          <m:t>100</m:t>
+        </m:r>
+      </m:oMath>
+      <w:r>
+        <w:t xml:space="preserve">:</w:t>
+      </w:r>
+    </w:p>
+    <w:p>
+      <w:pPr>
+        <w:pStyle w:val="BodyText"/>
+      </w:pPr>
+      <m:oMathPara>
+        <m:oMathParaPr>
+          <m:jc m:val="center"/>
+        </m:oMathParaPr>
+        <m:oMath>
+          <m:r>
+            <m:t>x</m:t>
+          </m:r>
+          <m:r>
+            <m:rPr>
+              <m:sty m:val="p"/>
+            </m:rPr>
+            <m:t>%</m:t>
+          </m:r>
+          <m:limUpp>
+            <m:e>
+              <m:r>
+                <m:rPr>
+                  <m:sty m:val="p"/>
+                </m:rPr>
+                <m:t>=</m:t>
+              </m:r>
+            </m:e>
+            <m:lim>
+              <m:r>
+                <m:rPr>
+                  <m:nor/>
+                  <m:sty m:val="p"/>
+                </m:rPr>
+                <m:t>def</m:t>
+              </m:r>
+            </m:lim>
+          </m:limUpp>
+          <m:f>
+            <m:fPr>
+              <m:type m:val="bar"/>
+            </m:fPr>
+            <m:num>
+              <m:r>
+                <m:t>x</m:t>
+              </m:r>
+            </m:num>
+            <m:den>
+              <m:r>
+                <m:t>100</m:t>
+              </m:r>
+            </m:den>
+          </m:f>
+        </m:oMath>
+      </m:oMathPara>
+    </w:p>
+    <w:p>
+      <w:pPr>
+        <w:pStyle w:val="FirstParagraph"/>
+      </w:pPr>
+      <w:r>
+        <w:t xml:space="preserve">The percent sign</w:t>
+      </w:r>
+      <w:r>
+        <w:t xml:space="preserve"> </w:t>
+      </w:r>
+      <w:r>
+        <w:t xml:space="preserve">“%”</w:t>
+      </w:r>
+      <w:r>
+        <w:t xml:space="preserve"> </w:t>
+      </w:r>
+      <w:r>
+        <w:t xml:space="preserve">is a shorthand for</w:t>
+      </w:r>
+      <w:r>
+        <w:t xml:space="preserve"> </w:t>
+      </w:r>
+      <w:r>
+        <w:t xml:space="preserve">“</w:t>
+      </w:r>
+      <m:oMath>
+        <m:r>
+          <m:rPr>
+            <m:sty m:val="p"/>
+          </m:rPr>
+          <m:t>/</m:t>
+        </m:r>
+        <m:r>
+          <m:t>100</m:t>
+        </m:r>
+      </m:oMath>
+      <w:r>
+        <w:t xml:space="preserve">”</w:t>
+      </w:r>
+      <w:r>
+        <w:t xml:space="preserve">.</w:t>
+      </w:r>
+    </w:p>
+    <w:bookmarkEnd w:id="45"/>
+    <w:bookmarkStart w:id="46" w:name="exm-percent"/>
+    <w:p>
+      <w:pPr>
+        <w:pStyle w:val="BodyText"/>
+      </w:pPr>
+      <w:r>
+        <w:rPr>
+          <w:b/>
+          <w:bCs/>
+        </w:rPr>
+        <w:t xml:space="preserve">Example 7 (Ten percent is one tenth)</w:t>
+      </w:r>
+      <w:r>
+        <w:t xml:space="preserve"> </w:t>
+      </w:r>
+      <w:r>
+        <w:t xml:space="preserve">Contrary to what you may have learned previously,</w:t>
+      </w:r>
+      <w:r>
+        <w:t xml:space="preserve"> </w:t>
+      </w:r>
+      <w:r>
+        <w:t xml:space="preserve">the equality</w:t>
+      </w:r>
+      <w:r>
+        <w:t xml:space="preserve"> </w:t>
+      </w:r>
+      <m:oMath>
+        <m:r>
+          <m:t>10</m:t>
+        </m:r>
+        <m:r>
+          <m:rPr>
+            <m:sty m:val="p"/>
+          </m:rPr>
+          <m:t>%</m:t>
+        </m:r>
+        <m:r>
+          <m:rPr>
+            <m:sty m:val="p"/>
+          </m:rPr>
+          <m:t>=</m:t>
+        </m:r>
+        <m:r>
+          <m:t>0.1</m:t>
+        </m:r>
+      </m:oMath>
+      <w:r>
+        <w:t xml:space="preserve"> </w:t>
+      </w:r>
+      <w:r>
+        <w:t xml:space="preserve">is true and correct,</w:t>
+      </w:r>
+      <w:r>
+        <w:t xml:space="preserve"> </w:t>
+      </w:r>
+      <w:r>
+        <w:t xml:space="preserve">just as</w:t>
+      </w:r>
+      <w:r>
+        <w:t xml:space="preserve"> </w:t>
+      </w:r>
+      <m:oMath>
+        <m:r>
+          <m:t>10</m:t>
+        </m:r>
+        <m:r>
+          <m:rPr>
+            <m:nor/>
+            <m:sty m:val="p"/>
+          </m:rPr>
+          <m:t>kg</m:t>
+        </m:r>
+        <m:r>
+          <m:rPr>
+            <m:sty m:val="p"/>
+          </m:rPr>
+          <m:t>=</m:t>
+        </m:r>
+        <m:r>
+          <m:t>10</m:t>
+        </m:r>
+        <m:r>
+          <m:rPr>
+            <m:sty m:val="p"/>
+          </m:rPr>
+          <m:t>,</m:t>
+        </m:r>
+        <m:r>
+          <m:t>000</m:t>
+        </m:r>
+        <m:r>
+          <m:rPr>
+            <m:nor/>
+            <m:sty m:val="p"/>
+          </m:rPr>
+          <m:t>g</m:t>
+        </m:r>
+      </m:oMath>
+      <w:r>
+        <w:t xml:space="preserve"> </w:t>
+      </w:r>
+      <w:r>
+        <w:t xml:space="preserve">is true and correct:</w:t>
+      </w:r>
+    </w:p>
+    <w:p>
+      <w:pPr>
+        <w:pStyle w:val="BodyText"/>
+      </w:pPr>
+      <m:oMathPara>
+        <m:oMathParaPr>
+          <m:jc m:val="center"/>
+        </m:oMathParaPr>
+        <m:oMath>
+          <m:eqArr>
+            <m:e>
+              <m:r>
+                <m:t>10</m:t>
+              </m:r>
+              <m:r>
+                <m:rPr>
+                  <m:sty m:val="p"/>
+                </m:rPr>
+                <m:t>%</m:t>
+              </m:r>
+              <m:r>
+                <m:t>&amp;</m:t>
+              </m:r>
+              <m:r>
+                <m:rPr>
+                  <m:sty m:val="p"/>
+                </m:rPr>
+                <m:t>=</m:t>
+              </m:r>
+              <m:f>
+                <m:fPr>
+                  <m:type m:val="bar"/>
+                </m:fPr>
+                <m:num>
+                  <m:r>
+                    <m:t>10</m:t>
+                  </m:r>
+                </m:num>
+                <m:den>
+                  <m:r>
+                    <m:t>100</m:t>
+                  </m:r>
+                </m:den>
+              </m:f>
+              <m:r>
+                <m:t>&amp;</m:t>
+              </m:r>
+              <m:r>
+                <m:t>&amp;</m:t>
+              </m:r>
+              <m:r>
+                <m:rPr>
+                  <m:nor/>
+                  <m:sty m:val="p"/>
+                </m:rPr>
+                <m:t>(definition of percent)</m:t>
+              </m:r>
+            </m:e>
+            <m:e>
+              <m:r>
+                <m:t>&amp;</m:t>
+              </m:r>
+              <m:r>
+                <m:rPr>
+                  <m:sty m:val="p"/>
+                </m:rPr>
+                <m:t>=</m:t>
+              </m:r>
+              <m:r>
+                <m:t>0.1</m:t>
+              </m:r>
+              <m:r>
+                <m:t>&amp;</m:t>
+              </m:r>
+              <m:r>
+                <m:t>&amp;</m:t>
+              </m:r>
+              <m:r>
+                <m:rPr>
+                  <m:nor/>
+                  <m:sty m:val="p"/>
+                </m:rPr>
+                <m:t>(divide)</m:t>
+              </m:r>
+            </m:e>
+          </m:eqArr>
+        </m:oMath>
+      </m:oMathPara>
+    </w:p>
+    <w:bookmarkEnd w:id="46"/>
+    <w:p>
+      <w:pPr>
+        <w:pStyle w:val="FirstParagraph"/>
+      </w:pPr>
+      <w:r>
+        <w:t xml:space="preserve">You are welcome to switch between decimal and percent notation freely;</w:t>
+      </w:r>
+      <w:r>
+        <w:t xml:space="preserve"> </w:t>
+      </w:r>
+      <w:r>
+        <w:t xml:space="preserve">just make sure you execute it correctly.</w:t>
+      </w:r>
+    </w:p>
+    <w:bookmarkEnd w:id="47"/>
+    <w:bookmarkStart w:id="62" w:name="sec-min-max"/>
+    <w:p>
+      <w:pPr>
+        <w:pStyle w:val="Heading2"/>
+      </w:pPr>
+      <w:r>
+        <w:t xml:space="preserve">5 Minimum, maximum, argmin and argmax</w:t>
+      </w:r>
+    </w:p>
+    <w:bookmarkStart w:id="48" w:name="exr-min-and-argmin"/>
     <w:p>
       <w:pPr>
         <w:pStyle w:val="FirstParagraph"/>
@@ -5026,8 +5521,8 @@
         <w:t xml:space="preserve">does it take that value?</w:t>
       </w:r>
     </w:p>
-    <w:bookmarkEnd w:id="44"/>
-    <w:bookmarkStart w:id="45" w:name="sol-min-and-argmin"/>
+    <w:bookmarkEnd w:id="48"/>
+    <w:bookmarkStart w:id="49" w:name="sol-min-and-argmin"/>
     <w:p>
       <w:pPr>
         <w:pStyle w:val="FirstParagraph"/>
@@ -5755,8 +6250,8 @@
         <w:t xml:space="preserve">not a single number.</w:t>
       </w:r>
     </w:p>
-    <w:bookmarkEnd w:id="45"/>
-    <w:bookmarkStart w:id="46" w:name="def-minimum"/>
+    <w:bookmarkEnd w:id="49"/>
+    <w:bookmarkStart w:id="50" w:name="def-minimum"/>
     <w:p>
       <w:pPr>
         <w:pStyle w:val="FirstParagraph"/>
@@ -5766,7 +6261,7 @@
           <w:b/>
           <w:bCs/>
         </w:rPr>
-        <w:t xml:space="preserve">Definition 12 (Minimum)</w:t>
+        <w:t xml:space="preserve">Definition 13 (Minimum)</w:t>
       </w:r>
       <w:r>
         <w:t xml:space="preserve"> </w:t>
@@ -5941,8 +6436,8 @@
         <w:t xml:space="preserve">.</w:t>
       </w:r>
     </w:p>
-    <w:bookmarkEnd w:id="46"/>
-    <w:bookmarkStart w:id="48" w:name="rem-minimum-may-not-exist"/>
+    <w:bookmarkEnd w:id="50"/>
+    <w:bookmarkStart w:id="52" w:name="rem-minimum-may-not-exist"/>
     <w:p>
       <w:pPr>
         <w:pStyle w:val="BodyText"/>
@@ -6028,7 +6523,7 @@
       <w:r>
         <w:t xml:space="preserve"> </w:t>
       </w:r>
-      <w:hyperlink r:id="rId47">
+      <w:hyperlink r:id="rId51">
         <w:r>
           <w:rPr>
             <w:rStyle w:val="Hyperlink"/>
@@ -6164,8 +6659,8 @@
         <w:t xml:space="preserve">, also in it.</w:t>
       </w:r>
     </w:p>
-    <w:bookmarkEnd w:id="48"/>
-    <w:bookmarkStart w:id="49" w:name="def-maximum"/>
+    <w:bookmarkEnd w:id="52"/>
+    <w:bookmarkStart w:id="53" w:name="def-maximum"/>
     <w:p>
       <w:pPr>
         <w:pStyle w:val="BodyText"/>
@@ -6175,7 +6670,7 @@
           <w:b/>
           <w:bCs/>
         </w:rPr>
-        <w:t xml:space="preserve">Definition 13 (Maximum)</w:t>
+        <w:t xml:space="preserve">Definition 14 (Maximum)</w:t>
       </w:r>
       <w:r>
         <w:t xml:space="preserve"> </w:t>
@@ -6350,8 +6845,8 @@
         <w:t xml:space="preserve">.</w:t>
       </w:r>
     </w:p>
-    <w:bookmarkEnd w:id="49"/>
-    <w:bookmarkStart w:id="50" w:name="exm-maximum"/>
+    <w:bookmarkEnd w:id="53"/>
+    <w:bookmarkStart w:id="54" w:name="exm-maximum"/>
     <w:p>
       <w:pPr>
         <w:pStyle w:val="BodyText"/>
@@ -6361,7 +6856,7 @@
           <w:b/>
           <w:bCs/>
         </w:rPr>
-        <w:t xml:space="preserve">Example 7 (A maximum, and a set without one)</w:t>
+        <w:t xml:space="preserve">Example 8 (A maximum, and a set without one)</w:t>
       </w:r>
       <w:r>
         <w:t xml:space="preserve"> </w:t>
@@ -6805,8 +7300,8 @@
         <w:t xml:space="preserve">is at least as large as every element.</w:t>
       </w:r>
     </w:p>
-    <w:bookmarkEnd w:id="50"/>
-    <w:bookmarkStart w:id="52" w:name="def-argmin"/>
+    <w:bookmarkEnd w:id="54"/>
+    <w:bookmarkStart w:id="56" w:name="def-argmin"/>
     <w:p>
       <w:pPr>
         <w:pStyle w:val="FirstParagraph"/>
@@ -6816,7 +7311,7 @@
           <w:b/>
           <w:bCs/>
         </w:rPr>
-        <w:t xml:space="preserve">Definition 14 (Argmin)</w:t>
+        <w:t xml:space="preserve">Definition 15 (Argmin)</w:t>
       </w:r>
       <w:r>
         <w:t xml:space="preserve"> </w:t>
@@ -6863,7 +7358,7 @@
       <w:r>
         <w:t xml:space="preserve"> </w:t>
       </w:r>
-      <w:hyperlink r:id="rId51">
+      <w:hyperlink r:id="rId55">
         <w:r>
           <w:rPr>
             <w:rStyle w:val="Hyperlink"/>
@@ -7225,8 +7720,8 @@
         <w:t xml:space="preserve">.</w:t>
       </w:r>
     </w:p>
-    <w:bookmarkEnd w:id="52"/>
-    <w:bookmarkStart w:id="54" w:name="rem-argmin-vs-minimum"/>
+    <w:bookmarkEnd w:id="56"/>
+    <w:bookmarkStart w:id="58" w:name="rem-argmin-vs-minimum"/>
     <w:p>
       <w:pPr>
         <w:pStyle w:val="BodyText"/>
@@ -7287,7 +7782,7 @@
           <w:rPr>
             <w:rStyle w:val="Hyperlink"/>
           </w:rPr>
-          <w:t xml:space="preserve">Definition 12</w:t>
+          <w:t xml:space="preserve">Definition 13</w:t>
         </w:r>
       </w:hyperlink>
       <w:r>
@@ -7302,7 +7797,7 @@
       <w:r>
         <w:t xml:space="preserve"> </w:t>
       </w:r>
-      <w:hyperlink r:id="rId53">
+      <w:hyperlink r:id="rId57">
         <w:r>
           <w:rPr>
             <w:rStyle w:val="Hyperlink"/>
@@ -7754,8 +8249,8 @@
         <w:t xml:space="preserve">.</w:t>
       </w:r>
     </w:p>
-    <w:bookmarkEnd w:id="54"/>
-    <w:bookmarkStart w:id="55" w:name="def-argmax"/>
+    <w:bookmarkEnd w:id="58"/>
+    <w:bookmarkStart w:id="59" w:name="def-argmax"/>
     <w:p>
       <w:pPr>
         <w:pStyle w:val="BodyText"/>
@@ -7765,7 +8260,7 @@
           <w:b/>
           <w:bCs/>
         </w:rPr>
-        <w:t xml:space="preserve">Definition 15 (Argmax)</w:t>
+        <w:t xml:space="preserve">Definition 16 (Argmax)</w:t>
       </w:r>
       <w:r>
         <w:t xml:space="preserve"> </w:t>
@@ -7812,7 +8307,7 @@
       <w:r>
         <w:t xml:space="preserve"> </w:t>
       </w:r>
-      <w:hyperlink r:id="rId51">
+      <w:hyperlink r:id="rId55">
         <w:r>
           <w:rPr>
             <w:rStyle w:val="Hyperlink"/>
@@ -8174,8 +8669,8 @@
         <w:t xml:space="preserve">.</w:t>
       </w:r>
     </w:p>
-    <w:bookmarkEnd w:id="55"/>
-    <w:bookmarkStart w:id="57" w:name="exm-argmax"/>
+    <w:bookmarkEnd w:id="59"/>
+    <w:bookmarkStart w:id="61" w:name="exm-argmax"/>
     <w:p>
       <w:pPr>
         <w:pStyle w:val="BodyText"/>
@@ -8185,7 +8680,7 @@
           <w:b/>
           <w:bCs/>
         </w:rPr>
-        <w:t xml:space="preserve">Example 8 (An argmax with two points, and an empty one)</w:t>
+        <w:t xml:space="preserve">Example 9 (An argmax with two points, and an empty one)</w:t>
       </w:r>
       <w:r>
         <w:t xml:space="preserve"> </w:t>
@@ -8712,7 +9207,7 @@
           <w:rPr>
             <w:rStyle w:val="Hyperlink"/>
           </w:rPr>
-          <w:t xml:space="preserve">Example 7</w:t>
+          <w:t xml:space="preserve">Example 8</w:t>
         </w:r>
       </w:hyperlink>
       <w:r>
@@ -8856,7 +9351,7 @@
       <w:r>
         <w:t xml:space="preserve"> </w:t>
       </w:r>
-      <w:hyperlink r:id="rId56">
+      <w:hyperlink r:id="rId60">
         <w:r>
           <w:rPr>
             <w:rStyle w:val="Hyperlink"/>
@@ -8868,18 +9363,18 @@
         <w:t xml:space="preserve">.</w:t>
       </w:r>
     </w:p>
-    <w:bookmarkEnd w:id="57"/>
-    <w:bookmarkEnd w:id="58"/>
-    <w:bookmarkStart w:id="68" w:name="sec-minimizers"/>
+    <w:bookmarkEnd w:id="61"/>
+    <w:bookmarkEnd w:id="62"/>
+    <w:bookmarkStart w:id="72" w:name="sec-minimizers"/>
     <w:p>
       <w:pPr>
         <w:pStyle w:val="Heading2"/>
       </w:pPr>
       <w:r>
-        <w:t xml:space="preserve">5 Global and local minimizers</w:t>
+        <w:t xml:space="preserve">6 Global and local minimizers</w:t>
       </w:r>
     </w:p>
-    <w:bookmarkStart w:id="59" w:name="exr-local-vs-global-min"/>
+    <w:bookmarkStart w:id="63" w:name="exr-local-vs-global-min"/>
     <w:p>
       <w:pPr>
         <w:pStyle w:val="FirstParagraph"/>
@@ -9389,8 +9884,8 @@
         <w:t xml:space="preserve">?</w:t>
       </w:r>
     </w:p>
-    <w:bookmarkEnd w:id="59"/>
-    <w:bookmarkStart w:id="60" w:name="sol-local-vs-global-min"/>
+    <w:bookmarkEnd w:id="63"/>
+    <w:bookmarkStart w:id="64" w:name="sol-local-vs-global-min"/>
     <w:p>
       <w:pPr>
         <w:pStyle w:val="FirstParagraph"/>
@@ -10970,8 +11465,8 @@
         <w:t xml:space="preserve">.</w:t>
       </w:r>
     </w:p>
-    <w:bookmarkEnd w:id="60"/>
-    <w:bookmarkStart w:id="61" w:name="def-global-minimizer"/>
+    <w:bookmarkEnd w:id="64"/>
+    <w:bookmarkStart w:id="65" w:name="def-global-minimizer"/>
     <w:p>
       <w:pPr>
         <w:pStyle w:val="FirstParagraph"/>
@@ -10981,7 +11476,7 @@
           <w:b/>
           <w:bCs/>
         </w:rPr>
-        <w:t xml:space="preserve">Definition 16 (Global minimizer)</w:t>
+        <w:t xml:space="preserve">Definition 17 (Global minimizer)</w:t>
       </w:r>
       <w:r>
         <w:t xml:space="preserve"> </w:t>
@@ -11064,7 +11559,7 @@
       <w:r>
         <w:t xml:space="preserve"> </w:t>
       </w:r>
-      <w:hyperlink r:id="rId51">
+      <w:hyperlink r:id="rId55">
         <w:r>
           <w:rPr>
             <w:rStyle w:val="Hyperlink"/>
@@ -11246,8 +11741,8 @@
         <w:t xml:space="preserve">.</w:t>
       </w:r>
     </w:p>
-    <w:bookmarkEnd w:id="61"/>
-    <w:bookmarkStart w:id="62" w:name="rem-global-minimizer-argmin"/>
+    <w:bookmarkEnd w:id="65"/>
+    <w:bookmarkStart w:id="66" w:name="rem-global-minimizer-argmin"/>
     <w:p>
       <w:pPr>
         <w:pStyle w:val="BodyText"/>
@@ -11343,7 +11838,7 @@
           <w:rPr>
             <w:rStyle w:val="Hyperlink"/>
           </w:rPr>
-          <w:t xml:space="preserve">Definition 14</w:t>
+          <w:t xml:space="preserve">Definition 15</w:t>
         </w:r>
       </w:hyperlink>
       <w:r>
@@ -11742,8 +12237,8 @@
         <w:t xml:space="preserve">.</w:t>
       </w:r>
     </w:p>
-    <w:bookmarkEnd w:id="62"/>
-    <w:bookmarkStart w:id="64" w:name="def-local-minimizer"/>
+    <w:bookmarkEnd w:id="66"/>
+    <w:bookmarkStart w:id="68" w:name="def-local-minimizer"/>
     <w:p>
       <w:pPr>
         <w:pStyle w:val="BodyText"/>
@@ -11753,7 +12248,7 @@
           <w:b/>
           <w:bCs/>
         </w:rPr>
-        <w:t xml:space="preserve">Definition 17 (Local minimizer)</w:t>
+        <w:t xml:space="preserve">Definition 18 (Local minimizer)</w:t>
       </w:r>
       <w:r>
         <w:t xml:space="preserve"> </w:t>
@@ -11836,7 +12331,7 @@
       <w:r>
         <w:t xml:space="preserve"> </w:t>
       </w:r>
-      <w:hyperlink r:id="rId51">
+      <w:hyperlink r:id="rId55">
         <w:r>
           <w:rPr>
             <w:rStyle w:val="Hyperlink"/>
@@ -12128,7 +12623,7 @@
       <w:r>
         <w:t xml:space="preserve"> </w:t>
       </w:r>
-      <w:hyperlink r:id="rId63">
+      <w:hyperlink r:id="rId67">
         <w:r>
           <w:rPr>
             <w:rStyle w:val="Hyperlink"/>
@@ -12140,8 +12635,8 @@
         <w:t xml:space="preserve">.</w:t>
       </w:r>
     </w:p>
-    <w:bookmarkEnd w:id="64"/>
-    <w:bookmarkStart w:id="66" w:name="rem-local-minimizer"/>
+    <w:bookmarkEnd w:id="68"/>
+    <w:bookmarkStart w:id="70" w:name="rem-local-minimizer"/>
     <w:p>
       <w:pPr>
         <w:pStyle w:val="BodyText"/>
@@ -12430,7 +12925,7 @@
           <w:rPr>
             <w:rStyle w:val="Hyperlink"/>
           </w:rPr>
-          <w:t xml:space="preserve">Definition 16</w:t>
+          <w:t xml:space="preserve">Definition 17</w:t>
         </w:r>
       </w:hyperlink>
       <w:r>
@@ -12582,7 +13077,7 @@
       <w:r>
         <w:t xml:space="preserve"> </w:t>
       </w:r>
-      <w:hyperlink r:id="rId65">
+      <w:hyperlink r:id="rId69">
         <w:r>
           <w:rPr>
             <w:rStyle w:val="Hyperlink"/>
@@ -12737,8 +13232,8 @@
         <w:t xml:space="preserve">but not a global one.</w:t>
       </w:r>
     </w:p>
-    <w:bookmarkEnd w:id="66"/>
-    <w:bookmarkStart w:id="67" w:name="exm-not-local-minimizer"/>
+    <w:bookmarkEnd w:id="70"/>
+    <w:bookmarkStart w:id="71" w:name="exm-not-local-minimizer"/>
     <w:p>
       <w:pPr>
         <w:pStyle w:val="BodyText"/>
@@ -12748,7 +13243,7 @@
           <w:b/>
           <w:bCs/>
         </w:rPr>
-        <w:t xml:space="preserve">Example 9 (A point that is not a local minimizer)</w:t>
+        <w:t xml:space="preserve">Example 10 (A point that is not a local minimizer)</w:t>
       </w:r>
       <w:r>
         <w:t xml:space="preserve"> </w:t>
@@ -14161,8 +14656,8 @@
         </m:oMath>
       </m:oMathPara>
     </w:p>
-    <w:bookmarkEnd w:id="67"/>
-    <w:bookmarkEnd w:id="68"/>
+    <w:bookmarkEnd w:id="71"/>
+    <w:bookmarkEnd w:id="72"/>
     <w:sectPr>
       <w:footnotePr>
         <w:numRestart w:val="eachSect"/>

</xml_diff>

<commit_message>
Deploying to gh-pages from @ Morrison-Lab/mds@7d325c86b2a51771c144f9e0bf8ba6ebbba65ea0 🚀
</commit_message>
<xml_diff>
--- a/algebra-basics.docx
+++ b/algebra-basics.docx
@@ -15,7 +15,7 @@
         <w:pStyle w:val="Date"/>
       </w:pPr>
       <w:r>
-        <w:t xml:space="preserve">Last modified: 2026-10-17 22:01:17 (PDT)</w:t>
+        <w:t xml:space="preserve">Last modified: 2026-10-18 11:27:44 (PDT)</w:t>
       </w:r>
     </w:p>
     <w:bookmarkStart w:id="18" w:name="equalities"/>
@@ -191,7 +191,7 @@
         <w:t xml:space="preserve"> </w:t>
       </w:r>
       <w:r>
-        <w:t xml:space="preserve">(Wikipedia contributors 2026i)</w:t>
+        <w:t xml:space="preserve">[1]</w:t>
       </w:r>
       <w:r>
         <w:t xml:space="preserve"> </w:t>
@@ -774,7 +774,7 @@
         <w:t xml:space="preserve"> </w:t>
       </w:r>
       <w:r>
-        <w:t xml:space="preserve">(Wikipedia contributors 2026d)</w:t>
+        <w:t xml:space="preserve">[2]</w:t>
       </w:r>
       <w:r>
         <w:t xml:space="preserve"> </w:t>
@@ -1259,7 +1259,7 @@
         <w:t xml:space="preserve"> </w:t>
       </w:r>
       <w:r>
-        <w:t xml:space="preserve">(Wikipedia contributors 2026e)</w:t>
+        <w:t xml:space="preserve">[3]</w:t>
       </w:r>
       <w:r>
         <w:t xml:space="preserve">.</w:t>
@@ -2202,7 +2202,7 @@
         <w:t xml:space="preserve"> </w:t>
       </w:r>
       <w:r>
-        <w:t xml:space="preserve">(Wikipedia contributors 2026c)</w:t>
+        <w:t xml:space="preserve">[4]</w:t>
       </w:r>
       <w:r>
         <w:t xml:space="preserve">:</w:t>
@@ -3426,7 +3426,7 @@
         <w:t xml:space="preserve"> </w:t>
       </w:r>
       <w:r>
-        <w:t xml:space="preserve">(Wikipedia contributors 2026h)</w:t>
+        <w:t xml:space="preserve">[5]</w:t>
       </w:r>
       <w:r>
         <w:t xml:space="preserve">,</w:t>
@@ -3824,7 +3824,7 @@
         <w:t xml:space="preserve"> </w:t>
       </w:r>
       <w:r>
-        <w:t xml:space="preserve">(Wikipedia contributors 2026a)</w:t>
+        <w:t xml:space="preserve">[6]</w:t>
       </w:r>
       <w:r>
         <w:t xml:space="preserve"> </w:t>
@@ -4766,7 +4766,7 @@
         <w:t xml:space="preserve"> </w:t>
       </w:r>
       <w:r>
-        <w:t xml:space="preserve">(Wikipedia contributors 2026g)</w:t>
+        <w:t xml:space="preserve">[7]</w:t>
       </w:r>
       <w:r>
         <w:t xml:space="preserve">.</w:t>
@@ -4866,7 +4866,7 @@
         <w:t xml:space="preserve"> </w:t>
       </w:r>
       <w:r>
-        <w:t xml:space="preserve">(Wikipedia contributors 2026g)</w:t>
+        <w:t xml:space="preserve">[7]</w:t>
       </w:r>
       <w:r>
         <w:t xml:space="preserve">:</w:t>
@@ -6375,7 +6375,7 @@
         <w:t xml:space="preserve"> </w:t>
       </w:r>
       <w:r>
-        <w:t xml:space="preserve">(Wikipedia contributors 2026f)</w:t>
+        <w:t xml:space="preserve">[8]</w:t>
       </w:r>
       <w:r>
         <w:t xml:space="preserve">,</w:t>
@@ -6790,7 +6790,7 @@
         <w:t xml:space="preserve"> </w:t>
       </w:r>
       <w:r>
-        <w:t xml:space="preserve">(Wikipedia contributors 2026f)</w:t>
+        <w:t xml:space="preserve">[8]</w:t>
       </w:r>
       <w:r>
         <w:t xml:space="preserve">,</w:t>
@@ -7463,7 +7463,7 @@
         <w:t xml:space="preserve"> </w:t>
       </w:r>
       <w:r>
-        <w:t xml:space="preserve">(Wikipedia contributors 2026b)</w:t>
+        <w:t xml:space="preserve">[9]</w:t>
       </w:r>
       <w:r>
         <w:t xml:space="preserve"> </w:t>
@@ -8418,7 +8418,7 @@
         <w:t xml:space="preserve"> </w:t>
       </w:r>
       <w:r>
-        <w:t xml:space="preserve">(Wikipedia contributors 2026b)</w:t>
+        <w:t xml:space="preserve">[9]</w:t>
       </w:r>
       <w:r>
         <w:t xml:space="preserve"> </w:t>
@@ -14733,7 +14733,7 @@
         </w:numPr>
       </w:pPr>
       <w:r>
-        <w:t xml:space="preserve">Wikipedia contributors (2026i)</w:t>
+        <w:t xml:space="preserve">Wikipedia contributors [1]</w:t>
       </w:r>
       <w:r>
         <w:t xml:space="preserve"> </w:t>
@@ -14750,7 +14750,7 @@
         </w:numPr>
       </w:pPr>
       <w:r>
-        <w:t xml:space="preserve">Wikipedia contributors (2026e)</w:t>
+        <w:t xml:space="preserve">Wikipedia contributors [3]</w:t>
       </w:r>
       <w:r>
         <w:t xml:space="preserve"> </w:t>
@@ -14767,7 +14767,7 @@
         </w:numPr>
       </w:pPr>
       <w:r>
-        <w:t xml:space="preserve">Wikipedia contributors (2026c)</w:t>
+        <w:t xml:space="preserve">Wikipedia contributors [4]</w:t>
       </w:r>
       <w:r>
         <w:t xml:space="preserve"> </w:t>
@@ -14784,7 +14784,7 @@
         </w:numPr>
       </w:pPr>
       <w:r>
-        <w:t xml:space="preserve">Wikipedia contributors (2026h)</w:t>
+        <w:t xml:space="preserve">Wikipedia contributors [5]</w:t>
       </w:r>
       <w:r>
         <w:t xml:space="preserve"> </w:t>
@@ -14801,7 +14801,7 @@
         </w:numPr>
       </w:pPr>
       <w:r>
-        <w:t xml:space="preserve">Wikipedia contributors (2026a)</w:t>
+        <w:t xml:space="preserve">Wikipedia contributors [6]</w:t>
       </w:r>
       <w:r>
         <w:t xml:space="preserve"> </w:t>
@@ -14818,7 +14818,7 @@
         </w:numPr>
       </w:pPr>
       <w:r>
-        <w:t xml:space="preserve">Wikipedia contributors (2026g)</w:t>
+        <w:t xml:space="preserve">Wikipedia contributors [7]</w:t>
       </w:r>
       <w:r>
         <w:t xml:space="preserve"> </w:t>
@@ -14835,7 +14835,7 @@
         </w:numPr>
       </w:pPr>
       <w:r>
-        <w:t xml:space="preserve">Wikipedia contributors (2026f)</w:t>
+        <w:t xml:space="preserve">Wikipedia contributors [8]</w:t>
       </w:r>
       <w:r>
         <w:t xml:space="preserve"> </w:t>
@@ -14852,7 +14852,7 @@
         </w:numPr>
       </w:pPr>
       <w:r>
-        <w:t xml:space="preserve">Wikipedia contributors (2026b)</w:t>
+        <w:t xml:space="preserve">Wikipedia contributors [9]</w:t>
       </w:r>
       <w:r>
         <w:t xml:space="preserve"> </w:t>
@@ -14869,7 +14869,7 @@
         </w:numPr>
       </w:pPr>
       <w:r>
-        <w:t xml:space="preserve">Wikipedia contributors (2026d)</w:t>
+        <w:t xml:space="preserve">Wikipedia contributors [2]</w:t>
       </w:r>
       <w:r>
         <w:t xml:space="preserve"> </w:t>
@@ -14879,66 +14879,339 @@
       </w:r>
     </w:p>
     <w:bookmarkStart w:id="90" w:name="refs"/>
-    <w:bookmarkStart w:id="73" w:name="ref-wikipedia_absolute_value"/>
+    <w:bookmarkStart w:id="73" w:name="ref-wikipedia_transitive_relation"/>
     <w:p>
       <w:pPr>
         <w:pStyle w:val="Bibliography"/>
       </w:pPr>
       <w:r>
-        <w:t xml:space="preserve">Wikipedia contributors. 2026a.</w:t>
-      </w:r>
-      <w:r>
-        <w:t xml:space="preserve"> </w:t>
-      </w:r>
-      <w:r>
-        <w:rPr>
-          <w:i/>
-          <w:iCs/>
-        </w:rPr>
-        <w:t xml:space="preserve">Absolute Value —</w:t>
-      </w:r>
-      <w:r>
-        <w:rPr>
-          <w:i/>
-          <w:iCs/>
-        </w:rPr>
-        <w:t xml:space="preserve"> </w:t>
-      </w:r>
-      <w:r>
-        <w:rPr>
-          <w:i/>
-          <w:iCs/>
-        </w:rPr>
+        <w:t xml:space="preserve">[1]</w:t>
+      </w:r>
+      <w:r>
+        <w:t xml:space="preserve"> </w:t>
+      </w:r>
+      <w:r>
+        <w:t xml:space="preserve">	</w:t>
+      </w:r>
+      <w:r>
+        <w:t xml:space="preserve">Wikipedia contributors,</w:t>
+      </w:r>
+      <w:r>
+        <w:t xml:space="preserve"> </w:t>
+      </w:r>
+      <w:r>
+        <w:t xml:space="preserve">“Transitive relation —</w:t>
+      </w:r>
+      <w:r>
+        <w:t xml:space="preserve"> </w:t>
+      </w:r>
+      <w:r>
         <w:t xml:space="preserve">Wikipedia</w:t>
       </w:r>
       <w:r>
-        <w:rPr>
-          <w:i/>
-          <w:iCs/>
-        </w:rPr>
         <w:t xml:space="preserve">,</w:t>
       </w:r>
       <w:r>
-        <w:rPr>
-          <w:i/>
-          <w:iCs/>
-        </w:rPr>
-        <w:t xml:space="preserve"> </w:t>
-      </w:r>
-      <w:r>
-        <w:rPr>
-          <w:i/>
-          <w:iCs/>
-        </w:rPr>
-        <w:t xml:space="preserve">the Free Encyclopedia</w:t>
-      </w:r>
-      <w:r>
-        <w:t xml:space="preserve">.</w:t>
+        <w:t xml:space="preserve"> </w:t>
+      </w:r>
+      <w:r>
+        <w:t xml:space="preserve">the free encyclopedia.”</w:t>
+      </w:r>
+      <w:r>
+        <w:t xml:space="preserve"> </w:t>
+      </w:r>
+      <w:r>
+        <w:t xml:space="preserve">2026. Available:</w:t>
       </w:r>
       <w:r>
         <w:t xml:space="preserve"> </w:t>
       </w:r>
       <w:hyperlink r:id="rId72">
+        <w:r>
+          <w:rPr>
+            <w:rStyle w:val="Hyperlink"/>
+          </w:rPr>
+          <w:t xml:space="preserve">https://en.wikipedia.org/wiki/Transitive_relation</w:t>
+        </w:r>
+      </w:hyperlink>
+    </w:p>
+    <w:bookmarkEnd w:id="73"/>
+    <w:bookmarkStart w:id="75" w:name="ref-wikipedia_identity_mathematics"/>
+    <w:p>
+      <w:pPr>
+        <w:pStyle w:val="Bibliography"/>
+      </w:pPr>
+      <w:r>
+        <w:t xml:space="preserve">[2]</w:t>
+      </w:r>
+      <w:r>
+        <w:t xml:space="preserve"> </w:t>
+      </w:r>
+      <w:r>
+        <w:t xml:space="preserve">	</w:t>
+      </w:r>
+      <w:r>
+        <w:t xml:space="preserve">Wikipedia contributors,</w:t>
+      </w:r>
+      <w:r>
+        <w:t xml:space="preserve"> </w:t>
+      </w:r>
+      <w:r>
+        <w:t xml:space="preserve">“Identity (mathematics) —</w:t>
+      </w:r>
+      <w:r>
+        <w:t xml:space="preserve"> </w:t>
+      </w:r>
+      <w:r>
+        <w:t xml:space="preserve">Wikipedia</w:t>
+      </w:r>
+      <w:r>
+        <w:t xml:space="preserve">,</w:t>
+      </w:r>
+      <w:r>
+        <w:t xml:space="preserve"> </w:t>
+      </w:r>
+      <w:r>
+        <w:t xml:space="preserve">the free encyclopedia.”</w:t>
+      </w:r>
+      <w:r>
+        <w:t xml:space="preserve"> </w:t>
+      </w:r>
+      <w:r>
+        <w:t xml:space="preserve">2026. Available:</w:t>
+      </w:r>
+      <w:r>
+        <w:t xml:space="preserve"> </w:t>
+      </w:r>
+      <w:hyperlink r:id="rId74">
+        <w:r>
+          <w:rPr>
+            <w:rStyle w:val="Hyperlink"/>
+          </w:rPr>
+          <w:t xml:space="preserve">https://en.wikipedia.org/wiki/Identity_(mathematics)</w:t>
+        </w:r>
+      </w:hyperlink>
+    </w:p>
+    <w:bookmarkEnd w:id="75"/>
+    <w:bookmarkStart w:id="77" w:name="ref-wikipedia_inequality_mathematics"/>
+    <w:p>
+      <w:pPr>
+        <w:pStyle w:val="Bibliography"/>
+      </w:pPr>
+      <w:r>
+        <w:t xml:space="preserve">[3]</w:t>
+      </w:r>
+      <w:r>
+        <w:t xml:space="preserve"> </w:t>
+      </w:r>
+      <w:r>
+        <w:t xml:space="preserve">	</w:t>
+      </w:r>
+      <w:r>
+        <w:t xml:space="preserve">Wikipedia contributors,</w:t>
+      </w:r>
+      <w:r>
+        <w:t xml:space="preserve"> </w:t>
+      </w:r>
+      <w:r>
+        <w:t xml:space="preserve">“Inequality (mathematics) —</w:t>
+      </w:r>
+      <w:r>
+        <w:t xml:space="preserve"> </w:t>
+      </w:r>
+      <w:r>
+        <w:t xml:space="preserve">Wikipedia</w:t>
+      </w:r>
+      <w:r>
+        <w:t xml:space="preserve">,</w:t>
+      </w:r>
+      <w:r>
+        <w:t xml:space="preserve"> </w:t>
+      </w:r>
+      <w:r>
+        <w:t xml:space="preserve">the free encyclopedia.”</w:t>
+      </w:r>
+      <w:r>
+        <w:t xml:space="preserve"> </w:t>
+      </w:r>
+      <w:r>
+        <w:t xml:space="preserve">2026. Available:</w:t>
+      </w:r>
+      <w:r>
+        <w:t xml:space="preserve"> </w:t>
+      </w:r>
+      <w:hyperlink r:id="rId76">
+        <w:r>
+          <w:rPr>
+            <w:rStyle w:val="Hyperlink"/>
+          </w:rPr>
+          <w:t xml:space="preserve">https://en.wikipedia.org/wiki/Inequality_(mathematics)</w:t>
+        </w:r>
+      </w:hyperlink>
+    </w:p>
+    <w:bookmarkEnd w:id="77"/>
+    <w:bookmarkStart w:id="79" w:name="ref-wikipedia_exponentiation"/>
+    <w:p>
+      <w:pPr>
+        <w:pStyle w:val="Bibliography"/>
+      </w:pPr>
+      <w:r>
+        <w:t xml:space="preserve">[4]</w:t>
+      </w:r>
+      <w:r>
+        <w:t xml:space="preserve"> </w:t>
+      </w:r>
+      <w:r>
+        <w:t xml:space="preserve">	</w:t>
+      </w:r>
+      <w:r>
+        <w:t xml:space="preserve">Wikipedia contributors,</w:t>
+      </w:r>
+      <w:r>
+        <w:t xml:space="preserve"> </w:t>
+      </w:r>
+      <w:r>
+        <w:t xml:space="preserve">“Exponentiation —</w:t>
+      </w:r>
+      <w:r>
+        <w:t xml:space="preserve"> </w:t>
+      </w:r>
+      <w:r>
+        <w:t xml:space="preserve">Wikipedia</w:t>
+      </w:r>
+      <w:r>
+        <w:t xml:space="preserve">,</w:t>
+      </w:r>
+      <w:r>
+        <w:t xml:space="preserve"> </w:t>
+      </w:r>
+      <w:r>
+        <w:t xml:space="preserve">the free encyclopedia.”</w:t>
+      </w:r>
+      <w:r>
+        <w:t xml:space="preserve"> </w:t>
+      </w:r>
+      <w:r>
+        <w:t xml:space="preserve">2026. Available:</w:t>
+      </w:r>
+      <w:r>
+        <w:t xml:space="preserve"> </w:t>
+      </w:r>
+      <w:hyperlink r:id="rId78">
+        <w:r>
+          <w:rPr>
+            <w:rStyle w:val="Hyperlink"/>
+          </w:rPr>
+          <w:t xml:space="preserve">https://en.wikipedia.org/wiki/Exponentiation</w:t>
+        </w:r>
+      </w:hyperlink>
+    </w:p>
+    <w:bookmarkEnd w:id="79"/>
+    <w:bookmarkStart w:id="81" w:name="ref-wikipedia_square_root"/>
+    <w:p>
+      <w:pPr>
+        <w:pStyle w:val="Bibliography"/>
+      </w:pPr>
+      <w:r>
+        <w:t xml:space="preserve">[5]</w:t>
+      </w:r>
+      <w:r>
+        <w:t xml:space="preserve"> </w:t>
+      </w:r>
+      <w:r>
+        <w:t xml:space="preserve">	</w:t>
+      </w:r>
+      <w:r>
+        <w:t xml:space="preserve">Wikipedia contributors,</w:t>
+      </w:r>
+      <w:r>
+        <w:t xml:space="preserve"> </w:t>
+      </w:r>
+      <w:r>
+        <w:t xml:space="preserve">“Square root —</w:t>
+      </w:r>
+      <w:r>
+        <w:t xml:space="preserve"> </w:t>
+      </w:r>
+      <w:r>
+        <w:t xml:space="preserve">Wikipedia</w:t>
+      </w:r>
+      <w:r>
+        <w:t xml:space="preserve">,</w:t>
+      </w:r>
+      <w:r>
+        <w:t xml:space="preserve"> </w:t>
+      </w:r>
+      <w:r>
+        <w:t xml:space="preserve">the free encyclopedia.”</w:t>
+      </w:r>
+      <w:r>
+        <w:t xml:space="preserve"> </w:t>
+      </w:r>
+      <w:r>
+        <w:t xml:space="preserve">2026. Available:</w:t>
+      </w:r>
+      <w:r>
+        <w:t xml:space="preserve"> </w:t>
+      </w:r>
+      <w:hyperlink r:id="rId80">
+        <w:r>
+          <w:rPr>
+            <w:rStyle w:val="Hyperlink"/>
+          </w:rPr>
+          <w:t xml:space="preserve">https://en.wikipedia.org/wiki/Square_root</w:t>
+        </w:r>
+      </w:hyperlink>
+    </w:p>
+    <w:bookmarkEnd w:id="81"/>
+    <w:bookmarkStart w:id="83" w:name="ref-wikipedia_absolute_value"/>
+    <w:p>
+      <w:pPr>
+        <w:pStyle w:val="Bibliography"/>
+      </w:pPr>
+      <w:r>
+        <w:t xml:space="preserve">[6]</w:t>
+      </w:r>
+      <w:r>
+        <w:t xml:space="preserve"> </w:t>
+      </w:r>
+      <w:r>
+        <w:t xml:space="preserve">	</w:t>
+      </w:r>
+      <w:r>
+        <w:t xml:space="preserve">Wikipedia contributors,</w:t>
+      </w:r>
+      <w:r>
+        <w:t xml:space="preserve"> </w:t>
+      </w:r>
+      <w:r>
+        <w:t xml:space="preserve">“Absolute value —</w:t>
+      </w:r>
+      <w:r>
+        <w:t xml:space="preserve"> </w:t>
+      </w:r>
+      <w:r>
+        <w:t xml:space="preserve">Wikipedia</w:t>
+      </w:r>
+      <w:r>
+        <w:t xml:space="preserve">,</w:t>
+      </w:r>
+      <w:r>
+        <w:t xml:space="preserve"> </w:t>
+      </w:r>
+      <w:r>
+        <w:t xml:space="preserve">the free encyclopedia.”</w:t>
+      </w:r>
+      <w:r>
+        <w:t xml:space="preserve"> </w:t>
+      </w:r>
+      <w:r>
+        <w:t xml:space="preserve">2026. Available:</w:t>
+      </w:r>
+      <w:r>
+        <w:t xml:space="preserve"> </w:t>
+      </w:r>
+      <w:hyperlink r:id="rId82">
         <w:r>
           <w:rPr>
             <w:rStyle w:val="Hyperlink"/>
@@ -14946,369 +15219,6 @@
           <w:t xml:space="preserve">https://en.wikipedia.org/wiki/Absolute_value</w:t>
         </w:r>
       </w:hyperlink>
-      <w:r>
-        <w:t xml:space="preserve">.</w:t>
-      </w:r>
-    </w:p>
-    <w:bookmarkEnd w:id="73"/>
-    <w:bookmarkStart w:id="75" w:name="ref-wikipedia_arg_max"/>
-    <w:p>
-      <w:pPr>
-        <w:pStyle w:val="Bibliography"/>
-      </w:pPr>
-      <w:r>
-        <w:t xml:space="preserve">Wikipedia contributors. 2026b.</w:t>
-      </w:r>
-      <w:r>
-        <w:t xml:space="preserve"> </w:t>
-      </w:r>
-      <w:r>
-        <w:rPr>
-          <w:i/>
-          <w:iCs/>
-        </w:rPr>
-        <w:t xml:space="preserve">Arg Max —</w:t>
-      </w:r>
-      <w:r>
-        <w:rPr>
-          <w:i/>
-          <w:iCs/>
-        </w:rPr>
-        <w:t xml:space="preserve"> </w:t>
-      </w:r>
-      <w:r>
-        <w:rPr>
-          <w:i/>
-          <w:iCs/>
-        </w:rPr>
-        <w:t xml:space="preserve">Wikipedia</w:t>
-      </w:r>
-      <w:r>
-        <w:rPr>
-          <w:i/>
-          <w:iCs/>
-        </w:rPr>
-        <w:t xml:space="preserve">,</w:t>
-      </w:r>
-      <w:r>
-        <w:rPr>
-          <w:i/>
-          <w:iCs/>
-        </w:rPr>
-        <w:t xml:space="preserve"> </w:t>
-      </w:r>
-      <w:r>
-        <w:rPr>
-          <w:i/>
-          <w:iCs/>
-        </w:rPr>
-        <w:t xml:space="preserve">the Free Encyclopedia</w:t>
-      </w:r>
-      <w:r>
-        <w:t xml:space="preserve">.</w:t>
-      </w:r>
-      <w:r>
-        <w:t xml:space="preserve"> </w:t>
-      </w:r>
-      <w:hyperlink r:id="rId74">
-        <w:r>
-          <w:rPr>
-            <w:rStyle w:val="Hyperlink"/>
-          </w:rPr>
-          <w:t xml:space="preserve">https://en.wikipedia.org/wiki/Arg_max</w:t>
-        </w:r>
-      </w:hyperlink>
-      <w:r>
-        <w:t xml:space="preserve">.</w:t>
-      </w:r>
-    </w:p>
-    <w:bookmarkEnd w:id="75"/>
-    <w:bookmarkStart w:id="77" w:name="ref-wikipedia_exponentiation"/>
-    <w:p>
-      <w:pPr>
-        <w:pStyle w:val="Bibliography"/>
-      </w:pPr>
-      <w:r>
-        <w:t xml:space="preserve">Wikipedia contributors. 2026c.</w:t>
-      </w:r>
-      <w:r>
-        <w:t xml:space="preserve"> </w:t>
-      </w:r>
-      <w:r>
-        <w:rPr>
-          <w:i/>
-          <w:iCs/>
-        </w:rPr>
-        <w:t xml:space="preserve">Exponentiation —</w:t>
-      </w:r>
-      <w:r>
-        <w:rPr>
-          <w:i/>
-          <w:iCs/>
-        </w:rPr>
-        <w:t xml:space="preserve"> </w:t>
-      </w:r>
-      <w:r>
-        <w:rPr>
-          <w:i/>
-          <w:iCs/>
-        </w:rPr>
-        <w:t xml:space="preserve">Wikipedia</w:t>
-      </w:r>
-      <w:r>
-        <w:rPr>
-          <w:i/>
-          <w:iCs/>
-        </w:rPr>
-        <w:t xml:space="preserve">,</w:t>
-      </w:r>
-      <w:r>
-        <w:rPr>
-          <w:i/>
-          <w:iCs/>
-        </w:rPr>
-        <w:t xml:space="preserve"> </w:t>
-      </w:r>
-      <w:r>
-        <w:rPr>
-          <w:i/>
-          <w:iCs/>
-        </w:rPr>
-        <w:t xml:space="preserve">the Free Encyclopedia</w:t>
-      </w:r>
-      <w:r>
-        <w:t xml:space="preserve">.</w:t>
-      </w:r>
-      <w:r>
-        <w:t xml:space="preserve"> </w:t>
-      </w:r>
-      <w:hyperlink r:id="rId76">
-        <w:r>
-          <w:rPr>
-            <w:rStyle w:val="Hyperlink"/>
-          </w:rPr>
-          <w:t xml:space="preserve">https://en.wikipedia.org/wiki/Exponentiation</w:t>
-        </w:r>
-      </w:hyperlink>
-      <w:r>
-        <w:t xml:space="preserve">.</w:t>
-      </w:r>
-    </w:p>
-    <w:bookmarkEnd w:id="77"/>
-    <w:bookmarkStart w:id="79" w:name="ref-wikipedia_identity_mathematics"/>
-    <w:p>
-      <w:pPr>
-        <w:pStyle w:val="Bibliography"/>
-      </w:pPr>
-      <w:r>
-        <w:t xml:space="preserve">Wikipedia contributors. 2026d.</w:t>
-      </w:r>
-      <w:r>
-        <w:t xml:space="preserve"> </w:t>
-      </w:r>
-      <w:r>
-        <w:rPr>
-          <w:i/>
-          <w:iCs/>
-        </w:rPr>
-        <w:t xml:space="preserve">Identity (Mathematics) —</w:t>
-      </w:r>
-      <w:r>
-        <w:rPr>
-          <w:i/>
-          <w:iCs/>
-        </w:rPr>
-        <w:t xml:space="preserve"> </w:t>
-      </w:r>
-      <w:r>
-        <w:rPr>
-          <w:i/>
-          <w:iCs/>
-        </w:rPr>
-        <w:t xml:space="preserve">Wikipedia</w:t>
-      </w:r>
-      <w:r>
-        <w:rPr>
-          <w:i/>
-          <w:iCs/>
-        </w:rPr>
-        <w:t xml:space="preserve">,</w:t>
-      </w:r>
-      <w:r>
-        <w:rPr>
-          <w:i/>
-          <w:iCs/>
-        </w:rPr>
-        <w:t xml:space="preserve"> </w:t>
-      </w:r>
-      <w:r>
-        <w:rPr>
-          <w:i/>
-          <w:iCs/>
-        </w:rPr>
-        <w:t xml:space="preserve">the Free Encyclopedia</w:t>
-      </w:r>
-      <w:r>
-        <w:t xml:space="preserve">.</w:t>
-      </w:r>
-      <w:r>
-        <w:t xml:space="preserve"> </w:t>
-      </w:r>
-      <w:hyperlink r:id="rId78">
-        <w:r>
-          <w:rPr>
-            <w:rStyle w:val="Hyperlink"/>
-          </w:rPr>
-          <w:t xml:space="preserve">https://en.wikipedia.org/wiki/Identity_(mathematics)</w:t>
-        </w:r>
-      </w:hyperlink>
-      <w:r>
-        <w:t xml:space="preserve">.</w:t>
-      </w:r>
-    </w:p>
-    <w:bookmarkEnd w:id="79"/>
-    <w:bookmarkStart w:id="81" w:name="ref-wikipedia_inequality_mathematics"/>
-    <w:p>
-      <w:pPr>
-        <w:pStyle w:val="Bibliography"/>
-      </w:pPr>
-      <w:r>
-        <w:t xml:space="preserve">Wikipedia contributors. 2026e.</w:t>
-      </w:r>
-      <w:r>
-        <w:t xml:space="preserve"> </w:t>
-      </w:r>
-      <w:r>
-        <w:rPr>
-          <w:i/>
-          <w:iCs/>
-        </w:rPr>
-        <w:t xml:space="preserve">Inequality (Mathematics) —</w:t>
-      </w:r>
-      <w:r>
-        <w:rPr>
-          <w:i/>
-          <w:iCs/>
-        </w:rPr>
-        <w:t xml:space="preserve"> </w:t>
-      </w:r>
-      <w:r>
-        <w:rPr>
-          <w:i/>
-          <w:iCs/>
-        </w:rPr>
-        <w:t xml:space="preserve">Wikipedia</w:t>
-      </w:r>
-      <w:r>
-        <w:rPr>
-          <w:i/>
-          <w:iCs/>
-        </w:rPr>
-        <w:t xml:space="preserve">,</w:t>
-      </w:r>
-      <w:r>
-        <w:rPr>
-          <w:i/>
-          <w:iCs/>
-        </w:rPr>
-        <w:t xml:space="preserve"> </w:t>
-      </w:r>
-      <w:r>
-        <w:rPr>
-          <w:i/>
-          <w:iCs/>
-        </w:rPr>
-        <w:t xml:space="preserve">the Free Encyclopedia</w:t>
-      </w:r>
-      <w:r>
-        <w:t xml:space="preserve">.</w:t>
-      </w:r>
-      <w:r>
-        <w:t xml:space="preserve"> </w:t>
-      </w:r>
-      <w:hyperlink r:id="rId80">
-        <w:r>
-          <w:rPr>
-            <w:rStyle w:val="Hyperlink"/>
-          </w:rPr>
-          <w:t xml:space="preserve">https://en.wikipedia.org/wiki/Inequality_(mathematics)</w:t>
-        </w:r>
-      </w:hyperlink>
-      <w:r>
-        <w:t xml:space="preserve">.</w:t>
-      </w:r>
-    </w:p>
-    <w:bookmarkEnd w:id="81"/>
-    <w:bookmarkStart w:id="83" w:name="ref-wikipedia_maxima_and_minima"/>
-    <w:p>
-      <w:pPr>
-        <w:pStyle w:val="Bibliography"/>
-      </w:pPr>
-      <w:r>
-        <w:t xml:space="preserve">Wikipedia contributors. 2026f.</w:t>
-      </w:r>
-      <w:r>
-        <w:t xml:space="preserve"> </w:t>
-      </w:r>
-      <w:r>
-        <w:rPr>
-          <w:i/>
-          <w:iCs/>
-        </w:rPr>
-        <w:t xml:space="preserve">Maxima and Minima —</w:t>
-      </w:r>
-      <w:r>
-        <w:rPr>
-          <w:i/>
-          <w:iCs/>
-        </w:rPr>
-        <w:t xml:space="preserve"> </w:t>
-      </w:r>
-      <w:r>
-        <w:rPr>
-          <w:i/>
-          <w:iCs/>
-        </w:rPr>
-        <w:t xml:space="preserve">Wikipedia</w:t>
-      </w:r>
-      <w:r>
-        <w:rPr>
-          <w:i/>
-          <w:iCs/>
-        </w:rPr>
-        <w:t xml:space="preserve">,</w:t>
-      </w:r>
-      <w:r>
-        <w:rPr>
-          <w:i/>
-          <w:iCs/>
-        </w:rPr>
-        <w:t xml:space="preserve"> </w:t>
-      </w:r>
-      <w:r>
-        <w:rPr>
-          <w:i/>
-          <w:iCs/>
-        </w:rPr>
-        <w:t xml:space="preserve">the Free Encyclopedia</w:t>
-      </w:r>
-      <w:r>
-        <w:t xml:space="preserve">.</w:t>
-      </w:r>
-      <w:r>
-        <w:t xml:space="preserve"> </w:t>
-      </w:r>
-      <w:hyperlink r:id="rId82">
-        <w:r>
-          <w:rPr>
-            <w:rStyle w:val="Hyperlink"/>
-          </w:rPr>
-          <w:t xml:space="preserve">https://en.wikipedia.org/wiki/Maxima_and_minima</w:t>
-        </w:r>
-      </w:hyperlink>
-      <w:r>
-        <w:t xml:space="preserve">.</w:t>
-      </w:r>
     </w:p>
     <w:bookmarkEnd w:id="83"/>
     <w:bookmarkStart w:id="85" w:name="ref-wikipedia_percentage"/>
@@ -15317,55 +15227,43 @@
         <w:pStyle w:val="Bibliography"/>
       </w:pPr>
       <w:r>
-        <w:t xml:space="preserve">Wikipedia contributors. 2026g.</w:t>
-      </w:r>
-      <w:r>
-        <w:t xml:space="preserve"> </w:t>
-      </w:r>
-      <w:r>
-        <w:rPr>
-          <w:i/>
-          <w:iCs/>
-        </w:rPr>
-        <w:t xml:space="preserve">Percentage —</w:t>
-      </w:r>
-      <w:r>
-        <w:rPr>
-          <w:i/>
-          <w:iCs/>
-        </w:rPr>
-        <w:t xml:space="preserve"> </w:t>
-      </w:r>
-      <w:r>
-        <w:rPr>
-          <w:i/>
-          <w:iCs/>
-        </w:rPr>
+        <w:t xml:space="preserve">[7]</w:t>
+      </w:r>
+      <w:r>
+        <w:t xml:space="preserve"> </w:t>
+      </w:r>
+      <w:r>
+        <w:t xml:space="preserve">	</w:t>
+      </w:r>
+      <w:r>
+        <w:t xml:space="preserve">Wikipedia contributors,</w:t>
+      </w:r>
+      <w:r>
+        <w:t xml:space="preserve"> </w:t>
+      </w:r>
+      <w:r>
+        <w:t xml:space="preserve">“Percentage —</w:t>
+      </w:r>
+      <w:r>
+        <w:t xml:space="preserve"> </w:t>
+      </w:r>
+      <w:r>
         <w:t xml:space="preserve">Wikipedia</w:t>
       </w:r>
       <w:r>
-        <w:rPr>
-          <w:i/>
-          <w:iCs/>
-        </w:rPr>
         <w:t xml:space="preserve">,</w:t>
       </w:r>
       <w:r>
-        <w:rPr>
-          <w:i/>
-          <w:iCs/>
-        </w:rPr>
-        <w:t xml:space="preserve"> </w:t>
-      </w:r>
-      <w:r>
-        <w:rPr>
-          <w:i/>
-          <w:iCs/>
-        </w:rPr>
-        <w:t xml:space="preserve">the Free Encyclopedia</w:t>
-      </w:r>
-      <w:r>
-        <w:t xml:space="preserve">.</w:t>
+        <w:t xml:space="preserve"> </w:t>
+      </w:r>
+      <w:r>
+        <w:t xml:space="preserve">the free encyclopedia.”</w:t>
+      </w:r>
+      <w:r>
+        <w:t xml:space="preserve"> </w:t>
+      </w:r>
+      <w:r>
+        <w:t xml:space="preserve">2026. Available:</w:t>
       </w:r>
       <w:r>
         <w:t xml:space="preserve"> </w:t>
@@ -15378,66 +15276,51 @@
           <w:t xml:space="preserve">https://en.wikipedia.org/wiki/Percentage</w:t>
         </w:r>
       </w:hyperlink>
-      <w:r>
-        <w:t xml:space="preserve">.</w:t>
-      </w:r>
     </w:p>
     <w:bookmarkEnd w:id="85"/>
-    <w:bookmarkStart w:id="87" w:name="ref-wikipedia_square_root"/>
+    <w:bookmarkStart w:id="87" w:name="ref-wikipedia_maxima_and_minima"/>
     <w:p>
       <w:pPr>
         <w:pStyle w:val="Bibliography"/>
       </w:pPr>
       <w:r>
-        <w:t xml:space="preserve">Wikipedia contributors. 2026h.</w:t>
-      </w:r>
-      <w:r>
-        <w:t xml:space="preserve"> </w:t>
-      </w:r>
-      <w:r>
-        <w:rPr>
-          <w:i/>
-          <w:iCs/>
-        </w:rPr>
-        <w:t xml:space="preserve">Square Root —</w:t>
-      </w:r>
-      <w:r>
-        <w:rPr>
-          <w:i/>
-          <w:iCs/>
-        </w:rPr>
-        <w:t xml:space="preserve"> </w:t>
-      </w:r>
-      <w:r>
-        <w:rPr>
-          <w:i/>
-          <w:iCs/>
-        </w:rPr>
+        <w:t xml:space="preserve">[8]</w:t>
+      </w:r>
+      <w:r>
+        <w:t xml:space="preserve"> </w:t>
+      </w:r>
+      <w:r>
+        <w:t xml:space="preserve">	</w:t>
+      </w:r>
+      <w:r>
+        <w:t xml:space="preserve">Wikipedia contributors,</w:t>
+      </w:r>
+      <w:r>
+        <w:t xml:space="preserve"> </w:t>
+      </w:r>
+      <w:r>
+        <w:t xml:space="preserve">“Maxima and minima —</w:t>
+      </w:r>
+      <w:r>
+        <w:t xml:space="preserve"> </w:t>
+      </w:r>
+      <w:r>
         <w:t xml:space="preserve">Wikipedia</w:t>
       </w:r>
       <w:r>
-        <w:rPr>
-          <w:i/>
-          <w:iCs/>
-        </w:rPr>
         <w:t xml:space="preserve">,</w:t>
       </w:r>
       <w:r>
-        <w:rPr>
-          <w:i/>
-          <w:iCs/>
-        </w:rPr>
-        <w:t xml:space="preserve"> </w:t>
-      </w:r>
-      <w:r>
-        <w:rPr>
-          <w:i/>
-          <w:iCs/>
-        </w:rPr>
-        <w:t xml:space="preserve">the Free Encyclopedia</w:t>
-      </w:r>
-      <w:r>
-        <w:t xml:space="preserve">.</w:t>
+        <w:t xml:space="preserve"> </w:t>
+      </w:r>
+      <w:r>
+        <w:t xml:space="preserve">the free encyclopedia.”</w:t>
+      </w:r>
+      <w:r>
+        <w:t xml:space="preserve"> </w:t>
+      </w:r>
+      <w:r>
+        <w:t xml:space="preserve">2026. Available:</w:t>
       </w:r>
       <w:r>
         <w:t xml:space="preserve"> </w:t>
@@ -15447,69 +15330,54 @@
           <w:rPr>
             <w:rStyle w:val="Hyperlink"/>
           </w:rPr>
-          <w:t xml:space="preserve">https://en.wikipedia.org/wiki/Square_root</w:t>
+          <w:t xml:space="preserve">https://en.wikipedia.org/wiki/Maxima_and_minima</w:t>
         </w:r>
       </w:hyperlink>
-      <w:r>
-        <w:t xml:space="preserve">.</w:t>
-      </w:r>
     </w:p>
     <w:bookmarkEnd w:id="87"/>
-    <w:bookmarkStart w:id="89" w:name="ref-wikipedia_transitive_relation"/>
+    <w:bookmarkStart w:id="89" w:name="ref-wikipedia_arg_max"/>
     <w:p>
       <w:pPr>
         <w:pStyle w:val="Bibliography"/>
       </w:pPr>
       <w:r>
-        <w:t xml:space="preserve">Wikipedia contributors. 2026i.</w:t>
-      </w:r>
-      <w:r>
-        <w:t xml:space="preserve"> </w:t>
-      </w:r>
-      <w:r>
-        <w:rPr>
-          <w:i/>
-          <w:iCs/>
-        </w:rPr>
-        <w:t xml:space="preserve">Transitive Relation —</w:t>
-      </w:r>
-      <w:r>
-        <w:rPr>
-          <w:i/>
-          <w:iCs/>
-        </w:rPr>
-        <w:t xml:space="preserve"> </w:t>
-      </w:r>
-      <w:r>
-        <w:rPr>
-          <w:i/>
-          <w:iCs/>
-        </w:rPr>
+        <w:t xml:space="preserve">[9]</w:t>
+      </w:r>
+      <w:r>
+        <w:t xml:space="preserve"> </w:t>
+      </w:r>
+      <w:r>
+        <w:t xml:space="preserve">	</w:t>
+      </w:r>
+      <w:r>
+        <w:t xml:space="preserve">Wikipedia contributors,</w:t>
+      </w:r>
+      <w:r>
+        <w:t xml:space="preserve"> </w:t>
+      </w:r>
+      <w:r>
+        <w:t xml:space="preserve">“Arg max —</w:t>
+      </w:r>
+      <w:r>
+        <w:t xml:space="preserve"> </w:t>
+      </w:r>
+      <w:r>
         <w:t xml:space="preserve">Wikipedia</w:t>
       </w:r>
       <w:r>
-        <w:rPr>
-          <w:i/>
-          <w:iCs/>
-        </w:rPr>
         <w:t xml:space="preserve">,</w:t>
       </w:r>
       <w:r>
-        <w:rPr>
-          <w:i/>
-          <w:iCs/>
-        </w:rPr>
-        <w:t xml:space="preserve"> </w:t>
-      </w:r>
-      <w:r>
-        <w:rPr>
-          <w:i/>
-          <w:iCs/>
-        </w:rPr>
-        <w:t xml:space="preserve">the Free Encyclopedia</w:t>
-      </w:r>
-      <w:r>
-        <w:t xml:space="preserve">.</w:t>
+        <w:t xml:space="preserve"> </w:t>
+      </w:r>
+      <w:r>
+        <w:t xml:space="preserve">the free encyclopedia.”</w:t>
+      </w:r>
+      <w:r>
+        <w:t xml:space="preserve"> </w:t>
+      </w:r>
+      <w:r>
+        <w:t xml:space="preserve">2026. Available:</w:t>
       </w:r>
       <w:r>
         <w:t xml:space="preserve"> </w:t>
@@ -15519,12 +15387,9 @@
           <w:rPr>
             <w:rStyle w:val="Hyperlink"/>
           </w:rPr>
-          <w:t xml:space="preserve">https://en.wikipedia.org/wiki/Transitive_relation</w:t>
+          <w:t xml:space="preserve">https://en.wikipedia.org/wiki/Arg_max</w:t>
         </w:r>
       </w:hyperlink>
-      <w:r>
-        <w:t xml:space="preserve">.</w:t>
-      </w:r>
     </w:p>
     <w:bookmarkEnd w:id="89"/>
     <w:bookmarkEnd w:id="90"/>

</xml_diff>

<commit_message>
Deploying to gh-pages from @ Morrison-Lab/mds@4f2e2d52f5e4fef7503a0a8a5b73b51d6cbb0870 🚀
</commit_message>
<xml_diff>
--- a/algebra-basics.docx
+++ b/algebra-basics.docx
@@ -15,7 +15,7 @@
         <w:pStyle w:val="Date"/>
       </w:pPr>
       <w:r>
-        <w:t xml:space="preserve">Last modified: 2026-10-18 11:27:44 (PDT)</w:t>
+        <w:t xml:space="preserve">Last modified: 2026-10-18 13:21:32 (PDT)</w:t>
       </w:r>
     </w:p>
     <w:bookmarkStart w:id="18" w:name="equalities"/>
@@ -9423,7 +9423,7 @@
     </w:p>
     <w:bookmarkEnd w:id="60"/>
     <w:bookmarkEnd w:id="61"/>
-    <w:bookmarkStart w:id="71" w:name="sec-minimizers"/>
+    <w:bookmarkStart w:id="90" w:name="sec-minimizers"/>
     <w:p>
       <w:pPr>
         <w:pStyle w:val="Heading2"/>
@@ -14715,171 +14715,8 @@
       </m:oMathPara>
     </w:p>
     <w:bookmarkEnd w:id="70"/>
-    <w:bookmarkEnd w:id="71"/>
-    <w:bookmarkStart w:id="91" w:name="further-reading"/>
-    <w:p>
-      <w:pPr>
-        <w:pStyle w:val="Heading2"/>
-      </w:pPr>
-      <w:r>
-        <w:t xml:space="preserve">Further reading</w:t>
-      </w:r>
-    </w:p>
-    <w:p>
-      <w:pPr>
-        <w:numPr>
-          <w:ilvl w:val="0"/>
-          <w:numId w:val="1015"/>
-        </w:numPr>
-      </w:pPr>
-      <w:r>
-        <w:t xml:space="preserve">Wikipedia contributors [1]</w:t>
-      </w:r>
-      <w:r>
-        <w:t xml:space="preserve"> </w:t>
-      </w:r>
-      <w:r>
-        <w:t xml:space="preserve">— transitive relations, with examples</w:t>
-      </w:r>
-    </w:p>
-    <w:p>
-      <w:pPr>
-        <w:numPr>
-          <w:ilvl w:val="0"/>
-          <w:numId w:val="1015"/>
-        </w:numPr>
-      </w:pPr>
-      <w:r>
-        <w:t xml:space="preserve">Wikipedia contributors [3]</w:t>
-      </w:r>
-      <w:r>
-        <w:t xml:space="preserve"> </w:t>
-      </w:r>
-      <w:r>
-        <w:t xml:space="preserve">— strict and non-strict inequalities and their properties</w:t>
-      </w:r>
-    </w:p>
-    <w:p>
-      <w:pPr>
-        <w:numPr>
-          <w:ilvl w:val="0"/>
-          <w:numId w:val="1015"/>
-        </w:numPr>
-      </w:pPr>
-      <w:r>
-        <w:t xml:space="preserve">Wikipedia contributors [4]</w:t>
-      </w:r>
-      <w:r>
-        <w:t xml:space="preserve"> </w:t>
-      </w:r>
-      <w:r>
-        <w:t xml:space="preserve">— powers with integer, rational and real exponents</w:t>
-      </w:r>
-    </w:p>
-    <w:p>
-      <w:pPr>
-        <w:numPr>
-          <w:ilvl w:val="0"/>
-          <w:numId w:val="1015"/>
-        </w:numPr>
-      </w:pPr>
-      <w:r>
-        <w:t xml:space="preserve">Wikipedia contributors [5]</w:t>
-      </w:r>
-      <w:r>
-        <w:t xml:space="preserve"> </w:t>
-      </w:r>
-      <w:r>
-        <w:t xml:space="preserve">— square roots and their properties</w:t>
-      </w:r>
-    </w:p>
-    <w:p>
-      <w:pPr>
-        <w:numPr>
-          <w:ilvl w:val="0"/>
-          <w:numId w:val="1015"/>
-        </w:numPr>
-      </w:pPr>
-      <w:r>
-        <w:t xml:space="preserve">Wikipedia contributors [6]</w:t>
-      </w:r>
-      <w:r>
-        <w:t xml:space="preserve"> </w:t>
-      </w:r>
-      <w:r>
-        <w:t xml:space="preserve">— the absolute value and its generalizations</w:t>
-      </w:r>
-    </w:p>
-    <w:p>
-      <w:pPr>
-        <w:numPr>
-          <w:ilvl w:val="0"/>
-          <w:numId w:val="1015"/>
-        </w:numPr>
-      </w:pPr>
-      <w:r>
-        <w:t xml:space="preserve">Wikipedia contributors [7]</w:t>
-      </w:r>
-      <w:r>
-        <w:t xml:space="preserve"> </w:t>
-      </w:r>
-      <w:r>
-        <w:t xml:space="preserve">— percentages, with worked examples</w:t>
-      </w:r>
-    </w:p>
-    <w:p>
-      <w:pPr>
-        <w:numPr>
-          <w:ilvl w:val="0"/>
-          <w:numId w:val="1015"/>
-        </w:numPr>
-      </w:pPr>
-      <w:r>
-        <w:t xml:space="preserve">Wikipedia contributors [8]</w:t>
-      </w:r>
-      <w:r>
-        <w:t xml:space="preserve"> </w:t>
-      </w:r>
-      <w:r>
-        <w:t xml:space="preserve">— minima and maxima, local and global</w:t>
-      </w:r>
-    </w:p>
-    <w:p>
-      <w:pPr>
-        <w:numPr>
-          <w:ilvl w:val="0"/>
-          <w:numId w:val="1015"/>
-        </w:numPr>
-      </w:pPr>
-      <w:r>
-        <w:t xml:space="preserve">Wikipedia contributors [9]</w:t>
-      </w:r>
-      <w:r>
-        <w:t xml:space="preserve"> </w:t>
-      </w:r>
-      <w:r>
-        <w:t xml:space="preserve">— the argmax and argmin</w:t>
-      </w:r>
-    </w:p>
-    <w:p>
-      <w:pPr>
-        <w:numPr>
-          <w:ilvl w:val="0"/>
-          <w:numId w:val="1015"/>
-        </w:numPr>
-      </w:pPr>
-      <w:r>
-        <w:t xml:space="preserve">Wikipedia contributors [2]</w:t>
-      </w:r>
-      <w:r>
-        <w:t xml:space="preserve"> </w:t>
-      </w:r>
-      <w:r>
-        <w:t xml:space="preserve">— identities, equalities that hold for all values of their variables</w:t>
-      </w:r>
-    </w:p>
-    <w:bookmarkStart w:id="90" w:name="refs"/>
-    <w:bookmarkStart w:id="73" w:name="ref-wikipedia_transitive_relation"/>
+    <w:bookmarkStart w:id="89" w:name="refs"/>
+    <w:bookmarkStart w:id="72" w:name="ref-wikipedia_transitive_relation"/>
     <w:p>
       <w:pPr>
         <w:pStyle w:val="Bibliography"/>
@@ -14926,7 +14763,7 @@
       <w:r>
         <w:t xml:space="preserve"> </w:t>
       </w:r>
-      <w:hyperlink r:id="rId72">
+      <w:hyperlink r:id="rId71">
         <w:r>
           <w:rPr>
             <w:rStyle w:val="Hyperlink"/>
@@ -14935,8 +14772,8 @@
         </w:r>
       </w:hyperlink>
     </w:p>
-    <w:bookmarkEnd w:id="73"/>
-    <w:bookmarkStart w:id="75" w:name="ref-wikipedia_identity_mathematics"/>
+    <w:bookmarkEnd w:id="72"/>
+    <w:bookmarkStart w:id="74" w:name="ref-wikipedia_identity_mathematics"/>
     <w:p>
       <w:pPr>
         <w:pStyle w:val="Bibliography"/>
@@ -14983,7 +14820,7 @@
       <w:r>
         <w:t xml:space="preserve"> </w:t>
       </w:r>
-      <w:hyperlink r:id="rId74">
+      <w:hyperlink r:id="rId73">
         <w:r>
           <w:rPr>
             <w:rStyle w:val="Hyperlink"/>
@@ -14992,8 +14829,8 @@
         </w:r>
       </w:hyperlink>
     </w:p>
-    <w:bookmarkEnd w:id="75"/>
-    <w:bookmarkStart w:id="77" w:name="ref-wikipedia_inequality_mathematics"/>
+    <w:bookmarkEnd w:id="74"/>
+    <w:bookmarkStart w:id="76" w:name="ref-wikipedia_inequality_mathematics"/>
     <w:p>
       <w:pPr>
         <w:pStyle w:val="Bibliography"/>
@@ -15040,7 +14877,7 @@
       <w:r>
         <w:t xml:space="preserve"> </w:t>
       </w:r>
-      <w:hyperlink r:id="rId76">
+      <w:hyperlink r:id="rId75">
         <w:r>
           <w:rPr>
             <w:rStyle w:val="Hyperlink"/>
@@ -15049,8 +14886,8 @@
         </w:r>
       </w:hyperlink>
     </w:p>
-    <w:bookmarkEnd w:id="77"/>
-    <w:bookmarkStart w:id="79" w:name="ref-wikipedia_exponentiation"/>
+    <w:bookmarkEnd w:id="76"/>
+    <w:bookmarkStart w:id="78" w:name="ref-wikipedia_exponentiation"/>
     <w:p>
       <w:pPr>
         <w:pStyle w:val="Bibliography"/>
@@ -15097,7 +14934,7 @@
       <w:r>
         <w:t xml:space="preserve"> </w:t>
       </w:r>
-      <w:hyperlink r:id="rId78">
+      <w:hyperlink r:id="rId77">
         <w:r>
           <w:rPr>
             <w:rStyle w:val="Hyperlink"/>
@@ -15106,8 +14943,8 @@
         </w:r>
       </w:hyperlink>
     </w:p>
-    <w:bookmarkEnd w:id="79"/>
-    <w:bookmarkStart w:id="81" w:name="ref-wikipedia_square_root"/>
+    <w:bookmarkEnd w:id="78"/>
+    <w:bookmarkStart w:id="80" w:name="ref-wikipedia_square_root"/>
     <w:p>
       <w:pPr>
         <w:pStyle w:val="Bibliography"/>
@@ -15154,7 +14991,7 @@
       <w:r>
         <w:t xml:space="preserve"> </w:t>
       </w:r>
-      <w:hyperlink r:id="rId80">
+      <w:hyperlink r:id="rId79">
         <w:r>
           <w:rPr>
             <w:rStyle w:val="Hyperlink"/>
@@ -15163,8 +15000,8 @@
         </w:r>
       </w:hyperlink>
     </w:p>
-    <w:bookmarkEnd w:id="81"/>
-    <w:bookmarkStart w:id="83" w:name="ref-wikipedia_absolute_value"/>
+    <w:bookmarkEnd w:id="80"/>
+    <w:bookmarkStart w:id="82" w:name="ref-wikipedia_absolute_value"/>
     <w:p>
       <w:pPr>
         <w:pStyle w:val="Bibliography"/>
@@ -15211,7 +15048,7 @@
       <w:r>
         <w:t xml:space="preserve"> </w:t>
       </w:r>
-      <w:hyperlink r:id="rId82">
+      <w:hyperlink r:id="rId81">
         <w:r>
           <w:rPr>
             <w:rStyle w:val="Hyperlink"/>
@@ -15220,8 +15057,8 @@
         </w:r>
       </w:hyperlink>
     </w:p>
-    <w:bookmarkEnd w:id="83"/>
-    <w:bookmarkStart w:id="85" w:name="ref-wikipedia_percentage"/>
+    <w:bookmarkEnd w:id="82"/>
+    <w:bookmarkStart w:id="84" w:name="ref-wikipedia_percentage"/>
     <w:p>
       <w:pPr>
         <w:pStyle w:val="Bibliography"/>
@@ -15268,7 +15105,7 @@
       <w:r>
         <w:t xml:space="preserve"> </w:t>
       </w:r>
-      <w:hyperlink r:id="rId84">
+      <w:hyperlink r:id="rId83">
         <w:r>
           <w:rPr>
             <w:rStyle w:val="Hyperlink"/>
@@ -15277,8 +15114,8 @@
         </w:r>
       </w:hyperlink>
     </w:p>
-    <w:bookmarkEnd w:id="85"/>
-    <w:bookmarkStart w:id="87" w:name="ref-wikipedia_maxima_and_minima"/>
+    <w:bookmarkEnd w:id="84"/>
+    <w:bookmarkStart w:id="86" w:name="ref-wikipedia_maxima_and_minima"/>
     <w:p>
       <w:pPr>
         <w:pStyle w:val="Bibliography"/>
@@ -15325,7 +15162,7 @@
       <w:r>
         <w:t xml:space="preserve"> </w:t>
       </w:r>
-      <w:hyperlink r:id="rId86">
+      <w:hyperlink r:id="rId85">
         <w:r>
           <w:rPr>
             <w:rStyle w:val="Hyperlink"/>
@@ -15334,8 +15171,8 @@
         </w:r>
       </w:hyperlink>
     </w:p>
-    <w:bookmarkEnd w:id="87"/>
-    <w:bookmarkStart w:id="89" w:name="ref-wikipedia_arg_max"/>
+    <w:bookmarkEnd w:id="86"/>
+    <w:bookmarkStart w:id="88" w:name="ref-wikipedia_arg_max"/>
     <w:p>
       <w:pPr>
         <w:pStyle w:val="Bibliography"/>
@@ -15382,7 +15219,7 @@
       <w:r>
         <w:t xml:space="preserve"> </w:t>
       </w:r>
-      <w:hyperlink r:id="rId88">
+      <w:hyperlink r:id="rId87">
         <w:r>
           <w:rPr>
             <w:rStyle w:val="Hyperlink"/>
@@ -15391,9 +15228,9 @@
         </w:r>
       </w:hyperlink>
     </w:p>
+    <w:bookmarkEnd w:id="88"/>
     <w:bookmarkEnd w:id="89"/>
     <w:bookmarkEnd w:id="90"/>
-    <w:bookmarkEnd w:id="91"/>
     <w:sectPr>
       <w:footnotePr>
         <w:numRestart w:val="eachSect"/>
@@ -15844,9 +15681,6 @@
     <w:lvlOverride w:ilvl="8">
       <w:startOverride w:val="1"/>
     </w:lvlOverride>
-  </w:num>
-  <w:num w:numId="1015">
-    <w:abstractNumId w:val="991"/>
   </w:num>
 </w:numbering>
 </file>

</xml_diff>

<commit_message>
Deploying to gh-pages from @ Morrison-Lab/mds@0ad2982e597948bb38527fdc610c8109f6777587 🚀
</commit_message>
<xml_diff>
--- a/algebra-basics.docx
+++ b/algebra-basics.docx
@@ -15,7 +15,7 @@
         <w:pStyle w:val="Date"/>
       </w:pPr>
       <w:r>
-        <w:t xml:space="preserve">Last modified: 2026-10-19 05:58:02 (PDT)</w:t>
+        <w:t xml:space="preserve">Last modified: 2026-10-19 09:38:56 (PDT)</w:t>
       </w:r>
     </w:p>
     <w:bookmarkStart w:id="18" w:name="equalities"/>
@@ -3324,7 +3324,7 @@
           <w:rPr>
             <w:rStyle w:val="Hyperlink"/>
           </w:rPr>
-          <w:t xml:space="preserve">Definition 21 in Polynomials, Exponentials and Logarithms</w:t>
+          <w:t xml:space="preserve">Definition 24 in Polynomials, Exponentials and Logarithms</w:t>
         </w:r>
       </w:hyperlink>
       <w:r>

</xml_diff>

<commit_message>
Deploying to gh-pages from @ Morrison-Lab/mds@0e63060db40b8c1acc90440fbc03c60daa4bfb79 🚀
</commit_message>
<xml_diff>
--- a/algebra-basics.docx
+++ b/algebra-basics.docx
@@ -15,7 +15,7 @@
         <w:pStyle w:val="Date"/>
       </w:pPr>
       <w:r>
-        <w:t xml:space="preserve">Last modified: 2026-10-19 09:38:56 (PDT)</w:t>
+        <w:t xml:space="preserve">Last modified: 2026-10-19 11:02:25 (PDT)</w:t>
       </w:r>
     </w:p>
     <w:bookmarkStart w:id="18" w:name="equalities"/>
@@ -5182,7 +5182,7 @@
       </w:r>
     </w:p>
     <w:bookmarkEnd w:id="46"/>
-    <w:bookmarkStart w:id="61" w:name="sec-min-max"/>
+    <w:bookmarkStart w:id="66" w:name="sec-min-max"/>
     <w:p>
       <w:pPr>
         <w:pStyle w:val="Heading2"/>
@@ -9422,8 +9422,1311 @@
       </w:r>
     </w:p>
     <w:bookmarkEnd w:id="60"/>
-    <w:bookmarkEnd w:id="61"/>
-    <w:bookmarkStart w:id="90" w:name="sec-minimizers"/>
+    <w:bookmarkStart w:id="62" w:name="def-positive-negative-parts"/>
+    <w:p>
+      <w:pPr>
+        <w:pStyle w:val="FirstParagraph"/>
+      </w:pPr>
+      <w:r>
+        <w:rPr>
+          <w:b/>
+          <w:bCs/>
+        </w:rPr>
+        <w:t xml:space="preserve">Definition 17 (Positive part of a function)</w:t>
+      </w:r>
+      <w:r>
+        <w:t xml:space="preserve"> </w:t>
+      </w:r>
+      <w:r>
+        <w:t xml:space="preserve">Let</w:t>
+      </w:r>
+      <w:r>
+        <w:t xml:space="preserve"> </w:t>
+      </w:r>
+      <m:oMath>
+        <m:r>
+          <m:t>S</m:t>
+        </m:r>
+      </m:oMath>
+      <w:r>
+        <w:t xml:space="preserve"> </w:t>
+      </w:r>
+      <w:r>
+        <w:t xml:space="preserve">be a</w:t>
+      </w:r>
+      <w:r>
+        <w:t xml:space="preserve"> </w:t>
+      </w:r>
+      <w:hyperlink r:id="rId61">
+        <w:r>
+          <w:rPr>
+            <w:rStyle w:val="Hyperlink"/>
+          </w:rPr>
+          <w:t xml:space="preserve">set</w:t>
+        </w:r>
+      </w:hyperlink>
+      <w:r>
+        <w:t xml:space="preserve">,</w:t>
+      </w:r>
+      <w:r>
+        <w:t xml:space="preserve"> </w:t>
+      </w:r>
+      <w:r>
+        <w:t xml:space="preserve">and let</w:t>
+      </w:r>
+      <w:r>
+        <w:t xml:space="preserve"> </w:t>
+      </w:r>
+      <m:oMath>
+        <m:r>
+          <m:t>f</m:t>
+        </m:r>
+        <m:r>
+          <m:rPr>
+            <m:sty m:val="p"/>
+          </m:rPr>
+          <m:t>:</m:t>
+        </m:r>
+        <m:r>
+          <m:t>S</m:t>
+        </m:r>
+        <m:r>
+          <m:rPr>
+            <m:sty m:val="p"/>
+          </m:rPr>
+          <m:t>→</m:t>
+        </m:r>
+        <m:r>
+          <m:rPr>
+            <m:scr m:val="double-struck"/>
+            <m:sty m:val="p"/>
+          </m:rPr>
+          <m:t>R</m:t>
+        </m:r>
+      </m:oMath>
+      <w:r>
+        <w:t xml:space="preserve"> </w:t>
+      </w:r>
+      <w:r>
+        <w:t xml:space="preserve">be a</w:t>
+      </w:r>
+      <w:r>
+        <w:t xml:space="preserve"> </w:t>
+      </w:r>
+      <w:hyperlink r:id="rId54">
+        <w:r>
+          <w:rPr>
+            <w:rStyle w:val="Hyperlink"/>
+          </w:rPr>
+          <w:t xml:space="preserve">function</w:t>
+        </w:r>
+      </w:hyperlink>
+      <w:r>
+        <w:t xml:space="preserve">.</w:t>
+      </w:r>
+      <w:r>
+        <w:t xml:space="preserve"> </w:t>
+      </w:r>
+      <w:r>
+        <w:t xml:space="preserve">The</w:t>
+      </w:r>
+      <w:r>
+        <w:t xml:space="preserve"> </w:t>
+      </w:r>
+      <w:r>
+        <w:rPr>
+          <w:b/>
+          <w:bCs/>
+        </w:rPr>
+        <w:t xml:space="preserve">positive part</w:t>
+      </w:r>
+      <w:r>
+        <w:t xml:space="preserve"> </w:t>
+      </w:r>
+      <w:r>
+        <w:t xml:space="preserve">of</w:t>
+      </w:r>
+      <w:r>
+        <w:t xml:space="preserve"> </w:t>
+      </w:r>
+      <m:oMath>
+        <m:r>
+          <m:t>f</m:t>
+        </m:r>
+      </m:oMath>
+      <w:r>
+        <w:t xml:space="preserve"> </w:t>
+      </w:r>
+      <w:r>
+        <w:t xml:space="preserve">is the non-negative function</w:t>
+      </w:r>
+    </w:p>
+    <w:p>
+      <w:pPr>
+        <w:pStyle w:val="BodyText"/>
+      </w:pPr>
+      <m:oMathPara>
+        <m:oMathParaPr>
+          <m:jc m:val="center"/>
+        </m:oMathParaPr>
+        <m:oMath>
+          <m:sSup>
+            <m:e>
+              <m:r>
+                <m:t>f</m:t>
+              </m:r>
+            </m:e>
+            <m:sup>
+              <m:r>
+                <m:rPr>
+                  <m:sty m:val="p"/>
+                </m:rPr>
+                <m:t>+</m:t>
+              </m:r>
+            </m:sup>
+          </m:sSup>
+          <m:r>
+            <m:rPr>
+              <m:sty m:val="p"/>
+            </m:rPr>
+            <m:t>(</m:t>
+          </m:r>
+          <m:r>
+            <m:t>s</m:t>
+          </m:r>
+          <m:r>
+            <m:rPr>
+              <m:sty m:val="p"/>
+            </m:rPr>
+            <m:t>)</m:t>
+          </m:r>
+          <m:limUpp>
+            <m:e>
+              <m:r>
+                <m:rPr>
+                  <m:sty m:val="p"/>
+                </m:rPr>
+                <m:t>=</m:t>
+              </m:r>
+            </m:e>
+            <m:lim>
+              <m:r>
+                <m:rPr>
+                  <m:nor/>
+                  <m:sty m:val="p"/>
+                </m:rPr>
+                <m:t>def</m:t>
+              </m:r>
+            </m:lim>
+          </m:limUpp>
+          <m:r>
+            <m:rPr>
+              <m:sty m:val="p"/>
+            </m:rPr>
+            <m:t>max</m:t>
+          </m:r>
+          <m:r>
+            <m:t>​</m:t>
+          </m:r>
+          <m:d>
+            <m:dPr>
+              <m:begChr m:val="{"/>
+              <m:sepChr m:val=""/>
+              <m:endChr m:val="}"/>
+              <m:grow/>
+            </m:dPr>
+            <m:e>
+              <m:r>
+                <m:t>f</m:t>
+              </m:r>
+              <m:r>
+                <m:rPr>
+                  <m:sty m:val="p"/>
+                </m:rPr>
+                <m:t>(</m:t>
+              </m:r>
+              <m:r>
+                <m:t>s</m:t>
+              </m:r>
+              <m:r>
+                <m:rPr>
+                  <m:sty m:val="p"/>
+                </m:rPr>
+                <m:t>)</m:t>
+              </m:r>
+              <m:r>
+                <m:rPr>
+                  <m:sty m:val="p"/>
+                </m:rPr>
+                <m:t>,</m:t>
+              </m:r>
+              <m:r>
+                <m:t>0</m:t>
+              </m:r>
+            </m:e>
+          </m:d>
+          <m:r>
+            <m:t>​</m:t>
+          </m:r>
+          <m:r>
+            <m:rPr>
+              <m:sty m:val="p"/>
+            </m:rPr>
+            <m:t>.</m:t>
+          </m:r>
+        </m:oMath>
+      </m:oMathPara>
+    </w:p>
+    <w:bookmarkEnd w:id="62"/>
+    <w:bookmarkStart w:id="63" w:name="exm-positive-negative-parts"/>
+    <w:p>
+      <w:pPr>
+        <w:pStyle w:val="FirstParagraph"/>
+      </w:pPr>
+      <w:r>
+        <w:rPr>
+          <w:b/>
+          <w:bCs/>
+        </w:rPr>
+        <w:t xml:space="preserve">Example 10 (The positive part of the identity function)</w:t>
+      </w:r>
+      <w:r>
+        <w:t xml:space="preserve"> </w:t>
+      </w:r>
+      <w:r>
+        <w:t xml:space="preserve">For</w:t>
+      </w:r>
+      <w:r>
+        <w:t xml:space="preserve"> </w:t>
+      </w:r>
+      <m:oMath>
+        <m:r>
+          <m:t>f</m:t>
+        </m:r>
+        <m:r>
+          <m:rPr>
+            <m:sty m:val="p"/>
+          </m:rPr>
+          <m:t>(</m:t>
+        </m:r>
+        <m:r>
+          <m:t>x</m:t>
+        </m:r>
+        <m:r>
+          <m:rPr>
+            <m:sty m:val="p"/>
+          </m:rPr>
+          <m:t>)</m:t>
+        </m:r>
+        <m:r>
+          <m:rPr>
+            <m:sty m:val="p"/>
+          </m:rPr>
+          <m:t>=</m:t>
+        </m:r>
+        <m:r>
+          <m:t>x</m:t>
+        </m:r>
+      </m:oMath>
+      <w:r>
+        <w:t xml:space="preserve"> </w:t>
+      </w:r>
+      <w:r>
+        <w:t xml:space="preserve">on</w:t>
+      </w:r>
+      <w:r>
+        <w:t xml:space="preserve"> </w:t>
+      </w:r>
+      <m:oMath>
+        <m:r>
+          <m:rPr>
+            <m:scr m:val="double-struck"/>
+            <m:sty m:val="p"/>
+          </m:rPr>
+          <m:t>R</m:t>
+        </m:r>
+      </m:oMath>
+      <w:r>
+        <w:t xml:space="preserve">, the</w:t>
+      </w:r>
+      <w:r>
+        <w:t xml:space="preserve"> </w:t>
+      </w:r>
+      <w:hyperlink w:anchor="def-positive-negative-parts">
+        <w:r>
+          <w:rPr>
+            <w:rStyle w:val="Hyperlink"/>
+          </w:rPr>
+          <w:t xml:space="preserve">positive part</w:t>
+        </w:r>
+      </w:hyperlink>
+      <w:r>
+        <w:t xml:space="preserve"> </w:t>
+      </w:r>
+      <w:r>
+        <w:t xml:space="preserve">is</w:t>
+      </w:r>
+      <w:r>
+        <w:t xml:space="preserve"> </w:t>
+      </w:r>
+      <m:oMath>
+        <m:sSup>
+          <m:e>
+            <m:r>
+              <m:t>f</m:t>
+            </m:r>
+          </m:e>
+          <m:sup>
+            <m:r>
+              <m:rPr>
+                <m:sty m:val="p"/>
+              </m:rPr>
+              <m:t>+</m:t>
+            </m:r>
+          </m:sup>
+        </m:sSup>
+        <m:r>
+          <m:rPr>
+            <m:sty m:val="p"/>
+          </m:rPr>
+          <m:t>(</m:t>
+        </m:r>
+        <m:r>
+          <m:t>x</m:t>
+        </m:r>
+        <m:r>
+          <m:rPr>
+            <m:sty m:val="p"/>
+          </m:rPr>
+          <m:t>)</m:t>
+        </m:r>
+        <m:r>
+          <m:rPr>
+            <m:sty m:val="p"/>
+          </m:rPr>
+          <m:t>=</m:t>
+        </m:r>
+        <m:r>
+          <m:rPr>
+            <m:sty m:val="p"/>
+          </m:rPr>
+          <m:t>max</m:t>
+        </m:r>
+        <m:r>
+          <m:t>​</m:t>
+        </m:r>
+        <m:d>
+          <m:dPr>
+            <m:begChr m:val="{"/>
+            <m:sepChr m:val=""/>
+            <m:endChr m:val="}"/>
+            <m:grow/>
+          </m:dPr>
+          <m:e>
+            <m:r>
+              <m:t>x</m:t>
+            </m:r>
+            <m:r>
+              <m:rPr>
+                <m:sty m:val="p"/>
+              </m:rPr>
+              <m:t>,</m:t>
+            </m:r>
+            <m:r>
+              <m:t>0</m:t>
+            </m:r>
+          </m:e>
+        </m:d>
+        <m:r>
+          <m:t>​</m:t>
+        </m:r>
+      </m:oMath>
+      <w:r>
+        <w:t xml:space="preserve">.</w:t>
+      </w:r>
+      <w:r>
+        <w:t xml:space="preserve"> </w:t>
+      </w:r>
+      <w:r>
+        <w:t xml:space="preserve">At</w:t>
+      </w:r>
+      <w:r>
+        <w:t xml:space="preserve"> </w:t>
+      </w:r>
+      <m:oMath>
+        <m:r>
+          <m:t>x</m:t>
+        </m:r>
+        <m:r>
+          <m:rPr>
+            <m:sty m:val="p"/>
+          </m:rPr>
+          <m:t>=</m:t>
+        </m:r>
+        <m:r>
+          <m:t>3</m:t>
+        </m:r>
+      </m:oMath>
+      <w:r>
+        <w:t xml:space="preserve">,</w:t>
+      </w:r>
+      <w:r>
+        <w:t xml:space="preserve"> </w:t>
+      </w:r>
+      <m:oMath>
+        <m:sSup>
+          <m:e>
+            <m:r>
+              <m:t>f</m:t>
+            </m:r>
+          </m:e>
+          <m:sup>
+            <m:r>
+              <m:rPr>
+                <m:sty m:val="p"/>
+              </m:rPr>
+              <m:t>+</m:t>
+            </m:r>
+          </m:sup>
+        </m:sSup>
+        <m:r>
+          <m:rPr>
+            <m:sty m:val="p"/>
+          </m:rPr>
+          <m:t>(</m:t>
+        </m:r>
+        <m:r>
+          <m:t>3</m:t>
+        </m:r>
+        <m:r>
+          <m:rPr>
+            <m:sty m:val="p"/>
+          </m:rPr>
+          <m:t>)</m:t>
+        </m:r>
+        <m:r>
+          <m:rPr>
+            <m:sty m:val="p"/>
+          </m:rPr>
+          <m:t>=</m:t>
+        </m:r>
+        <m:r>
+          <m:rPr>
+            <m:sty m:val="p"/>
+          </m:rPr>
+          <m:t>max</m:t>
+        </m:r>
+        <m:r>
+          <m:t>​</m:t>
+        </m:r>
+        <m:d>
+          <m:dPr>
+            <m:begChr m:val="{"/>
+            <m:sepChr m:val=""/>
+            <m:endChr m:val="}"/>
+            <m:grow/>
+          </m:dPr>
+          <m:e>
+            <m:r>
+              <m:t>3</m:t>
+            </m:r>
+            <m:r>
+              <m:rPr>
+                <m:sty m:val="p"/>
+              </m:rPr>
+              <m:t>,</m:t>
+            </m:r>
+            <m:r>
+              <m:t>0</m:t>
+            </m:r>
+          </m:e>
+        </m:d>
+        <m:r>
+          <m:t>​</m:t>
+        </m:r>
+        <m:r>
+          <m:rPr>
+            <m:sty m:val="p"/>
+          </m:rPr>
+          <m:t>=</m:t>
+        </m:r>
+        <m:r>
+          <m:t>3</m:t>
+        </m:r>
+      </m:oMath>
+      <w:r>
+        <w:t xml:space="preserve">,</w:t>
+      </w:r>
+      <w:r>
+        <w:t xml:space="preserve"> </w:t>
+      </w:r>
+      <w:r>
+        <w:t xml:space="preserve">and at</w:t>
+      </w:r>
+      <w:r>
+        <w:t xml:space="preserve"> </w:t>
+      </w:r>
+      <m:oMath>
+        <m:r>
+          <m:t>x</m:t>
+        </m:r>
+        <m:r>
+          <m:rPr>
+            <m:sty m:val="p"/>
+          </m:rPr>
+          <m:t>=</m:t>
+        </m:r>
+        <m:r>
+          <m:rPr>
+            <m:sty m:val="p"/>
+          </m:rPr>
+          <m:t>−</m:t>
+        </m:r>
+        <m:r>
+          <m:t>2</m:t>
+        </m:r>
+      </m:oMath>
+      <w:r>
+        <w:t xml:space="preserve">,</w:t>
+      </w:r>
+      <w:r>
+        <w:t xml:space="preserve"> </w:t>
+      </w:r>
+      <m:oMath>
+        <m:sSup>
+          <m:e>
+            <m:r>
+              <m:t>f</m:t>
+            </m:r>
+          </m:e>
+          <m:sup>
+            <m:r>
+              <m:rPr>
+                <m:sty m:val="p"/>
+              </m:rPr>
+              <m:t>+</m:t>
+            </m:r>
+          </m:sup>
+        </m:sSup>
+        <m:r>
+          <m:rPr>
+            <m:sty m:val="p"/>
+          </m:rPr>
+          <m:t>(</m:t>
+        </m:r>
+        <m:r>
+          <m:rPr>
+            <m:sty m:val="p"/>
+          </m:rPr>
+          <m:t>−</m:t>
+        </m:r>
+        <m:r>
+          <m:t>2</m:t>
+        </m:r>
+        <m:r>
+          <m:rPr>
+            <m:sty m:val="p"/>
+          </m:rPr>
+          <m:t>)</m:t>
+        </m:r>
+        <m:r>
+          <m:rPr>
+            <m:sty m:val="p"/>
+          </m:rPr>
+          <m:t>=</m:t>
+        </m:r>
+        <m:r>
+          <m:rPr>
+            <m:sty m:val="p"/>
+          </m:rPr>
+          <m:t>max</m:t>
+        </m:r>
+        <m:r>
+          <m:t>​</m:t>
+        </m:r>
+        <m:d>
+          <m:dPr>
+            <m:begChr m:val="{"/>
+            <m:sepChr m:val=""/>
+            <m:endChr m:val="}"/>
+            <m:grow/>
+          </m:dPr>
+          <m:e>
+            <m:r>
+              <m:rPr>
+                <m:sty m:val="p"/>
+              </m:rPr>
+              <m:t>−</m:t>
+            </m:r>
+            <m:r>
+              <m:t>2</m:t>
+            </m:r>
+            <m:r>
+              <m:rPr>
+                <m:sty m:val="p"/>
+              </m:rPr>
+              <m:t>,</m:t>
+            </m:r>
+            <m:r>
+              <m:t>0</m:t>
+            </m:r>
+          </m:e>
+        </m:d>
+        <m:r>
+          <m:t>​</m:t>
+        </m:r>
+        <m:r>
+          <m:rPr>
+            <m:sty m:val="p"/>
+          </m:rPr>
+          <m:t>=</m:t>
+        </m:r>
+        <m:r>
+          <m:t>0</m:t>
+        </m:r>
+      </m:oMath>
+      <w:r>
+        <w:t xml:space="preserve">.</w:t>
+      </w:r>
+    </w:p>
+    <w:bookmarkEnd w:id="63"/>
+    <w:bookmarkStart w:id="64" w:name="def-negative-part"/>
+    <w:p>
+      <w:pPr>
+        <w:pStyle w:val="BodyText"/>
+      </w:pPr>
+      <w:r>
+        <w:rPr>
+          <w:b/>
+          <w:bCs/>
+        </w:rPr>
+        <w:t xml:space="preserve">Definition 18 (Negative part of a function)</w:t>
+      </w:r>
+      <w:r>
+        <w:t xml:space="preserve"> </w:t>
+      </w:r>
+      <w:r>
+        <w:t xml:space="preserve">For</w:t>
+      </w:r>
+      <w:r>
+        <w:t xml:space="preserve"> </w:t>
+      </w:r>
+      <m:oMath>
+        <m:r>
+          <m:t>f</m:t>
+        </m:r>
+      </m:oMath>
+      <w:r>
+        <w:t xml:space="preserve"> </w:t>
+      </w:r>
+      <w:r>
+        <w:t xml:space="preserve">as in</w:t>
+      </w:r>
+      <w:r>
+        <w:t xml:space="preserve"> </w:t>
+      </w:r>
+      <w:hyperlink w:anchor="def-positive-negative-parts">
+        <w:r>
+          <w:rPr>
+            <w:rStyle w:val="Hyperlink"/>
+          </w:rPr>
+          <w:t xml:space="preserve">Definition 17</w:t>
+        </w:r>
+      </w:hyperlink>
+      <w:r>
+        <w:t xml:space="preserve">,</w:t>
+      </w:r>
+      <w:r>
+        <w:t xml:space="preserve"> </w:t>
+      </w:r>
+      <w:r>
+        <w:t xml:space="preserve">the</w:t>
+      </w:r>
+      <w:r>
+        <w:t xml:space="preserve"> </w:t>
+      </w:r>
+      <w:r>
+        <w:rPr>
+          <w:b/>
+          <w:bCs/>
+        </w:rPr>
+        <w:t xml:space="preserve">negative part</w:t>
+      </w:r>
+      <w:r>
+        <w:t xml:space="preserve"> </w:t>
+      </w:r>
+      <w:r>
+        <w:t xml:space="preserve">of</w:t>
+      </w:r>
+      <w:r>
+        <w:t xml:space="preserve"> </w:t>
+      </w:r>
+      <m:oMath>
+        <m:r>
+          <m:t>f</m:t>
+        </m:r>
+      </m:oMath>
+      <w:r>
+        <w:t xml:space="preserve"> </w:t>
+      </w:r>
+      <w:r>
+        <w:t xml:space="preserve">is the non-negative</w:t>
+      </w:r>
+      <w:r>
+        <w:t xml:space="preserve"> </w:t>
+      </w:r>
+      <w:hyperlink r:id="rId54">
+        <w:r>
+          <w:rPr>
+            <w:rStyle w:val="Hyperlink"/>
+          </w:rPr>
+          <w:t xml:space="preserve">function</w:t>
+        </w:r>
+      </w:hyperlink>
+    </w:p>
+    <w:p>
+      <w:pPr>
+        <w:pStyle w:val="BodyText"/>
+      </w:pPr>
+      <m:oMathPara>
+        <m:oMathParaPr>
+          <m:jc m:val="center"/>
+        </m:oMathParaPr>
+        <m:oMath>
+          <m:sSup>
+            <m:e>
+              <m:r>
+                <m:t>f</m:t>
+              </m:r>
+            </m:e>
+            <m:sup>
+              <m:r>
+                <m:rPr>
+                  <m:sty m:val="p"/>
+                </m:rPr>
+                <m:t>−</m:t>
+              </m:r>
+            </m:sup>
+          </m:sSup>
+          <m:r>
+            <m:rPr>
+              <m:sty m:val="p"/>
+            </m:rPr>
+            <m:t>(</m:t>
+          </m:r>
+          <m:r>
+            <m:t>s</m:t>
+          </m:r>
+          <m:r>
+            <m:rPr>
+              <m:sty m:val="p"/>
+            </m:rPr>
+            <m:t>)</m:t>
+          </m:r>
+          <m:limUpp>
+            <m:e>
+              <m:r>
+                <m:rPr>
+                  <m:sty m:val="p"/>
+                </m:rPr>
+                <m:t>=</m:t>
+              </m:r>
+            </m:e>
+            <m:lim>
+              <m:r>
+                <m:rPr>
+                  <m:nor/>
+                  <m:sty m:val="p"/>
+                </m:rPr>
+                <m:t>def</m:t>
+              </m:r>
+            </m:lim>
+          </m:limUpp>
+          <m:r>
+            <m:rPr>
+              <m:sty m:val="p"/>
+            </m:rPr>
+            <m:t>max</m:t>
+          </m:r>
+          <m:r>
+            <m:t>​</m:t>
+          </m:r>
+          <m:d>
+            <m:dPr>
+              <m:begChr m:val="{"/>
+              <m:sepChr m:val=""/>
+              <m:endChr m:val="}"/>
+              <m:grow/>
+            </m:dPr>
+            <m:e>
+              <m:r>
+                <m:rPr>
+                  <m:sty m:val="p"/>
+                </m:rPr>
+                <m:t>−</m:t>
+              </m:r>
+              <m:r>
+                <m:t>f</m:t>
+              </m:r>
+              <m:r>
+                <m:rPr>
+                  <m:sty m:val="p"/>
+                </m:rPr>
+                <m:t>(</m:t>
+              </m:r>
+              <m:r>
+                <m:t>s</m:t>
+              </m:r>
+              <m:r>
+                <m:rPr>
+                  <m:sty m:val="p"/>
+                </m:rPr>
+                <m:t>)</m:t>
+              </m:r>
+              <m:r>
+                <m:rPr>
+                  <m:sty m:val="p"/>
+                </m:rPr>
+                <m:t>,</m:t>
+              </m:r>
+              <m:r>
+                <m:t>0</m:t>
+              </m:r>
+            </m:e>
+          </m:d>
+          <m:r>
+            <m:t>​</m:t>
+          </m:r>
+          <m:r>
+            <m:rPr>
+              <m:sty m:val="p"/>
+            </m:rPr>
+            <m:t>.</m:t>
+          </m:r>
+        </m:oMath>
+      </m:oMathPara>
+    </w:p>
+    <w:bookmarkEnd w:id="64"/>
+    <w:bookmarkStart w:id="65" w:name="exm-negative-part"/>
+    <w:p>
+      <w:pPr>
+        <w:pStyle w:val="FirstParagraph"/>
+      </w:pPr>
+      <w:r>
+        <w:rPr>
+          <w:b/>
+          <w:bCs/>
+        </w:rPr>
+        <w:t xml:space="preserve">Example 11 (The negative part of the identity function)</w:t>
+      </w:r>
+      <w:r>
+        <w:t xml:space="preserve"> </w:t>
+      </w:r>
+      <w:r>
+        <w:t xml:space="preserve">For</w:t>
+      </w:r>
+      <w:r>
+        <w:t xml:space="preserve"> </w:t>
+      </w:r>
+      <m:oMath>
+        <m:r>
+          <m:t>f</m:t>
+        </m:r>
+        <m:r>
+          <m:rPr>
+            <m:sty m:val="p"/>
+          </m:rPr>
+          <m:t>(</m:t>
+        </m:r>
+        <m:r>
+          <m:t>x</m:t>
+        </m:r>
+        <m:r>
+          <m:rPr>
+            <m:sty m:val="p"/>
+          </m:rPr>
+          <m:t>)</m:t>
+        </m:r>
+        <m:r>
+          <m:rPr>
+            <m:sty m:val="p"/>
+          </m:rPr>
+          <m:t>=</m:t>
+        </m:r>
+        <m:r>
+          <m:t>x</m:t>
+        </m:r>
+      </m:oMath>
+      <w:r>
+        <w:t xml:space="preserve"> </w:t>
+      </w:r>
+      <w:r>
+        <w:t xml:space="preserve">on</w:t>
+      </w:r>
+      <w:r>
+        <w:t xml:space="preserve"> </w:t>
+      </w:r>
+      <m:oMath>
+        <m:r>
+          <m:rPr>
+            <m:scr m:val="double-struck"/>
+            <m:sty m:val="p"/>
+          </m:rPr>
+          <m:t>R</m:t>
+        </m:r>
+      </m:oMath>
+      <w:r>
+        <w:t xml:space="preserve">, the</w:t>
+      </w:r>
+      <w:r>
+        <w:t xml:space="preserve"> </w:t>
+      </w:r>
+      <w:hyperlink w:anchor="def-negative-part">
+        <w:r>
+          <w:rPr>
+            <w:rStyle w:val="Hyperlink"/>
+          </w:rPr>
+          <w:t xml:space="preserve">negative part</w:t>
+        </w:r>
+      </w:hyperlink>
+      <w:r>
+        <w:t xml:space="preserve"> </w:t>
+      </w:r>
+      <w:r>
+        <w:t xml:space="preserve">is</w:t>
+      </w:r>
+      <w:r>
+        <w:t xml:space="preserve"> </w:t>
+      </w:r>
+      <m:oMath>
+        <m:sSup>
+          <m:e>
+            <m:r>
+              <m:t>f</m:t>
+            </m:r>
+          </m:e>
+          <m:sup>
+            <m:r>
+              <m:rPr>
+                <m:sty m:val="p"/>
+              </m:rPr>
+              <m:t>−</m:t>
+            </m:r>
+          </m:sup>
+        </m:sSup>
+        <m:r>
+          <m:rPr>
+            <m:sty m:val="p"/>
+          </m:rPr>
+          <m:t>(</m:t>
+        </m:r>
+        <m:r>
+          <m:t>x</m:t>
+        </m:r>
+        <m:r>
+          <m:rPr>
+            <m:sty m:val="p"/>
+          </m:rPr>
+          <m:t>)</m:t>
+        </m:r>
+        <m:r>
+          <m:rPr>
+            <m:sty m:val="p"/>
+          </m:rPr>
+          <m:t>=</m:t>
+        </m:r>
+        <m:r>
+          <m:rPr>
+            <m:sty m:val="p"/>
+          </m:rPr>
+          <m:t>max</m:t>
+        </m:r>
+        <m:r>
+          <m:t>​</m:t>
+        </m:r>
+        <m:d>
+          <m:dPr>
+            <m:begChr m:val="{"/>
+            <m:sepChr m:val=""/>
+            <m:endChr m:val="}"/>
+            <m:grow/>
+          </m:dPr>
+          <m:e>
+            <m:r>
+              <m:rPr>
+                <m:sty m:val="p"/>
+              </m:rPr>
+              <m:t>−</m:t>
+            </m:r>
+            <m:r>
+              <m:t>x</m:t>
+            </m:r>
+            <m:r>
+              <m:rPr>
+                <m:sty m:val="p"/>
+              </m:rPr>
+              <m:t>,</m:t>
+            </m:r>
+            <m:r>
+              <m:t>0</m:t>
+            </m:r>
+          </m:e>
+        </m:d>
+        <m:r>
+          <m:t>​</m:t>
+        </m:r>
+      </m:oMath>
+      <w:r>
+        <w:t xml:space="preserve">.</w:t>
+      </w:r>
+      <w:r>
+        <w:t xml:space="preserve"> </w:t>
+      </w:r>
+      <w:r>
+        <w:t xml:space="preserve">At</w:t>
+      </w:r>
+      <w:r>
+        <w:t xml:space="preserve"> </w:t>
+      </w:r>
+      <m:oMath>
+        <m:r>
+          <m:t>x</m:t>
+        </m:r>
+        <m:r>
+          <m:rPr>
+            <m:sty m:val="p"/>
+          </m:rPr>
+          <m:t>=</m:t>
+        </m:r>
+        <m:r>
+          <m:t>3</m:t>
+        </m:r>
+      </m:oMath>
+      <w:r>
+        <w:t xml:space="preserve">,</w:t>
+      </w:r>
+      <w:r>
+        <w:t xml:space="preserve"> </w:t>
+      </w:r>
+      <m:oMath>
+        <m:sSup>
+          <m:e>
+            <m:r>
+              <m:t>f</m:t>
+            </m:r>
+          </m:e>
+          <m:sup>
+            <m:r>
+              <m:rPr>
+                <m:sty m:val="p"/>
+              </m:rPr>
+              <m:t>−</m:t>
+            </m:r>
+          </m:sup>
+        </m:sSup>
+        <m:r>
+          <m:rPr>
+            <m:sty m:val="p"/>
+          </m:rPr>
+          <m:t>(</m:t>
+        </m:r>
+        <m:r>
+          <m:t>3</m:t>
+        </m:r>
+        <m:r>
+          <m:rPr>
+            <m:sty m:val="p"/>
+          </m:rPr>
+          <m:t>)</m:t>
+        </m:r>
+        <m:r>
+          <m:rPr>
+            <m:sty m:val="p"/>
+          </m:rPr>
+          <m:t>=</m:t>
+        </m:r>
+        <m:r>
+          <m:rPr>
+            <m:sty m:val="p"/>
+          </m:rPr>
+          <m:t>max</m:t>
+        </m:r>
+        <m:r>
+          <m:t>​</m:t>
+        </m:r>
+        <m:d>
+          <m:dPr>
+            <m:begChr m:val="{"/>
+            <m:sepChr m:val=""/>
+            <m:endChr m:val="}"/>
+            <m:grow/>
+          </m:dPr>
+          <m:e>
+            <m:r>
+              <m:rPr>
+                <m:sty m:val="p"/>
+              </m:rPr>
+              <m:t>−</m:t>
+            </m:r>
+            <m:r>
+              <m:t>3</m:t>
+            </m:r>
+            <m:r>
+              <m:rPr>
+                <m:sty m:val="p"/>
+              </m:rPr>
+              <m:t>,</m:t>
+            </m:r>
+            <m:r>
+              <m:t>0</m:t>
+            </m:r>
+          </m:e>
+        </m:d>
+        <m:r>
+          <m:t>​</m:t>
+        </m:r>
+        <m:r>
+          <m:rPr>
+            <m:sty m:val="p"/>
+          </m:rPr>
+          <m:t>=</m:t>
+        </m:r>
+        <m:r>
+          <m:t>0</m:t>
+        </m:r>
+      </m:oMath>
+      <w:r>
+        <w:t xml:space="preserve">,</w:t>
+      </w:r>
+      <w:r>
+        <w:t xml:space="preserve"> </w:t>
+      </w:r>
+      <w:r>
+        <w:t xml:space="preserve">and at</w:t>
+      </w:r>
+      <w:r>
+        <w:t xml:space="preserve"> </w:t>
+      </w:r>
+      <m:oMath>
+        <m:r>
+          <m:t>x</m:t>
+        </m:r>
+        <m:r>
+          <m:rPr>
+            <m:sty m:val="p"/>
+          </m:rPr>
+          <m:t>=</m:t>
+        </m:r>
+        <m:r>
+          <m:rPr>
+            <m:sty m:val="p"/>
+          </m:rPr>
+          <m:t>−</m:t>
+        </m:r>
+        <m:r>
+          <m:t>2</m:t>
+        </m:r>
+      </m:oMath>
+      <w:r>
+        <w:t xml:space="preserve">,</w:t>
+      </w:r>
+      <w:r>
+        <w:t xml:space="preserve"> </w:t>
+      </w:r>
+      <m:oMath>
+        <m:sSup>
+          <m:e>
+            <m:r>
+              <m:t>f</m:t>
+            </m:r>
+          </m:e>
+          <m:sup>
+            <m:r>
+              <m:rPr>
+                <m:sty m:val="p"/>
+              </m:rPr>
+              <m:t>−</m:t>
+            </m:r>
+          </m:sup>
+        </m:sSup>
+        <m:r>
+          <m:rPr>
+            <m:sty m:val="p"/>
+          </m:rPr>
+          <m:t>(</m:t>
+        </m:r>
+        <m:r>
+          <m:rPr>
+            <m:sty m:val="p"/>
+          </m:rPr>
+          <m:t>−</m:t>
+        </m:r>
+        <m:r>
+          <m:t>2</m:t>
+        </m:r>
+        <m:r>
+          <m:rPr>
+            <m:sty m:val="p"/>
+          </m:rPr>
+          <m:t>)</m:t>
+        </m:r>
+        <m:r>
+          <m:rPr>
+            <m:sty m:val="p"/>
+          </m:rPr>
+          <m:t>=</m:t>
+        </m:r>
+        <m:r>
+          <m:rPr>
+            <m:sty m:val="p"/>
+          </m:rPr>
+          <m:t>max</m:t>
+        </m:r>
+        <m:r>
+          <m:t>​</m:t>
+        </m:r>
+        <m:d>
+          <m:dPr>
+            <m:begChr m:val="{"/>
+            <m:sepChr m:val=""/>
+            <m:endChr m:val="}"/>
+            <m:grow/>
+          </m:dPr>
+          <m:e>
+            <m:r>
+              <m:t>2</m:t>
+            </m:r>
+            <m:r>
+              <m:rPr>
+                <m:sty m:val="p"/>
+              </m:rPr>
+              <m:t>,</m:t>
+            </m:r>
+            <m:r>
+              <m:t>0</m:t>
+            </m:r>
+          </m:e>
+        </m:d>
+        <m:r>
+          <m:t>​</m:t>
+        </m:r>
+        <m:r>
+          <m:rPr>
+            <m:sty m:val="p"/>
+          </m:rPr>
+          <m:t>=</m:t>
+        </m:r>
+        <m:r>
+          <m:t>2</m:t>
+        </m:r>
+      </m:oMath>
+      <w:r>
+        <w:t xml:space="preserve">.</w:t>
+      </w:r>
+    </w:p>
+    <w:bookmarkEnd w:id="65"/>
+    <w:bookmarkEnd w:id="66"/>
+    <w:bookmarkStart w:id="95" w:name="sec-minimizers"/>
     <w:p>
       <w:pPr>
         <w:pStyle w:val="Heading2"/>
@@ -9432,7 +10735,7 @@
         <w:t xml:space="preserve">6 Global and local minimizers</w:t>
       </w:r>
     </w:p>
-    <w:bookmarkStart w:id="62" w:name="exr-local-vs-global-min"/>
+    <w:bookmarkStart w:id="67" w:name="exr-local-vs-global-min"/>
     <w:p>
       <w:pPr>
         <w:pStyle w:val="FirstParagraph"/>
@@ -9942,8 +11245,8 @@
         <w:t xml:space="preserve">?</w:t>
       </w:r>
     </w:p>
-    <w:bookmarkEnd w:id="62"/>
-    <w:bookmarkStart w:id="63" w:name="sol-local-vs-global-min"/>
+    <w:bookmarkEnd w:id="67"/>
+    <w:bookmarkStart w:id="68" w:name="sol-local-vs-global-min"/>
     <w:p>
       <w:pPr>
         <w:pStyle w:val="FirstParagraph"/>
@@ -11523,8 +12826,8 @@
         <w:t xml:space="preserve">.</w:t>
       </w:r>
     </w:p>
-    <w:bookmarkEnd w:id="63"/>
-    <w:bookmarkStart w:id="64" w:name="def-global-minimizer"/>
+    <w:bookmarkEnd w:id="68"/>
+    <w:bookmarkStart w:id="69" w:name="def-global-minimizer"/>
     <w:p>
       <w:pPr>
         <w:pStyle w:val="FirstParagraph"/>
@@ -11534,7 +12837,7 @@
           <w:b/>
           <w:bCs/>
         </w:rPr>
-        <w:t xml:space="preserve">Definition 17 (Global minimizer)</w:t>
+        <w:t xml:space="preserve">Definition 19 (Global minimizer)</w:t>
       </w:r>
       <w:r>
         <w:t xml:space="preserve"> </w:t>
@@ -11799,8 +13102,8 @@
         <w:t xml:space="preserve">.</w:t>
       </w:r>
     </w:p>
-    <w:bookmarkEnd w:id="64"/>
-    <w:bookmarkStart w:id="65" w:name="rem-global-minimizer-argmin"/>
+    <w:bookmarkEnd w:id="69"/>
+    <w:bookmarkStart w:id="70" w:name="rem-global-minimizer-argmin"/>
     <w:p>
       <w:pPr>
         <w:pStyle w:val="BodyText"/>
@@ -12295,8 +13598,8 @@
         <w:t xml:space="preserve">.</w:t>
       </w:r>
     </w:p>
-    <w:bookmarkEnd w:id="65"/>
-    <w:bookmarkStart w:id="67" w:name="def-local-minimizer"/>
+    <w:bookmarkEnd w:id="70"/>
+    <w:bookmarkStart w:id="72" w:name="def-local-minimizer"/>
     <w:p>
       <w:pPr>
         <w:pStyle w:val="BodyText"/>
@@ -12306,7 +13609,7 @@
           <w:b/>
           <w:bCs/>
         </w:rPr>
-        <w:t xml:space="preserve">Definition 18 (Local minimizer)</w:t>
+        <w:t xml:space="preserve">Definition 20 (Local minimizer)</w:t>
       </w:r>
       <w:r>
         <w:t xml:space="preserve"> </w:t>
@@ -12681,7 +13984,7 @@
       <w:r>
         <w:t xml:space="preserve"> </w:t>
       </w:r>
-      <w:hyperlink r:id="rId66">
+      <w:hyperlink r:id="rId71">
         <w:r>
           <w:rPr>
             <w:rStyle w:val="Hyperlink"/>
@@ -12693,8 +13996,8 @@
         <w:t xml:space="preserve">.</w:t>
       </w:r>
     </w:p>
-    <w:bookmarkEnd w:id="67"/>
-    <w:bookmarkStart w:id="69" w:name="rem-local-minimizer"/>
+    <w:bookmarkEnd w:id="72"/>
+    <w:bookmarkStart w:id="74" w:name="rem-local-minimizer"/>
     <w:p>
       <w:pPr>
         <w:pStyle w:val="BodyText"/>
@@ -12983,7 +14286,7 @@
           <w:rPr>
             <w:rStyle w:val="Hyperlink"/>
           </w:rPr>
-          <w:t xml:space="preserve">Definition 17</w:t>
+          <w:t xml:space="preserve">Definition 19</w:t>
         </w:r>
       </w:hyperlink>
       <w:r>
@@ -13135,7 +14438,7 @@
       <w:r>
         <w:t xml:space="preserve"> </w:t>
       </w:r>
-      <w:hyperlink r:id="rId68">
+      <w:hyperlink r:id="rId73">
         <w:r>
           <w:rPr>
             <w:rStyle w:val="Hyperlink"/>
@@ -13290,8 +14593,8 @@
         <w:t xml:space="preserve">but not a global one.</w:t>
       </w:r>
     </w:p>
-    <w:bookmarkEnd w:id="69"/>
-    <w:bookmarkStart w:id="70" w:name="exm-not-local-minimizer"/>
+    <w:bookmarkEnd w:id="74"/>
+    <w:bookmarkStart w:id="75" w:name="exm-not-local-minimizer"/>
     <w:p>
       <w:pPr>
         <w:pStyle w:val="BodyText"/>
@@ -13301,7 +14604,7 @@
           <w:b/>
           <w:bCs/>
         </w:rPr>
-        <w:t xml:space="preserve">Example 10 (A point that is not a local minimizer)</w:t>
+        <w:t xml:space="preserve">Example 12 (A point that is not a local minimizer)</w:t>
       </w:r>
       <w:r>
         <w:t xml:space="preserve"> </w:t>
@@ -14714,9 +16017,9 @@
         </m:oMath>
       </m:oMathPara>
     </w:p>
-    <w:bookmarkEnd w:id="70"/>
-    <w:bookmarkStart w:id="89" w:name="refs"/>
-    <w:bookmarkStart w:id="72" w:name="ref-wikipedia_transitive_relation"/>
+    <w:bookmarkEnd w:id="75"/>
+    <w:bookmarkStart w:id="94" w:name="refs"/>
+    <w:bookmarkStart w:id="77" w:name="ref-wikipedia_transitive_relation"/>
     <w:p>
       <w:pPr>
         <w:pStyle w:val="Bibliography"/>
@@ -14763,7 +16066,7 @@
       <w:r>
         <w:t xml:space="preserve"> </w:t>
       </w:r>
-      <w:hyperlink r:id="rId71">
+      <w:hyperlink r:id="rId76">
         <w:r>
           <w:rPr>
             <w:rStyle w:val="Hyperlink"/>
@@ -14772,8 +16075,8 @@
         </w:r>
       </w:hyperlink>
     </w:p>
-    <w:bookmarkEnd w:id="72"/>
-    <w:bookmarkStart w:id="74" w:name="ref-wikipedia_identity_mathematics"/>
+    <w:bookmarkEnd w:id="77"/>
+    <w:bookmarkStart w:id="79" w:name="ref-wikipedia_identity_mathematics"/>
     <w:p>
       <w:pPr>
         <w:pStyle w:val="Bibliography"/>
@@ -14820,7 +16123,7 @@
       <w:r>
         <w:t xml:space="preserve"> </w:t>
       </w:r>
-      <w:hyperlink r:id="rId73">
+      <w:hyperlink r:id="rId78">
         <w:r>
           <w:rPr>
             <w:rStyle w:val="Hyperlink"/>
@@ -14829,8 +16132,8 @@
         </w:r>
       </w:hyperlink>
     </w:p>
-    <w:bookmarkEnd w:id="74"/>
-    <w:bookmarkStart w:id="76" w:name="ref-wikipedia_inequality_mathematics"/>
+    <w:bookmarkEnd w:id="79"/>
+    <w:bookmarkStart w:id="81" w:name="ref-wikipedia_inequality_mathematics"/>
     <w:p>
       <w:pPr>
         <w:pStyle w:val="Bibliography"/>
@@ -14877,7 +16180,7 @@
       <w:r>
         <w:t xml:space="preserve"> </w:t>
       </w:r>
-      <w:hyperlink r:id="rId75">
+      <w:hyperlink r:id="rId80">
         <w:r>
           <w:rPr>
             <w:rStyle w:val="Hyperlink"/>
@@ -14886,8 +16189,8 @@
         </w:r>
       </w:hyperlink>
     </w:p>
-    <w:bookmarkEnd w:id="76"/>
-    <w:bookmarkStart w:id="78" w:name="ref-wikipedia_exponentiation"/>
+    <w:bookmarkEnd w:id="81"/>
+    <w:bookmarkStart w:id="83" w:name="ref-wikipedia_exponentiation"/>
     <w:p>
       <w:pPr>
         <w:pStyle w:val="Bibliography"/>
@@ -14934,7 +16237,7 @@
       <w:r>
         <w:t xml:space="preserve"> </w:t>
       </w:r>
-      <w:hyperlink r:id="rId77">
+      <w:hyperlink r:id="rId82">
         <w:r>
           <w:rPr>
             <w:rStyle w:val="Hyperlink"/>
@@ -14943,8 +16246,8 @@
         </w:r>
       </w:hyperlink>
     </w:p>
-    <w:bookmarkEnd w:id="78"/>
-    <w:bookmarkStart w:id="80" w:name="ref-wikipedia_square_root"/>
+    <w:bookmarkEnd w:id="83"/>
+    <w:bookmarkStart w:id="85" w:name="ref-wikipedia_square_root"/>
     <w:p>
       <w:pPr>
         <w:pStyle w:val="Bibliography"/>
@@ -14991,7 +16294,7 @@
       <w:r>
         <w:t xml:space="preserve"> </w:t>
       </w:r>
-      <w:hyperlink r:id="rId79">
+      <w:hyperlink r:id="rId84">
         <w:r>
           <w:rPr>
             <w:rStyle w:val="Hyperlink"/>
@@ -15000,8 +16303,8 @@
         </w:r>
       </w:hyperlink>
     </w:p>
-    <w:bookmarkEnd w:id="80"/>
-    <w:bookmarkStart w:id="82" w:name="ref-wikipedia_absolute_value"/>
+    <w:bookmarkEnd w:id="85"/>
+    <w:bookmarkStart w:id="87" w:name="ref-wikipedia_absolute_value"/>
     <w:p>
       <w:pPr>
         <w:pStyle w:val="Bibliography"/>
@@ -15048,7 +16351,7 @@
       <w:r>
         <w:t xml:space="preserve"> </w:t>
       </w:r>
-      <w:hyperlink r:id="rId81">
+      <w:hyperlink r:id="rId86">
         <w:r>
           <w:rPr>
             <w:rStyle w:val="Hyperlink"/>
@@ -15057,8 +16360,8 @@
         </w:r>
       </w:hyperlink>
     </w:p>
-    <w:bookmarkEnd w:id="82"/>
-    <w:bookmarkStart w:id="84" w:name="ref-wikipedia_percentage"/>
+    <w:bookmarkEnd w:id="87"/>
+    <w:bookmarkStart w:id="89" w:name="ref-wikipedia_percentage"/>
     <w:p>
       <w:pPr>
         <w:pStyle w:val="Bibliography"/>
@@ -15105,7 +16408,7 @@
       <w:r>
         <w:t xml:space="preserve"> </w:t>
       </w:r>
-      <w:hyperlink r:id="rId83">
+      <w:hyperlink r:id="rId88">
         <w:r>
           <w:rPr>
             <w:rStyle w:val="Hyperlink"/>
@@ -15114,8 +16417,8 @@
         </w:r>
       </w:hyperlink>
     </w:p>
-    <w:bookmarkEnd w:id="84"/>
-    <w:bookmarkStart w:id="86" w:name="ref-wikipedia_maxima_and_minima"/>
+    <w:bookmarkEnd w:id="89"/>
+    <w:bookmarkStart w:id="91" w:name="ref-wikipedia_maxima_and_minima"/>
     <w:p>
       <w:pPr>
         <w:pStyle w:val="Bibliography"/>
@@ -15162,7 +16465,7 @@
       <w:r>
         <w:t xml:space="preserve"> </w:t>
       </w:r>
-      <w:hyperlink r:id="rId85">
+      <w:hyperlink r:id="rId90">
         <w:r>
           <w:rPr>
             <w:rStyle w:val="Hyperlink"/>
@@ -15171,8 +16474,8 @@
         </w:r>
       </w:hyperlink>
     </w:p>
-    <w:bookmarkEnd w:id="86"/>
-    <w:bookmarkStart w:id="88" w:name="ref-wikipedia_arg_max"/>
+    <w:bookmarkEnd w:id="91"/>
+    <w:bookmarkStart w:id="93" w:name="ref-wikipedia_arg_max"/>
     <w:p>
       <w:pPr>
         <w:pStyle w:val="Bibliography"/>
@@ -15219,7 +16522,7 @@
       <w:r>
         <w:t xml:space="preserve"> </w:t>
       </w:r>
-      <w:hyperlink r:id="rId87">
+      <w:hyperlink r:id="rId92">
         <w:r>
           <w:rPr>
             <w:rStyle w:val="Hyperlink"/>
@@ -15228,9 +16531,9 @@
         </w:r>
       </w:hyperlink>
     </w:p>
-    <w:bookmarkEnd w:id="88"/>
-    <w:bookmarkEnd w:id="89"/>
-    <w:bookmarkEnd w:id="90"/>
+    <w:bookmarkEnd w:id="93"/>
+    <w:bookmarkEnd w:id="94"/>
+    <w:bookmarkEnd w:id="95"/>
     <w:sectPr>
       <w:footnotePr>
         <w:numRestart w:val="eachSect"/>

</xml_diff>

<commit_message>
Deploying to gh-pages from @ Morrison-Lab/mds@b5ef4a496d32eaebeff146e87f47c826e9bb8d71 🚀
</commit_message>
<xml_diff>
--- a/algebra-basics.docx
+++ b/algebra-basics.docx
@@ -15,7 +15,7 @@
         <w:pStyle w:val="Date"/>
       </w:pPr>
       <w:r>
-        <w:t xml:space="preserve">Last modified: 2026-10-27 11:01:31 (PDT)</w:t>
+        <w:t xml:space="preserve">Last modified: 2026-10-27 17:38:18 (PDT)</w:t>
       </w:r>
     </w:p>
     <w:bookmarkStart w:id="18" w:name="equalities"/>
@@ -3324,7 +3324,7 @@
           <w:rPr>
             <w:rStyle w:val="Hyperlink"/>
           </w:rPr>
-          <w:t xml:space="preserve">Definition 24 in Polynomials, Exponentials and Logarithms</w:t>
+          <w:t xml:space="preserve">Definition 26 in Polynomials, Exponentials and Logarithms</w:t>
         </w:r>
       </w:hyperlink>
       <w:r>

</xml_diff>

<commit_message>
Deploying to gh-pages from @ Morrison-Lab/mds@6034a8af9e7794cee777d2b7fdbacdbe107d8f0b 🚀
</commit_message>
<xml_diff>
--- a/algebra-basics.docx
+++ b/algebra-basics.docx
@@ -15,7 +15,7 @@
         <w:pStyle w:val="Date"/>
       </w:pPr>
       <w:r>
-        <w:t xml:space="preserve">Last modified: 2026-10-30 15:46:06 (PDT)</w:t>
+        <w:t xml:space="preserve">Last modified: 2026-10-30 17:15:43 (PDT)</w:t>
       </w:r>
     </w:p>
     <w:bookmarkStart w:id="18" w:name="equalities"/>
@@ -3324,7 +3324,7 @@
           <w:rPr>
             <w:rStyle w:val="Hyperlink"/>
           </w:rPr>
-          <w:t xml:space="preserve">Definition 26 in Polynomials, Exponentials and Logarithms</w:t>
+          <w:t xml:space="preserve">Definition 28 in Polynomials, Exponentials and Logarithms</w:t>
         </w:r>
       </w:hyperlink>
       <w:r>

</xml_diff>